<commit_message>
Docs: relatório de análise dos dados reais, revisão 01
Inclui as condições do ensaio de 26/10/2026: viatura com o motor
ligado, sensor na antena a 7 m de altura e embarque/desembarque de
pessoas no período dos maiores valores de inclinação. Revisa as
interpretações (vibração de 17,63 Hz atribuída ao motor, com análise
das ordens de rotação; fase B atribuída ao balanço da carroceria),
acrescenta a relação entre leitura em graus e deslocamento do topo da
antena e atualiza as recomendações. Sumário com pontilhado até o
número da página.

Co-Authored-By: Claude Opus 5.5 <noreply@anthropic.com>
Claude-Session: https://claude.ai/code/session_01VvvtJDPvh4mDoSVpkHza1d
</commit_message>
<xml_diff>
--- a/docs/relatorio-analise-dados-reais-20261026.docx
+++ b/docs/relatorio-analise-dados-reais-20261026.docx
@@ -167,7 +167,7 @@
           <w:sz w:val="24"/>
           <w:szCs w:val="24"/>
         </w:rPr>
-        <w:t xml:space="preserve">ANÁLISE TÉCNICA DOS DADOS REAIS DO INCLINÔMETRO E AZIMUTÍMETRO ESP32: LEITURA CONTÍNUA E CAPTURA DE VIBRAÇÃO DE 26/10/2026</w:t>
+        <w:t xml:space="preserve">ANÁLISE TÉCNICA DOS DADOS REAIS DO INCLINÔMETRO E AZIMUTÍMETRO ESP32: LEITURA CONTÍNUA E CAPTURA DE VIBRAÇÃO NA ANTENA DA VIATURA, A 7 M DE ALTURA (26/10/2026)</w:t>
       </w:r>
     </w:p>
     <w:p>
@@ -474,7 +474,7 @@
           <w:sz w:val="24"/>
           <w:szCs w:val="24"/>
         </w:rPr>
-        <w:t xml:space="preserve">ANÁLISE TÉCNICA DOS DADOS REAIS DO INCLINÔMETRO E AZIMUTÍMETRO ESP32: LEITURA CONTÍNUA E CAPTURA DE VIBRAÇÃO DE 26/10/2026</w:t>
+        <w:t xml:space="preserve">ANÁLISE TÉCNICA DOS DADOS REAIS DO INCLINÔMETRO E AZIMUTÍMETRO ESP32: LEITURA CONTÍNUA E CAPTURA DE VIBRAÇÃO NA ANTENA DA VIATURA, A 7 M DE ALTURA (26/10/2026)</w:t>
       </w:r>
     </w:p>
     <w:p>
@@ -528,7 +528,7 @@
           <w:sz w:val="20"/>
           <w:szCs w:val="20"/>
         </w:rPr>
-        <w:t xml:space="preserve">Relatório técnico de análise dos dados gerados pelo inclinômetro/azimutímetro eletrônico baseado em ESP32 em ensaio real via Bluetooth BLE, elaborado para a Avibras Aeroco, como complemento ao relatório técnico do projeto (docs/relatorio-tecnico-inclinometro.docx).</w:t>
+        <w:t xml:space="preserve">Relatório técnico de análise dos dados gerados pelo inclinômetro/azimutímetro eletrônico baseado em ESP32 em ensaio real via Bluetooth BLE, com o sensor instalado na antena de uma viatura, elaborado para a Avibras Aeroco, como complemento ao relatório técnico do projeto (docs/relatorio-tecnico-inclinometro.docx).</w:t>
       </w:r>
     </w:p>
     <w:p>
@@ -1003,6 +1003,147 @@
           </w:p>
         </w:tc>
       </w:tr>
+      <w:tr>
+        <w:trPr>
+          <w:tblHeader w:val="false"/>
+        </w:trPr>
+        <w:tc>
+          <w:tcPr>
+            <w:tcW w:type="dxa" w:w="1134"/>
+            <w:tcBorders>
+              <w:top w:val="single" w:color="000000" w:sz="4"/>
+              <w:left w:val="single" w:color="000000" w:sz="4"/>
+              <w:bottom w:val="single" w:color="000000" w:sz="4"/>
+              <w:right w:val="single" w:color="000000" w:sz="4"/>
+            </w:tcBorders>
+            <w:tcMar>
+              <w:top w:type="dxa" w:w="60"/>
+              <w:left w:type="dxa" w:w="100"/>
+              <w:bottom w:type="dxa" w:w="60"/>
+              <w:right w:type="dxa" w:w="100"/>
+            </w:tcMar>
+            <w:vAlign w:val="center"/>
+          </w:tcPr>
+          <w:p>
+            <w:pPr>
+              <w:spacing w:line="240"/>
+              <w:jc w:val="left"/>
+            </w:pPr>
+            <w:r>
+              <w:rPr>
+                <w:rFonts w:ascii="Times New Roman" w:cs="Times New Roman" w:eastAsia="Times New Roman" w:hAnsi="Times New Roman"/>
+                <w:b w:val="false"/>
+                <w:bCs w:val="false"/>
+                <w:sz w:val="20"/>
+                <w:szCs w:val="20"/>
+              </w:rPr>
+              <w:t xml:space="preserve">01</w:t>
+            </w:r>
+          </w:p>
+        </w:tc>
+        <w:tc>
+          <w:tcPr>
+            <w:tcW w:type="dxa" w:w="1701"/>
+            <w:tcBorders>
+              <w:top w:val="single" w:color="000000" w:sz="4"/>
+              <w:left w:val="single" w:color="000000" w:sz="4"/>
+              <w:bottom w:val="single" w:color="000000" w:sz="4"/>
+              <w:right w:val="single" w:color="000000" w:sz="4"/>
+            </w:tcBorders>
+            <w:tcMar>
+              <w:top w:type="dxa" w:w="60"/>
+              <w:left w:type="dxa" w:w="100"/>
+              <w:bottom w:type="dxa" w:w="60"/>
+              <w:right w:type="dxa" w:w="100"/>
+            </w:tcMar>
+            <w:vAlign w:val="center"/>
+          </w:tcPr>
+          <w:p>
+            <w:pPr>
+              <w:spacing w:line="240"/>
+              <w:jc w:val="center"/>
+            </w:pPr>
+            <w:r>
+              <w:rPr>
+                <w:rFonts w:ascii="Times New Roman" w:cs="Times New Roman" w:eastAsia="Times New Roman" w:hAnsi="Times New Roman"/>
+                <w:b w:val="false"/>
+                <w:bCs w:val="false"/>
+                <w:sz w:val="20"/>
+                <w:szCs w:val="20"/>
+              </w:rPr>
+              <w:t xml:space="preserve">28/10/2026</w:t>
+            </w:r>
+          </w:p>
+        </w:tc>
+        <w:tc>
+          <w:tcPr>
+            <w:tcW w:type="dxa" w:w="4536"/>
+            <w:tcBorders>
+              <w:top w:val="single" w:color="000000" w:sz="4"/>
+              <w:left w:val="single" w:color="000000" w:sz="4"/>
+              <w:bottom w:val="single" w:color="000000" w:sz="4"/>
+              <w:right w:val="single" w:color="000000" w:sz="4"/>
+            </w:tcBorders>
+            <w:tcMar>
+              <w:top w:type="dxa" w:w="60"/>
+              <w:left w:type="dxa" w:w="100"/>
+              <w:bottom w:type="dxa" w:w="60"/>
+              <w:right w:type="dxa" w:w="100"/>
+            </w:tcMar>
+            <w:vAlign w:val="center"/>
+          </w:tcPr>
+          <w:p>
+            <w:pPr>
+              <w:spacing w:line="240"/>
+              <w:jc w:val="center"/>
+            </w:pPr>
+            <w:r>
+              <w:rPr>
+                <w:rFonts w:ascii="Times New Roman" w:cs="Times New Roman" w:eastAsia="Times New Roman" w:hAnsi="Times New Roman"/>
+                <w:b w:val="false"/>
+                <w:bCs w:val="false"/>
+                <w:sz w:val="20"/>
+                <w:szCs w:val="20"/>
+              </w:rPr>
+              <w:t xml:space="preserve">Inclusão das condições do ensaio: viatura com motor ligado, sensor na antena a 7 m de altura e embarque/desembarque de pessoas no período dos maiores valores de inclinação. Revisão das interpretações das Seções 2 a 5, nova Seção 1.2 (condições do ensaio), nova Seção 2.4 (leitura x deslocamento no topo da antena) e nova Seção 3.4 (origem provável da vibração: motor).</w:t>
+            </w:r>
+          </w:p>
+        </w:tc>
+        <w:tc>
+          <w:tcPr>
+            <w:tcW w:type="dxa" w:w="1701"/>
+            <w:tcBorders>
+              <w:top w:val="single" w:color="000000" w:sz="4"/>
+              <w:left w:val="single" w:color="000000" w:sz="4"/>
+              <w:bottom w:val="single" w:color="000000" w:sz="4"/>
+              <w:right w:val="single" w:color="000000" w:sz="4"/>
+            </w:tcBorders>
+            <w:tcMar>
+              <w:top w:type="dxa" w:w="60"/>
+              <w:left w:type="dxa" w:w="100"/>
+              <w:bottom w:type="dxa" w:w="60"/>
+              <w:right w:type="dxa" w:w="100"/>
+            </w:tcMar>
+            <w:vAlign w:val="center"/>
+          </w:tcPr>
+          <w:p>
+            <w:pPr>
+              <w:spacing w:line="240"/>
+              <w:jc w:val="center"/>
+            </w:pPr>
+            <w:r>
+              <w:rPr>
+                <w:rFonts w:ascii="Times New Roman" w:cs="Times New Roman" w:eastAsia="Times New Roman" w:hAnsi="Times New Roman"/>
+                <w:b w:val="false"/>
+                <w:bCs w:val="false"/>
+                <w:sz w:val="20"/>
+                <w:szCs w:val="20"/>
+              </w:rPr>
+              <w:t xml:space="preserve">[NOME DO AUTOR]</w:t>
+            </w:r>
+          </w:p>
+        </w:tc>
+      </w:tr>
     </w:tbl>
     <w:p>
       <w:pPr>
@@ -1032,7 +1173,7 @@
           <w:sz w:val="24"/>
           <w:szCs w:val="24"/>
         </w:rPr>
-        <w:t xml:space="preserve">Este relatório interpreta tecnicamente os dois relatórios gerados pelo software desktop em 26/10/2026, com o inclinômetro conectado via Bluetooth BLE: uma sessão de leitura contínua de cerca de 147 s (734 leituras) e uma captura do Modo Vibração de 8 s a 60 Hz (480 amostras). Na leitura contínua, o conjunto permaneceu em repouso com a inclinação dentro de ±0,5° por cerca de 108 s, sofreu um movimento manual entre 108 s e 116 s (inclinação entre −2,17° e +2,67° e azimute até +0,41°) e voltou ao repouso com uma oscilação amortecida. Na captura de vibração, a inclinação apresentou uma oscilação dominante de 17,63 Hz com amplitude de 2,01° e relação sinal-ruído de 46 dB, enquanto o azimute permaneceu praticamente imóvel (0,005° de desvio padrão). A análise mostra que essa oscilação é muito mais provavelmente uma vibração linear do apoio, de dezenas de micrômetros, lida pelo acelerômetro como inclinação, do que uma rotação real, e que, por ter sido amostrada a 60 Hz, ela pode ser tanto um sinal real de 17,63 Hz quanto o rebatimento (aliasing) de um sinal de 42,37 Hz. Recomenda-se repetir a captura a 200 Hz e 500 Hz para desfazer essa ambiguidade.</w:t>
+        <w:t xml:space="preserve">Este relatório interpreta tecnicamente os dois relatórios gerados pelo software desktop em 26/10/2026, com o inclinômetro conectado via Bluetooth BLE e instalado na antena de uma viatura, a 7 m de altura, com o motor ligado: uma sessão de leitura contínua de cerca de 147 s (734 leituras) e uma captura do Modo Vibração de 8 s a 60 Hz (480 amostras). Na leitura contínua, a inclinação ficou dentro de ±0,5° por cerca de 108 s; entre 108 s e 116 s, período em que pessoas subiam e desciam da viatura, registrou os maiores valores (−2,17° a +2,67°, com azimute até +0,41°) e depois voltou ao repouso com uma oscilação amortecida da suspensão e da antena. Na captura de vibração, a inclinação apresentou uma oscilação dominante de 17,63 Hz com amplitude de 2,01° e relação sinal-ruído de 46 dB, enquanto o azimute permaneceu praticamente imóvel (0,005° de desvio padrão). A análise mostra que essa oscilação é a vibração do motor transmitida ao topo da antena — um movimento linear de dezenas de micrômetros, lido pelo acelerômetro como inclinação —, e não uma rotação real; e que, por ter sido amostrada a 60 Hz, ela pode ser tanto um sinal real de 17,63 Hz quanto o rebatimento (aliasing) de um sinal de 42,37 Hz, frequência compatível com a ordem de combustão de um motor diesel em marcha lenta. Mostra também que, a 7 m de altura, a mesma leitura em graus corresponde a deslocamentos muito diferentes do topo da antena conforme a frequência do movimento. Recomenda-se repetir a captura a 200 Hz e 500 Hz, com e sem o motor ligado e registrando a rotação do motor.</w:t>
       </w:r>
     </w:p>
     <w:p>
@@ -1056,7 +1197,7 @@
           <w:sz w:val="24"/>
           <w:szCs w:val="24"/>
         </w:rPr>
-        <w:t xml:space="preserve">Inclinômetro. Acelerômetro. Giroscópio. Vibração. FFT. Aliasing. ESP32.</w:t>
+        <w:t xml:space="preserve">Inclinômetro. Acelerômetro. Giroscópio. Vibração. FFT. Aliasing. Viatura. Antena. ESP32.</w:t>
       </w:r>
     </w:p>
     <w:p>
@@ -1078,6 +1219,9 @@
     </w:p>
     <w:p>
       <w:pPr>
+        <w:tabs>
+          <w:tab w:val="right" w:pos="9070" w:leader="dot"/>
+        </w:tabs>
         <w:spacing w:line="360"/>
         <w:ind w:left="0"/>
       </w:pPr>
@@ -1098,12 +1242,15 @@
           <w:sz w:val="24"/>
           <w:szCs w:val="24"/>
         </w:rPr>
-        <w:ptab w:alignment="right" w:relativeTo="margin" w:leader="dot"/>
+        <w:tab/>
         <w:t xml:space="preserve">6</w:t>
       </w:r>
     </w:p>
     <w:p>
       <w:pPr>
+        <w:tabs>
+          <w:tab w:val="right" w:pos="9070" w:leader="dot"/>
+        </w:tabs>
         <w:spacing w:line="360"/>
         <w:ind w:left="567"/>
       </w:pPr>
@@ -1124,12 +1271,44 @@
           <w:sz w:val="24"/>
           <w:szCs w:val="24"/>
         </w:rPr>
-        <w:ptab w:alignment="right" w:relativeTo="margin" w:leader="dot"/>
+        <w:tab/>
         <w:t xml:space="preserve">6</w:t>
       </w:r>
     </w:p>
     <w:p>
       <w:pPr>
+        <w:tabs>
+          <w:tab w:val="right" w:pos="9070" w:leader="dot"/>
+        </w:tabs>
+        <w:spacing w:line="360"/>
+        <w:ind w:left="567"/>
+      </w:pPr>
+      <w:r>
+        <w:rPr>
+          <w:rFonts w:ascii="Times New Roman" w:cs="Times New Roman" w:eastAsia="Times New Roman" w:hAnsi="Times New Roman"/>
+          <w:b w:val="false"/>
+          <w:bCs w:val="false"/>
+          <w:caps w:val="false"/>
+          <w:sz w:val="24"/>
+          <w:szCs w:val="24"/>
+        </w:rPr>
+        <w:t xml:space="preserve">1.2 Condições do ensaio</w:t>
+      </w:r>
+      <w:r>
+        <w:rPr>
+          <w:rFonts w:ascii="Times New Roman" w:cs="Times New Roman" w:eastAsia="Times New Roman" w:hAnsi="Times New Roman"/>
+          <w:sz w:val="24"/>
+          <w:szCs w:val="24"/>
+        </w:rPr>
+        <w:tab/>
+        <w:t xml:space="preserve">6</w:t>
+      </w:r>
+    </w:p>
+    <w:p>
+      <w:pPr>
+        <w:tabs>
+          <w:tab w:val="right" w:pos="9070" w:leader="dot"/>
+        </w:tabs>
         <w:spacing w:line="360"/>
         <w:ind w:left="0"/>
       </w:pPr>
@@ -1150,12 +1329,15 @@
           <w:sz w:val="24"/>
           <w:szCs w:val="24"/>
         </w:rPr>
-        <w:ptab w:alignment="right" w:relativeTo="margin" w:leader="dot"/>
-        <w:t xml:space="preserve">7</w:t>
-      </w:r>
-    </w:p>
-    <w:p>
-      <w:pPr>
+        <w:tab/>
+        <w:t xml:space="preserve">8</w:t>
+      </w:r>
+    </w:p>
+    <w:p>
+      <w:pPr>
+        <w:tabs>
+          <w:tab w:val="right" w:pos="9070" w:leader="dot"/>
+        </w:tabs>
         <w:spacing w:line="360"/>
         <w:ind w:left="567"/>
       </w:pPr>
@@ -1168,20 +1350,23 @@
           <w:sz w:val="24"/>
           <w:szCs w:val="24"/>
         </w:rPr>
-        <w:t xml:space="preserve">2.1 Fase A — repouso</w:t>
-      </w:r>
-      <w:r>
-        <w:rPr>
-          <w:rFonts w:ascii="Times New Roman" w:cs="Times New Roman" w:eastAsia="Times New Roman" w:hAnsi="Times New Roman"/>
-          <w:sz w:val="24"/>
-          <w:szCs w:val="24"/>
-        </w:rPr>
-        <w:ptab w:alignment="right" w:relativeTo="margin" w:leader="dot"/>
-        <w:t xml:space="preserve">8</w:t>
-      </w:r>
-    </w:p>
-    <w:p>
-      <w:pPr>
+        <w:t xml:space="preserve">2.1 Fase A — viatura parada, motor ligado</w:t>
+      </w:r>
+      <w:r>
+        <w:rPr>
+          <w:rFonts w:ascii="Times New Roman" w:cs="Times New Roman" w:eastAsia="Times New Roman" w:hAnsi="Times New Roman"/>
+          <w:sz w:val="24"/>
+          <w:szCs w:val="24"/>
+        </w:rPr>
+        <w:tab/>
+        <w:t xml:space="preserve">9</w:t>
+      </w:r>
+    </w:p>
+    <w:p>
+      <w:pPr>
+        <w:tabs>
+          <w:tab w:val="right" w:pos="9070" w:leader="dot"/>
+        </w:tabs>
         <w:spacing w:line="360"/>
         <w:ind w:left="567"/>
       </w:pPr>
@@ -1194,20 +1379,23 @@
           <w:sz w:val="24"/>
           <w:szCs w:val="24"/>
         </w:rPr>
-        <w:t xml:space="preserve">2.2 Fase B — movimento manual</w:t>
-      </w:r>
-      <w:r>
-        <w:rPr>
-          <w:rFonts w:ascii="Times New Roman" w:cs="Times New Roman" w:eastAsia="Times New Roman" w:hAnsi="Times New Roman"/>
-          <w:sz w:val="24"/>
-          <w:szCs w:val="24"/>
-        </w:rPr>
-        <w:ptab w:alignment="right" w:relativeTo="margin" w:leader="dot"/>
-        <w:t xml:space="preserve">9</w:t>
-      </w:r>
-    </w:p>
-    <w:p>
-      <w:pPr>
+        <w:t xml:space="preserve">2.2 Fase B — embarque e desembarque de pessoas</w:t>
+      </w:r>
+      <w:r>
+        <w:rPr>
+          <w:rFonts w:ascii="Times New Roman" w:cs="Times New Roman" w:eastAsia="Times New Roman" w:hAnsi="Times New Roman"/>
+          <w:sz w:val="24"/>
+          <w:szCs w:val="24"/>
+        </w:rPr>
+        <w:tab/>
+        <w:t xml:space="preserve">10</w:t>
+      </w:r>
+    </w:p>
+    <w:p>
+      <w:pPr>
+        <w:tabs>
+          <w:tab w:val="right" w:pos="9070" w:leader="dot"/>
+        </w:tabs>
         <w:spacing w:line="360"/>
         <w:ind w:left="567"/>
       </w:pPr>
@@ -1228,12 +1416,44 @@
           <w:sz w:val="24"/>
           <w:szCs w:val="24"/>
         </w:rPr>
-        <w:ptab w:alignment="right" w:relativeTo="margin" w:leader="dot"/>
-        <w:t xml:space="preserve">9</w:t>
-      </w:r>
-    </w:p>
-    <w:p>
-      <w:pPr>
+        <w:tab/>
+        <w:t xml:space="preserve">10</w:t>
+      </w:r>
+    </w:p>
+    <w:p>
+      <w:pPr>
+        <w:tabs>
+          <w:tab w:val="right" w:pos="9070" w:leader="dot"/>
+        </w:tabs>
+        <w:spacing w:line="360"/>
+        <w:ind w:left="567"/>
+      </w:pPr>
+      <w:r>
+        <w:rPr>
+          <w:rFonts w:ascii="Times New Roman" w:cs="Times New Roman" w:eastAsia="Times New Roman" w:hAnsi="Times New Roman"/>
+          <w:b w:val="false"/>
+          <w:bCs w:val="false"/>
+          <w:caps w:val="false"/>
+          <w:sz w:val="24"/>
+          <w:szCs w:val="24"/>
+        </w:rPr>
+        <w:t xml:space="preserve">2.4 Leitura em graus e deslocamento no topo da antena</w:t>
+      </w:r>
+      <w:r>
+        <w:rPr>
+          <w:rFonts w:ascii="Times New Roman" w:cs="Times New Roman" w:eastAsia="Times New Roman" w:hAnsi="Times New Roman"/>
+          <w:sz w:val="24"/>
+          <w:szCs w:val="24"/>
+        </w:rPr>
+        <w:tab/>
+        <w:t xml:space="preserve">10</w:t>
+      </w:r>
+    </w:p>
+    <w:p>
+      <w:pPr>
+        <w:tabs>
+          <w:tab w:val="right" w:pos="9070" w:leader="dot"/>
+        </w:tabs>
         <w:spacing w:line="360"/>
         <w:ind w:left="0"/>
       </w:pPr>
@@ -1254,12 +1474,15 @@
           <w:sz w:val="24"/>
           <w:szCs w:val="24"/>
         </w:rPr>
-        <w:ptab w:alignment="right" w:relativeTo="margin" w:leader="dot"/>
-        <w:t xml:space="preserve">10</w:t>
-      </w:r>
-    </w:p>
-    <w:p>
-      <w:pPr>
+        <w:tab/>
+        <w:t xml:space="preserve">12</w:t>
+      </w:r>
+    </w:p>
+    <w:p>
+      <w:pPr>
+        <w:tabs>
+          <w:tab w:val="right" w:pos="9070" w:leader="dot"/>
+        </w:tabs>
         <w:spacing w:line="360"/>
         <w:ind w:left="567"/>
       </w:pPr>
@@ -1280,12 +1503,15 @@
           <w:sz w:val="24"/>
           <w:szCs w:val="24"/>
         </w:rPr>
-        <w:ptab w:alignment="right" w:relativeTo="margin" w:leader="dot"/>
-        <w:t xml:space="preserve">11</w:t>
-      </w:r>
-    </w:p>
-    <w:p>
-      <w:pPr>
+        <w:tab/>
+        <w:t xml:space="preserve">13</w:t>
+      </w:r>
+    </w:p>
+    <w:p>
+      <w:pPr>
+        <w:tabs>
+          <w:tab w:val="right" w:pos="9070" w:leader="dot"/>
+        </w:tabs>
         <w:spacing w:line="360"/>
         <w:ind w:left="567"/>
       </w:pPr>
@@ -1306,12 +1532,15 @@
           <w:sz w:val="24"/>
           <w:szCs w:val="24"/>
         </w:rPr>
-        <w:ptab w:alignment="right" w:relativeTo="margin" w:leader="dot"/>
-        <w:t xml:space="preserve">11</w:t>
-      </w:r>
-    </w:p>
-    <w:p>
-      <w:pPr>
+        <w:tab/>
+        <w:t xml:space="preserve">14</w:t>
+      </w:r>
+    </w:p>
+    <w:p>
+      <w:pPr>
+        <w:tabs>
+          <w:tab w:val="right" w:pos="9070" w:leader="dot"/>
+        </w:tabs>
         <w:spacing w:line="360"/>
         <w:ind w:left="567"/>
       </w:pPr>
@@ -1332,12 +1561,15 @@
           <w:sz w:val="24"/>
           <w:szCs w:val="24"/>
         </w:rPr>
-        <w:ptab w:alignment="right" w:relativeTo="margin" w:leader="dot"/>
-        <w:t xml:space="preserve">12</w:t>
-      </w:r>
-    </w:p>
-    <w:p>
-      <w:pPr>
+        <w:tab/>
+        <w:t xml:space="preserve">14</w:t>
+      </w:r>
+    </w:p>
+    <w:p>
+      <w:pPr>
+        <w:tabs>
+          <w:tab w:val="right" w:pos="9070" w:leader="dot"/>
+        </w:tabs>
         <w:spacing w:line="360"/>
         <w:ind w:left="567"/>
       </w:pPr>
@@ -1350,20 +1582,52 @@
           <w:sz w:val="24"/>
           <w:szCs w:val="24"/>
         </w:rPr>
-        <w:t xml:space="preserve">3.4 Azimute durante a vibração</w:t>
-      </w:r>
-      <w:r>
-        <w:rPr>
-          <w:rFonts w:ascii="Times New Roman" w:cs="Times New Roman" w:eastAsia="Times New Roman" w:hAnsi="Times New Roman"/>
-          <w:sz w:val="24"/>
-          <w:szCs w:val="24"/>
-        </w:rPr>
-        <w:ptab w:alignment="right" w:relativeTo="margin" w:leader="dot"/>
-        <w:t xml:space="preserve">12</w:t>
-      </w:r>
-    </w:p>
-    <w:p>
-      <w:pPr>
+        <w:t xml:space="preserve">3.4 Origem provável: o motor da viatura</w:t>
+      </w:r>
+      <w:r>
+        <w:rPr>
+          <w:rFonts w:ascii="Times New Roman" w:cs="Times New Roman" w:eastAsia="Times New Roman" w:hAnsi="Times New Roman"/>
+          <w:sz w:val="24"/>
+          <w:szCs w:val="24"/>
+        </w:rPr>
+        <w:tab/>
+        <w:t xml:space="preserve">14</w:t>
+      </w:r>
+    </w:p>
+    <w:p>
+      <w:pPr>
+        <w:tabs>
+          <w:tab w:val="right" w:pos="9070" w:leader="dot"/>
+        </w:tabs>
+        <w:spacing w:line="360"/>
+        <w:ind w:left="567"/>
+      </w:pPr>
+      <w:r>
+        <w:rPr>
+          <w:rFonts w:ascii="Times New Roman" w:cs="Times New Roman" w:eastAsia="Times New Roman" w:hAnsi="Times New Roman"/>
+          <w:b w:val="false"/>
+          <w:bCs w:val="false"/>
+          <w:caps w:val="false"/>
+          <w:sz w:val="24"/>
+          <w:szCs w:val="24"/>
+        </w:rPr>
+        <w:t xml:space="preserve">3.5 Azimute durante a vibração</w:t>
+      </w:r>
+      <w:r>
+        <w:rPr>
+          <w:rFonts w:ascii="Times New Roman" w:cs="Times New Roman" w:eastAsia="Times New Roman" w:hAnsi="Times New Roman"/>
+          <w:sz w:val="24"/>
+          <w:szCs w:val="24"/>
+        </w:rPr>
+        <w:tab/>
+        <w:t xml:space="preserve">15</w:t>
+      </w:r>
+    </w:p>
+    <w:p>
+      <w:pPr>
+        <w:tabs>
+          <w:tab w:val="right" w:pos="9070" w:leader="dot"/>
+        </w:tabs>
         <w:spacing w:line="360"/>
         <w:ind w:left="0"/>
       </w:pPr>
@@ -1384,12 +1648,15 @@
           <w:sz w:val="24"/>
           <w:szCs w:val="24"/>
         </w:rPr>
-        <w:ptab w:alignment="right" w:relativeTo="margin" w:leader="dot"/>
-        <w:t xml:space="preserve">13</w:t>
-      </w:r>
-    </w:p>
-    <w:p>
-      <w:pPr>
+        <w:tab/>
+        <w:t xml:space="preserve">16</w:t>
+      </w:r>
+    </w:p>
+    <w:p>
+      <w:pPr>
+        <w:tabs>
+          <w:tab w:val="right" w:pos="9070" w:leader="dot"/>
+        </w:tabs>
         <w:spacing w:line="360"/>
         <w:ind w:left="0"/>
       </w:pPr>
@@ -1410,12 +1677,15 @@
           <w:sz w:val="24"/>
           <w:szCs w:val="24"/>
         </w:rPr>
-        <w:ptab w:alignment="right" w:relativeTo="margin" w:leader="dot"/>
-        <w:t xml:space="preserve">14</w:t>
-      </w:r>
-    </w:p>
-    <w:p>
-      <w:pPr>
+        <w:tab/>
+        <w:t xml:space="preserve">17</w:t>
+      </w:r>
+    </w:p>
+    <w:p>
+      <w:pPr>
+        <w:tabs>
+          <w:tab w:val="right" w:pos="9070" w:leader="dot"/>
+        </w:tabs>
         <w:spacing w:line="360"/>
         <w:ind w:left="0"/>
       </w:pPr>
@@ -1436,8 +1706,8 @@
           <w:sz w:val="24"/>
           <w:szCs w:val="24"/>
         </w:rPr>
-        <w:ptab w:alignment="right" w:relativeTo="margin" w:leader="dot"/>
-        <w:t xml:space="preserve">15</w:t>
+        <w:tab/>
+        <w:t xml:space="preserve">19</w:t>
       </w:r>
     </w:p>
     <w:p>
@@ -1495,7 +1765,7 @@
           <w:sz w:val="24"/>
           <w:szCs w:val="24"/>
         </w:rPr>
-        <w:t xml:space="preserve">Os dois relatórios foram gerados com o conjunto conectado via Bluetooth BLE (modo "Real"). A versão do firmware em uso não consta dos relatórios; pela data, trata-se de uma versão 1.6.x (a 1.6.17 foi publicada em 20/10/2026). As conclusões deste documento não dependem dessa versão, exceto onde indicado.</w:t>
+        <w:t xml:space="preserve">Os dois relatórios foram gerados com o conjunto conectado via Bluetooth BLE (modo "Real"), com o sensor instalado na antena de uma viatura (Seção 1.2). A versão do firmware em uso não consta dos relatórios; pela data, trata-se de uma versão 1.6.x (a 1.6.17 foi publicada em 20/10/2026). As conclusões deste documento não dependem dessa versão, exceto onde indicado.</w:t>
       </w:r>
     </w:p>
     <w:p>
@@ -2025,20 +2295,33 @@
     </w:p>
     <w:p>
       <w:pPr>
-        <w:pStyle w:val="Heading1"/>
-        <w:pageBreakBefore/>
-        <w:spacing w:after="240" w:before="240" w:line="360"/>
+        <w:pStyle w:val="Heading2"/>
+        <w:spacing w:after="120" w:before="240" w:line="360"/>
       </w:pPr>
       <w:r>
         <w:rPr>
           <w:rFonts w:ascii="Times New Roman" w:cs="Times New Roman" w:eastAsia="Times New Roman" w:hAnsi="Times New Roman"/>
           <w:b/>
           <w:bCs/>
-          <w:caps/>
-          <w:sz w:val="24"/>
-          <w:szCs w:val="24"/>
-        </w:rPr>
-        <w:t xml:space="preserve">2 Leitura contínua</w:t>
+          <w:sz w:val="24"/>
+          <w:szCs w:val="24"/>
+        </w:rPr>
+        <w:t xml:space="preserve">1.2 Condições do ensaio</w:t>
+      </w:r>
+    </w:p>
+    <w:p>
+      <w:pPr>
+        <w:spacing w:after="120" w:line="360"/>
+        <w:ind w:firstLine="709"/>
+        <w:jc w:val="both"/>
+      </w:pPr>
+      <w:r>
+        <w:rPr>
+          <w:rFonts w:ascii="Times New Roman" w:cs="Times New Roman" w:eastAsia="Times New Roman" w:hAnsi="Times New Roman"/>
+          <w:sz w:val="24"/>
+          <w:szCs w:val="24"/>
+        </w:rPr>
+        <w:t xml:space="preserve">As condições abaixo não constam dos relatórios exportados; foram informadas pelo responsável pelo ensaio e mudam a interpretação dos dados (Tabela 2).</w:t>
       </w:r>
     </w:p>
     <w:p>
@@ -2054,7 +2337,366 @@
           <w:sz w:val="20"/>
           <w:szCs w:val="20"/>
         </w:rPr>
-        <w:t xml:space="preserve">Tabela 2 — Dados gerais da sessão de leitura contínua</w:t>
+        <w:t xml:space="preserve">Tabela 2 — Condições do ensaio</w:t>
+      </w:r>
+    </w:p>
+    <w:tbl>
+      <w:tblPr>
+        <w:tblW w:type="dxa" w:w="9072"/>
+        <w:tblBorders>
+          <w:top w:val="single" w:color="auto" w:sz="4"/>
+          <w:left w:val="single" w:color="auto" w:sz="4"/>
+          <w:bottom w:val="single" w:color="auto" w:sz="4"/>
+          <w:right w:val="single" w:color="auto" w:sz="4"/>
+          <w:insideH w:val="single" w:color="auto" w:sz="4"/>
+          <w:insideV w:val="single" w:color="auto" w:sz="4"/>
+        </w:tblBorders>
+      </w:tblPr>
+      <w:tblGrid>
+        <w:gridCol w:w="2835"/>
+        <w:gridCol w:w="6237"/>
+      </w:tblGrid>
+      <w:tr>
+        <w:trPr>
+          <w:tblHeader/>
+        </w:trPr>
+        <w:tc>
+          <w:tcPr>
+            <w:tcW w:type="dxa" w:w="2835"/>
+            <w:tcBorders>
+              <w:top w:val="single" w:color="000000" w:sz="4"/>
+              <w:left w:val="single" w:color="000000" w:sz="4"/>
+              <w:bottom w:val="single" w:color="000000" w:sz="4"/>
+              <w:right w:val="single" w:color="000000" w:sz="4"/>
+            </w:tcBorders>
+            <w:shd w:fill="D9D9D9" w:color="auto" w:val="clear"/>
+            <w:tcMar>
+              <w:top w:type="dxa" w:w="60"/>
+              <w:left w:type="dxa" w:w="100"/>
+              <w:bottom w:type="dxa" w:w="60"/>
+              <w:right w:type="dxa" w:w="100"/>
+            </w:tcMar>
+            <w:vAlign w:val="center"/>
+          </w:tcPr>
+          <w:p>
+            <w:pPr>
+              <w:spacing w:line="240"/>
+              <w:jc w:val="left"/>
+            </w:pPr>
+            <w:r>
+              <w:rPr>
+                <w:rFonts w:ascii="Times New Roman" w:cs="Times New Roman" w:eastAsia="Times New Roman" w:hAnsi="Times New Roman"/>
+                <w:b/>
+                <w:bCs/>
+                <w:sz w:val="20"/>
+                <w:szCs w:val="20"/>
+              </w:rPr>
+              <w:t xml:space="preserve">Condição</w:t>
+            </w:r>
+          </w:p>
+        </w:tc>
+        <w:tc>
+          <w:tcPr>
+            <w:tcW w:type="dxa" w:w="6237"/>
+            <w:tcBorders>
+              <w:top w:val="single" w:color="000000" w:sz="4"/>
+              <w:left w:val="single" w:color="000000" w:sz="4"/>
+              <w:bottom w:val="single" w:color="000000" w:sz="4"/>
+              <w:right w:val="single" w:color="000000" w:sz="4"/>
+            </w:tcBorders>
+            <w:shd w:fill="D9D9D9" w:color="auto" w:val="clear"/>
+            <w:tcMar>
+              <w:top w:type="dxa" w:w="60"/>
+              <w:left w:type="dxa" w:w="100"/>
+              <w:bottom w:type="dxa" w:w="60"/>
+              <w:right w:type="dxa" w:w="100"/>
+            </w:tcMar>
+            <w:vAlign w:val="center"/>
+          </w:tcPr>
+          <w:p>
+            <w:pPr>
+              <w:spacing w:line="240"/>
+              <w:jc w:val="left"/>
+            </w:pPr>
+            <w:r>
+              <w:rPr>
+                <w:rFonts w:ascii="Times New Roman" w:cs="Times New Roman" w:eastAsia="Times New Roman" w:hAnsi="Times New Roman"/>
+                <w:b/>
+                <w:bCs/>
+                <w:sz w:val="20"/>
+                <w:szCs w:val="20"/>
+              </w:rPr>
+              <w:t xml:space="preserve">Efeito sobre a medição</w:t>
+            </w:r>
+          </w:p>
+        </w:tc>
+      </w:tr>
+      <w:tr>
+        <w:trPr>
+          <w:tblHeader w:val="false"/>
+        </w:trPr>
+        <w:tc>
+          <w:tcPr>
+            <w:tcW w:type="dxa" w:w="2835"/>
+            <w:tcBorders>
+              <w:top w:val="single" w:color="000000" w:sz="4"/>
+              <w:left w:val="single" w:color="000000" w:sz="4"/>
+              <w:bottom w:val="single" w:color="000000" w:sz="4"/>
+              <w:right w:val="single" w:color="000000" w:sz="4"/>
+            </w:tcBorders>
+            <w:tcMar>
+              <w:top w:type="dxa" w:w="60"/>
+              <w:left w:type="dxa" w:w="100"/>
+              <w:bottom w:type="dxa" w:w="60"/>
+              <w:right w:type="dxa" w:w="100"/>
+            </w:tcMar>
+            <w:vAlign w:val="center"/>
+          </w:tcPr>
+          <w:p>
+            <w:pPr>
+              <w:spacing w:line="240"/>
+              <w:jc w:val="left"/>
+            </w:pPr>
+            <w:r>
+              <w:rPr>
+                <w:rFonts w:ascii="Times New Roman" w:cs="Times New Roman" w:eastAsia="Times New Roman" w:hAnsi="Times New Roman"/>
+                <w:b w:val="false"/>
+                <w:bCs w:val="false"/>
+                <w:sz w:val="20"/>
+                <w:szCs w:val="20"/>
+              </w:rPr>
+              <w:t xml:space="preserve">Viatura com o motor ligado durante as duas medições</w:t>
+            </w:r>
+          </w:p>
+        </w:tc>
+        <w:tc>
+          <w:tcPr>
+            <w:tcW w:type="dxa" w:w="6237"/>
+            <w:tcBorders>
+              <w:top w:val="single" w:color="000000" w:sz="4"/>
+              <w:left w:val="single" w:color="000000" w:sz="4"/>
+              <w:bottom w:val="single" w:color="000000" w:sz="4"/>
+              <w:right w:val="single" w:color="000000" w:sz="4"/>
+            </w:tcBorders>
+            <w:tcMar>
+              <w:top w:type="dxa" w:w="60"/>
+              <w:left w:type="dxa" w:w="100"/>
+              <w:bottom w:type="dxa" w:w="60"/>
+              <w:right w:type="dxa" w:w="100"/>
+            </w:tcMar>
+            <w:vAlign w:val="center"/>
+          </w:tcPr>
+          <w:p>
+            <w:pPr>
+              <w:spacing w:line="240"/>
+              <w:jc w:val="left"/>
+            </w:pPr>
+            <w:r>
+              <w:rPr>
+                <w:rFonts w:ascii="Times New Roman" w:cs="Times New Roman" w:eastAsia="Times New Roman" w:hAnsi="Times New Roman"/>
+                <w:b w:val="false"/>
+                <w:bCs w:val="false"/>
+                <w:sz w:val="20"/>
+                <w:szCs w:val="20"/>
+              </w:rPr>
+              <w:t xml:space="preserve">O motor é uma fonte contínua de vibração periódica, transmitida pelo chassi à antena; explica a oscilação de 17,63 Hz (Seção 3) e boa parte das pequenas excursões em repouso (Seção 2.1).</w:t>
+            </w:r>
+          </w:p>
+        </w:tc>
+      </w:tr>
+      <w:tr>
+        <w:trPr>
+          <w:tblHeader w:val="false"/>
+        </w:trPr>
+        <w:tc>
+          <w:tcPr>
+            <w:tcW w:type="dxa" w:w="2835"/>
+            <w:tcBorders>
+              <w:top w:val="single" w:color="000000" w:sz="4"/>
+              <w:left w:val="single" w:color="000000" w:sz="4"/>
+              <w:bottom w:val="single" w:color="000000" w:sz="4"/>
+              <w:right w:val="single" w:color="000000" w:sz="4"/>
+            </w:tcBorders>
+            <w:tcMar>
+              <w:top w:type="dxa" w:w="60"/>
+              <w:left w:type="dxa" w:w="100"/>
+              <w:bottom w:type="dxa" w:w="60"/>
+              <w:right w:type="dxa" w:w="100"/>
+            </w:tcMar>
+            <w:vAlign w:val="center"/>
+          </w:tcPr>
+          <w:p>
+            <w:pPr>
+              <w:spacing w:line="240"/>
+              <w:jc w:val="left"/>
+            </w:pPr>
+            <w:r>
+              <w:rPr>
+                <w:rFonts w:ascii="Times New Roman" w:cs="Times New Roman" w:eastAsia="Times New Roman" w:hAnsi="Times New Roman"/>
+                <w:b w:val="false"/>
+                <w:bCs w:val="false"/>
+                <w:sz w:val="20"/>
+                <w:szCs w:val="20"/>
+              </w:rPr>
+              <w:t xml:space="preserve">Sensor na antena, a 7 m de altura</w:t>
+            </w:r>
+          </w:p>
+        </w:tc>
+        <w:tc>
+          <w:tcPr>
+            <w:tcW w:type="dxa" w:w="6237"/>
+            <w:tcBorders>
+              <w:top w:val="single" w:color="000000" w:sz="4"/>
+              <w:left w:val="single" w:color="000000" w:sz="4"/>
+              <w:bottom w:val="single" w:color="000000" w:sz="4"/>
+              <w:right w:val="single" w:color="000000" w:sz="4"/>
+            </w:tcBorders>
+            <w:tcMar>
+              <w:top w:type="dxa" w:w="60"/>
+              <w:left w:type="dxa" w:w="100"/>
+              <w:bottom w:type="dxa" w:w="60"/>
+              <w:right w:type="dxa" w:w="100"/>
+            </w:tcMar>
+            <w:vAlign w:val="center"/>
+          </w:tcPr>
+          <w:p>
+            <w:pPr>
+              <w:spacing w:line="240"/>
+              <w:jc w:val="left"/>
+            </w:pPr>
+            <w:r>
+              <w:rPr>
+                <w:rFonts w:ascii="Times New Roman" w:cs="Times New Roman" w:eastAsia="Times New Roman" w:hAnsi="Times New Roman"/>
+                <w:b w:val="false"/>
+                <w:bCs w:val="false"/>
+                <w:sz w:val="20"/>
+                <w:szCs w:val="20"/>
+              </w:rPr>
+              <w:t xml:space="preserve">A inclinação medida no topo soma a inclinação da carroceria e a flexão da antena. A altura amplia o deslocamento do topo para um mesmo ângulo e faz o acelerômetro ler as acelerações do balanço como inclinação adicional (Seção 2.4).</w:t>
+            </w:r>
+          </w:p>
+        </w:tc>
+      </w:tr>
+      <w:tr>
+        <w:trPr>
+          <w:tblHeader w:val="false"/>
+        </w:trPr>
+        <w:tc>
+          <w:tcPr>
+            <w:tcW w:type="dxa" w:w="2835"/>
+            <w:tcBorders>
+              <w:top w:val="single" w:color="000000" w:sz="4"/>
+              <w:left w:val="single" w:color="000000" w:sz="4"/>
+              <w:bottom w:val="single" w:color="000000" w:sz="4"/>
+              <w:right w:val="single" w:color="000000" w:sz="4"/>
+            </w:tcBorders>
+            <w:tcMar>
+              <w:top w:type="dxa" w:w="60"/>
+              <w:left w:type="dxa" w:w="100"/>
+              <w:bottom w:type="dxa" w:w="60"/>
+              <w:right w:type="dxa" w:w="100"/>
+            </w:tcMar>
+            <w:vAlign w:val="center"/>
+          </w:tcPr>
+          <w:p>
+            <w:pPr>
+              <w:spacing w:line="240"/>
+              <w:jc w:val="left"/>
+            </w:pPr>
+            <w:r>
+              <w:rPr>
+                <w:rFonts w:ascii="Times New Roman" w:cs="Times New Roman" w:eastAsia="Times New Roman" w:hAnsi="Times New Roman"/>
+                <w:b w:val="false"/>
+                <w:bCs w:val="false"/>
+                <w:sz w:val="20"/>
+                <w:szCs w:val="20"/>
+              </w:rPr>
+              <w:t xml:space="preserve">Pessoas subindo e descendo da viatura no período dos maiores valores de inclinação</w:t>
+            </w:r>
+          </w:p>
+        </w:tc>
+        <w:tc>
+          <w:tcPr>
+            <w:tcW w:type="dxa" w:w="6237"/>
+            <w:tcBorders>
+              <w:top w:val="single" w:color="000000" w:sz="4"/>
+              <w:left w:val="single" w:color="000000" w:sz="4"/>
+              <w:bottom w:val="single" w:color="000000" w:sz="4"/>
+              <w:right w:val="single" w:color="000000" w:sz="4"/>
+            </w:tcBorders>
+            <w:tcMar>
+              <w:top w:type="dxa" w:w="60"/>
+              <w:left w:type="dxa" w:w="100"/>
+              <w:bottom w:type="dxa" w:w="60"/>
+              <w:right w:type="dxa" w:w="100"/>
+            </w:tcMar>
+            <w:vAlign w:val="center"/>
+          </w:tcPr>
+          <w:p>
+            <w:pPr>
+              <w:spacing w:line="240"/>
+              <w:jc w:val="left"/>
+            </w:pPr>
+            <w:r>
+              <w:rPr>
+                <w:rFonts w:ascii="Times New Roman" w:cs="Times New Roman" w:eastAsia="Times New Roman" w:hAnsi="Times New Roman"/>
+                <w:b w:val="false"/>
+                <w:bCs w:val="false"/>
+                <w:sz w:val="20"/>
+                <w:szCs w:val="20"/>
+              </w:rPr>
+              <w:t xml:space="preserve">A mudança de carga balança a carroceria sobre a suspensão e excita a antena; é a origem dos extremos de −2,17° e +2,67° da leitura contínua (Seção 2.2).</w:t>
+            </w:r>
+          </w:p>
+        </w:tc>
+      </w:tr>
+    </w:tbl>
+    <w:p>
+      <w:pPr>
+        <w:spacing w:after="200" w:line="240"/>
+        <w:jc w:val="center"/>
+      </w:pPr>
+      <w:r>
+        <w:rPr>
+          <w:rFonts w:ascii="Times New Roman" w:cs="Times New Roman" w:eastAsia="Times New Roman" w:hAnsi="Times New Roman"/>
+          <w:sz w:val="20"/>
+          <w:szCs w:val="20"/>
+        </w:rPr>
+        <w:t xml:space="preserve">Fonte: informações do ensaio de 26/10/2026.</w:t>
+      </w:r>
+    </w:p>
+    <w:p>
+      <w:pPr>
+        <w:pStyle w:val="Heading1"/>
+        <w:pageBreakBefore/>
+        <w:spacing w:after="240" w:before="240" w:line="360"/>
+      </w:pPr>
+      <w:r>
+        <w:rPr>
+          <w:rFonts w:ascii="Times New Roman" w:cs="Times New Roman" w:eastAsia="Times New Roman" w:hAnsi="Times New Roman"/>
+          <w:b/>
+          <w:bCs/>
+          <w:caps/>
+          <w:sz w:val="24"/>
+          <w:szCs w:val="24"/>
+        </w:rPr>
+        <w:t xml:space="preserve">2 Leitura contínua</w:t>
+      </w:r>
+    </w:p>
+    <w:p>
+      <w:pPr>
+        <w:keepNext/>
+        <w:keepLines/>
+        <w:spacing w:after="60" w:before="200" w:line="240"/>
+        <w:jc w:val="center"/>
+      </w:pPr>
+      <w:r>
+        <w:rPr>
+          <w:rFonts w:ascii="Times New Roman" w:cs="Times New Roman" w:eastAsia="Times New Roman" w:hAnsi="Times New Roman"/>
+          <w:sz w:val="20"/>
+          <w:szCs w:val="20"/>
+        </w:rPr>
+        <w:t xml:space="preserve">Tabela 3 — Dados gerais da sessão de leitura contínua</w:t>
       </w:r>
     </w:p>
     <w:tbl>
@@ -2255,7 +2897,7 @@
                 <w:sz w:val="20"/>
                 <w:szCs w:val="20"/>
               </w:rPr>
-              <w:t xml:space="preserve">Início / exportação do relatório</w:t>
+              <w:t xml:space="preserve">Instalação / condição</w:t>
             </w:r>
           </w:p>
         </w:tc>
@@ -2289,7 +2931,7 @@
                 <w:sz w:val="20"/>
                 <w:szCs w:val="20"/>
               </w:rPr>
-              <w:t xml:space="preserve">26/10/2026 16:18:58 / 16:21:22 (sessão ainda em andamento)</w:t>
+              <w:t xml:space="preserve">Antena da viatura a 7 m; motor ligado</w:t>
             </w:r>
           </w:p>
         </w:tc>
@@ -2328,7 +2970,7 @@
                 <w:sz w:val="20"/>
                 <w:szCs w:val="20"/>
               </w:rPr>
-              <w:t xml:space="preserve">Duração coberta pelos gráficos</w:t>
+              <w:t xml:space="preserve">Início / exportação do relatório</w:t>
             </w:r>
           </w:p>
         </w:tc>
@@ -2362,7 +3004,7 @@
                 <w:sz w:val="20"/>
                 <w:szCs w:val="20"/>
               </w:rPr>
-              <w:t xml:space="preserve">≈147 s</w:t>
+              <w:t xml:space="preserve">26/10/2026 16:18:58 / 16:21:22 (sessão ainda em andamento)</w:t>
             </w:r>
           </w:p>
         </w:tc>
@@ -2401,7 +3043,7 @@
                 <w:sz w:val="20"/>
                 <w:szCs w:val="20"/>
               </w:rPr>
-              <w:t xml:space="preserve">Leituras registradas</w:t>
+              <w:t xml:space="preserve">Duração coberta pelos gráficos</w:t>
             </w:r>
           </w:p>
         </w:tc>
@@ -2435,7 +3077,7 @@
                 <w:sz w:val="20"/>
                 <w:szCs w:val="20"/>
               </w:rPr>
-              <w:t xml:space="preserve">734 (≈5,0 leituras/s — notificação BLE a cada 200 ms)</w:t>
+              <w:t xml:space="preserve">≈147 s</w:t>
             </w:r>
           </w:p>
         </w:tc>
@@ -2474,7 +3116,7 @@
                 <w:sz w:val="20"/>
                 <w:szCs w:val="20"/>
               </w:rPr>
-              <w:t xml:space="preserve">Inclinação mín. / máx.</w:t>
+              <w:t xml:space="preserve">Leituras registradas</w:t>
             </w:r>
           </w:p>
         </w:tc>
@@ -2508,7 +3150,7 @@
                 <w:sz w:val="20"/>
                 <w:szCs w:val="20"/>
               </w:rPr>
-              <w:t xml:space="preserve">−2,17° / +2,67°</w:t>
+              <w:t xml:space="preserve">734 (≈5,0 leituras/s — notificação BLE a cada 200 ms)</w:t>
             </w:r>
           </w:p>
         </w:tc>
@@ -2547,6 +3189,79 @@
                 <w:sz w:val="20"/>
                 <w:szCs w:val="20"/>
               </w:rPr>
+              <w:t xml:space="preserve">Inclinação mín. / máx.</w:t>
+            </w:r>
+          </w:p>
+        </w:tc>
+        <w:tc>
+          <w:tcPr>
+            <w:tcW w:type="dxa" w:w="4536"/>
+            <w:tcBorders>
+              <w:top w:val="single" w:color="000000" w:sz="4"/>
+              <w:left w:val="single" w:color="000000" w:sz="4"/>
+              <w:bottom w:val="single" w:color="000000" w:sz="4"/>
+              <w:right w:val="single" w:color="000000" w:sz="4"/>
+            </w:tcBorders>
+            <w:tcMar>
+              <w:top w:type="dxa" w:w="60"/>
+              <w:left w:type="dxa" w:w="100"/>
+              <w:bottom w:type="dxa" w:w="60"/>
+              <w:right w:type="dxa" w:w="100"/>
+            </w:tcMar>
+            <w:vAlign w:val="center"/>
+          </w:tcPr>
+          <w:p>
+            <w:pPr>
+              <w:spacing w:line="240"/>
+              <w:jc w:val="center"/>
+            </w:pPr>
+            <w:r>
+              <w:rPr>
+                <w:rFonts w:ascii="Times New Roman" w:cs="Times New Roman" w:eastAsia="Times New Roman" w:hAnsi="Times New Roman"/>
+                <w:b w:val="false"/>
+                <w:bCs w:val="false"/>
+                <w:sz w:val="20"/>
+                <w:szCs w:val="20"/>
+              </w:rPr>
+              <w:t xml:space="preserve">−2,17° / +2,67°</w:t>
+            </w:r>
+          </w:p>
+        </w:tc>
+      </w:tr>
+      <w:tr>
+        <w:trPr>
+          <w:tblHeader w:val="false"/>
+        </w:trPr>
+        <w:tc>
+          <w:tcPr>
+            <w:tcW w:type="dxa" w:w="4536"/>
+            <w:tcBorders>
+              <w:top w:val="single" w:color="000000" w:sz="4"/>
+              <w:left w:val="single" w:color="000000" w:sz="4"/>
+              <w:bottom w:val="single" w:color="000000" w:sz="4"/>
+              <w:right w:val="single" w:color="000000" w:sz="4"/>
+            </w:tcBorders>
+            <w:tcMar>
+              <w:top w:type="dxa" w:w="60"/>
+              <w:left w:type="dxa" w:w="100"/>
+              <w:bottom w:type="dxa" w:w="60"/>
+              <w:right w:type="dxa" w:w="100"/>
+            </w:tcMar>
+            <w:vAlign w:val="center"/>
+          </w:tcPr>
+          <w:p>
+            <w:pPr>
+              <w:spacing w:line="240"/>
+              <w:jc w:val="left"/>
+            </w:pPr>
+            <w:r>
+              <w:rPr>
+                <w:rFonts w:ascii="Times New Roman" w:cs="Times New Roman" w:eastAsia="Times New Roman" w:hAnsi="Times New Roman"/>
+                <w:b w:val="false"/>
+                <w:bCs w:val="false"/>
+                <w:sz w:val="20"/>
+                <w:szCs w:val="20"/>
+              </w:rPr>
               <w:t xml:space="preserve">Azimute mín. / máx.</w:t>
             </w:r>
           </w:p>
@@ -2598,7 +3313,7 @@
           <w:sz w:val="20"/>
           <w:szCs w:val="20"/>
         </w:rPr>
-        <w:t xml:space="preserve">Fonte: relatorio_inclinometro_20261026_162122.pdf.</w:t>
+        <w:t xml:space="preserve">Fonte: relatorio_inclinometro_20261026_162122.pdf e condições do ensaio (Tabela 2).</w:t>
       </w:r>
     </w:p>
     <w:p>
@@ -2765,7 +3480,7 @@
           <w:sz w:val="24"/>
           <w:szCs w:val="24"/>
         </w:rPr>
-        <w:t xml:space="preserve">Os gráficos usam a escala da faixa de medição inteira (±60° na inclinação, ±90° no azimute), o que torna os eventos visualmente pequenos. A leitura correta vem do histórico de limites atingidos, que registra cada novo extremo com o horário. A sessão divide-se em três fases (Tabela 3).</w:t>
+        <w:t xml:space="preserve">Os gráficos usam a escala da faixa de medição inteira (±60° na inclinação, ±90° no azimute), o que torna os eventos visualmente pequenos. A leitura correta vem do histórico de limites atingidos, que registra cada novo extremo com o horário. A sessão divide-se em três fases (Tabela 4).</w:t>
       </w:r>
     </w:p>
     <w:p>
@@ -2781,7 +3496,7 @@
           <w:sz w:val="20"/>
           <w:szCs w:val="20"/>
         </w:rPr>
-        <w:t xml:space="preserve">Tabela 3 — Fases da leitura contínua</w:t>
+        <w:t xml:space="preserve">Tabela 4 — Fases da leitura contínua</w:t>
       </w:r>
     </w:p>
     <w:tbl>
@@ -2981,7 +3696,7 @@
                 <w:sz w:val="20"/>
                 <w:szCs w:val="20"/>
               </w:rPr>
-              <w:t xml:space="preserve">A — repouso</w:t>
+              <w:t xml:space="preserve">A — viatura parada, motor ligado</w:t>
             </w:r>
           </w:p>
         </w:tc>
@@ -3083,7 +3798,7 @@
                 <w:sz w:val="20"/>
                 <w:szCs w:val="20"/>
               </w:rPr>
-              <w:t xml:space="preserve">Conjunto parado, com pequenos toques/acomodações</w:t>
+              <w:t xml:space="preserve">Vibração do motor e pequenos balanços da antena</w:t>
             </w:r>
           </w:p>
         </w:tc>
@@ -3122,7 +3837,7 @@
                 <w:sz w:val="20"/>
                 <w:szCs w:val="20"/>
               </w:rPr>
-              <w:t xml:space="preserve">B — movimento</w:t>
+              <w:t xml:space="preserve">B — embarque e desembarque</w:t>
             </w:r>
           </w:p>
         </w:tc>
@@ -3224,7 +3939,7 @@
                 <w:sz w:val="20"/>
                 <w:szCs w:val="20"/>
               </w:rPr>
-              <w:t xml:space="preserve">Movimento manual de baixa frequência</w:t>
+              <w:t xml:space="preserve">Pessoas subindo e descendo: carroceria balança na suspensão e excita a antena</w:t>
             </w:r>
           </w:p>
         </w:tc>
@@ -3365,7 +4080,7 @@
                 <w:sz w:val="20"/>
                 <w:szCs w:val="20"/>
               </w:rPr>
-              <w:t xml:space="preserve">Oscilação amortecida de ≈±0,5° até ≈135 s; depois repouso</w:t>
+              <w:t xml:space="preserve">Oscilação amortecida de ≈±0,5° até ≈135 s; depois volta à condição da fase A</w:t>
             </w:r>
           </w:p>
         </w:tc>
@@ -3382,7 +4097,7 @@
           <w:sz w:val="20"/>
           <w:szCs w:val="20"/>
         </w:rPr>
-        <w:t xml:space="preserve">Fonte: elaborado pelo autor, a partir do histórico de limites e das Figuras 1 e 2.</w:t>
+        <w:t xml:space="preserve">Fonte: elaborado pelo autor, a partir do histórico de limites, das Figuras 1 e 2 e das condições do ensaio.</w:t>
       </w:r>
     </w:p>
     <w:p>
@@ -3398,7 +4113,7 @@
           <w:sz w:val="24"/>
           <w:szCs w:val="24"/>
         </w:rPr>
-        <w:t xml:space="preserve">2.1 Fase A — repouso</w:t>
+        <w:t xml:space="preserve">2.1 Fase A — viatura parada, motor ligado</w:t>
       </w:r>
     </w:p>
     <w:p>
@@ -3413,7 +4128,65 @@
           <w:sz w:val="24"/>
           <w:szCs w:val="24"/>
         </w:rPr>
-        <w:t xml:space="preserve">Nos primeiros segundos os extremos crescem de centésimos de grau (−0,03° a +0,11° até 16:19:03), o que corresponde ao ruído do caminho de medida e à acomodação inicial do filtro. O ruído do valor exibido é da ordem de 0,005° RMS; por isso, as excursões posteriores de −0,28° a −0,52° e de +0,22° a +0,46° (entre 16:19:39 e 16:20:16) não são ruído do sensor: são pequenos movimentos ou acelerações reais da bancada — um toque, o apoio de uma mão, o cabo sendo mexido. Como o caminho de medida tem corte de 3 Hz, um impulso curto aparece nos extremos com amplitude atenuada, mas aparece.</w:t>
+        <w:t xml:space="preserve">Nos primeiros segundos os extremos crescem de centésimos de grau (−0,03° a +0,11° até 16:19:03), o que corresponde à acomodação inicial do filtro. As excursões posteriores, de −0,28° a −0,52° e de +0,22° a +0,46° (entre 16:19:39 e 16:20:16), não são ruído do sensor, cujo valor filtrado tem ruído da ordem de 0,005° RMS em bancada: são o efeito combinado de duas causas reais.</w:t>
+      </w:r>
+    </w:p>
+    <w:p>
+      <w:pPr>
+        <w:pStyle w:val="ListParagraph"/>
+        <w:numPr>
+          <w:ilvl w:val="0"/>
+          <w:numId w:val="2"/>
+        </w:numPr>
+        <w:spacing w:after="60" w:line="360"/>
+        <w:jc w:val="both"/>
+      </w:pPr>
+      <w:r>
+        <w:rPr>
+          <w:rFonts w:ascii="Times New Roman" w:cs="Times New Roman" w:eastAsia="Times New Roman" w:hAnsi="Times New Roman"/>
+          <w:b/>
+          <w:bCs/>
+          <w:sz w:val="24"/>
+          <w:szCs w:val="24"/>
+        </w:rPr>
+        <w:t xml:space="preserve">Vibração do motor. </w:t>
+      </w:r>
+      <w:r>
+        <w:rPr>
+          <w:rFonts w:ascii="Times New Roman" w:cs="Times New Roman" w:eastAsia="Times New Roman" w:hAnsi="Times New Roman"/>
+          <w:sz w:val="24"/>
+          <w:szCs w:val="24"/>
+        </w:rPr>
+        <w:t xml:space="preserve">O caminho de medida (média móvel de 3 Hz) não elimina a vibração de 2,01° medida no Modo Vibração (Seção 3): deixa passar cerca de 17% dela se a frequência for 17,63 Hz (≈±0,34°) ou cerca de 7% se for 42,37 Hz (≈±0,14°). Como os extremos guardam o maior valor já visto, essa parcela aparece neles mesmo com a viatura parada.</w:t>
+      </w:r>
+    </w:p>
+    <w:p>
+      <w:pPr>
+        <w:pStyle w:val="ListParagraph"/>
+        <w:numPr>
+          <w:ilvl w:val="0"/>
+          <w:numId w:val="2"/>
+        </w:numPr>
+        <w:spacing w:after="60" w:line="360"/>
+        <w:jc w:val="both"/>
+      </w:pPr>
+      <w:r>
+        <w:rPr>
+          <w:rFonts w:ascii="Times New Roman" w:cs="Times New Roman" w:eastAsia="Times New Roman" w:hAnsi="Times New Roman"/>
+          <w:b/>
+          <w:bCs/>
+          <w:sz w:val="24"/>
+          <w:szCs w:val="24"/>
+        </w:rPr>
+        <w:t xml:space="preserve">Balanço lento da antena e da carroceria. </w:t>
+      </w:r>
+      <w:r>
+        <w:rPr>
+          <w:rFonts w:ascii="Times New Roman" w:cs="Times New Roman" w:eastAsia="Times New Roman" w:hAnsi="Times New Roman"/>
+          <w:sz w:val="24"/>
+          <w:szCs w:val="24"/>
+        </w:rPr>
+        <w:t xml:space="preserve">A antena de 7 m sobre a suspensão da viatura nunca está totalmente imóvel com o motor ligado; vento e pequenas acomodações somam alguns décimos de grau de baixa frequência.</w:t>
       </w:r>
     </w:p>
     <w:p>
@@ -3428,7 +4201,7 @@
           <w:sz w:val="24"/>
           <w:szCs w:val="24"/>
         </w:rPr>
-        <w:t xml:space="preserve">O azimute permaneceu entre −0,05° e +0,03°, o que confirma que a correção automática do viés do giroscópio (ZUPT) manteve o eixo fixo enquanto parado, sem deriva.</w:t>
+        <w:t xml:space="preserve">O azimute permaneceu entre −0,05° e +0,03°, o que confirma que a correção automática do viés do giroscópio (ZUPT) manteve o eixo fixo mesmo sob a vibração do motor, sem deriva.</w:t>
       </w:r>
     </w:p>
     <w:p>
@@ -3444,7 +4217,7 @@
           <w:sz w:val="24"/>
           <w:szCs w:val="24"/>
         </w:rPr>
-        <w:t xml:space="preserve">2.2 Fase B — movimento manual</w:t>
+        <w:t xml:space="preserve">2.2 Fase B — embarque e desembarque de pessoas</w:t>
       </w:r>
     </w:p>
     <w:p>
@@ -3459,7 +4232,7 @@
           <w:sz w:val="24"/>
           <w:szCs w:val="24"/>
         </w:rPr>
-        <w:t xml:space="preserve">Em cerca de 6 s (16:20:47 a 16:20:53), os extremos de inclinação passam a −2,17° e +2,67° e o azimute sobe até +0,41°. Esse evento é de baixa frequência: o caminho de medida, com corte de 3 Hz, deixaria passar apenas cerca de 17% de uma oscilação de 17,63 Hz como a da captura de vibração (Seção 3), e ±2,5° nos extremos exigiriam uma vibração de cerca de ±15° nessa frequência — incompatível com os 2,0° medidos depois. Trata-se, portanto, de um movimento lento do conjunto, compatível com manuseio (inclinar e soltar).</w:t>
+        <w:t xml:space="preserve">Em cerca de 6 s (16:20:47 a 16:20:53), período em que pessoas subiam e desciam da viatura, os extremos de inclinação passam a −2,17° e +2,67° e o azimute sobe até +0,41°. São os maiores valores da sessão, e a causa é mecânica: o peso de cada pessoa que sobe ou desce de um lado da viatura inclina a carroceria sobre a suspensão e a solta em seguida, o que a faz balançar; a antena, presa à carroceria, acompanha esse balanço e flexiona. A inclinação lida no topo é a soma das duas parcelas.</w:t>
       </w:r>
     </w:p>
     <w:p>
@@ -3474,23 +4247,7 @@
           <w:sz w:val="24"/>
           <w:szCs w:val="24"/>
         </w:rPr>
-        <w:t xml:space="preserve">O azimute de +0,41° no mesmo intervalo é coerente com uma pequena rotação real em torno da vertical durante o manuseio. Depois do evento ele não registrou novos extremos, ou seja, permaneceu estável.</w:t>
-      </w:r>
-    </w:p>
-    <w:p>
-      <w:pPr>
-        <w:pStyle w:val="Heading2"/>
-        <w:spacing w:after="120" w:before="240" w:line="360"/>
-      </w:pPr>
-      <w:r>
-        <w:rPr>
-          <w:rFonts w:ascii="Times New Roman" w:cs="Times New Roman" w:eastAsia="Times New Roman" w:hAnsi="Times New Roman"/>
-          <w:b/>
-          <w:bCs/>
-          <w:sz w:val="24"/>
-          <w:szCs w:val="24"/>
-        </w:rPr>
-        <w:t xml:space="preserve">2.3 Fase C — retorno ao repouso</w:t>
+        <w:t xml:space="preserve">O evento não é a vibração do motor: o caminho de medida, com corte de 3 Hz, deixaria passar no máximo cerca de 17% de uma oscilação de 17,63 Hz, e ±2,5° nos extremos exigiriam uma vibração de cerca de ±15° nessa frequência — incompatível com os 2,0° medidos no Modo Vibração. Trata-se de um movimento de baixa frequência, da ordem de 1 Hz ou menos, típico do balanço de carroceria sobre suspensão.</w:t>
       </w:r>
     </w:p>
     <w:p>
@@ -3505,25 +4262,69 @@
           <w:sz w:val="24"/>
           <w:szCs w:val="24"/>
         </w:rPr>
-        <w:t xml:space="preserve">Após o movimento, a curva de inclinação mostra uma oscilação de cerca de ±0,5°, com período da ordem de 1 a 2 s, que se amortece até ≈135 s. É o comportamento esperado de uma estrutura ou suporte que balança e se acomoda depois de ser solto. Não houve novos extremos, porque a oscilação ficou dentro da faixa já registrada.</w:t>
-      </w:r>
-    </w:p>
-    <w:p>
-      <w:pPr>
-        <w:pStyle w:val="Heading1"/>
-        <w:pageBreakBefore/>
-        <w:spacing w:after="240" w:before="240" w:line="360"/>
+        <w:t xml:space="preserve">O azimute de +0,41° no mesmo intervalo é coerente com uma pequena torção real da carroceria e da antena em torno da vertical causada pela carga assimétrica nos degraus. Depois do evento ele não registrou novos extremos, ou seja, voltou e permaneceu estável.</w:t>
+      </w:r>
+    </w:p>
+    <w:p>
+      <w:pPr>
+        <w:pStyle w:val="Heading2"/>
+        <w:spacing w:after="120" w:before="240" w:line="360"/>
       </w:pPr>
       <w:r>
         <w:rPr>
           <w:rFonts w:ascii="Times New Roman" w:cs="Times New Roman" w:eastAsia="Times New Roman" w:hAnsi="Times New Roman"/>
           <w:b/>
           <w:bCs/>
-          <w:caps/>
-          <w:sz w:val="24"/>
-          <w:szCs w:val="24"/>
-        </w:rPr>
-        <w:t xml:space="preserve">3 Captura de vibração</w:t>
+          <w:sz w:val="24"/>
+          <w:szCs w:val="24"/>
+        </w:rPr>
+        <w:t xml:space="preserve">2.3 Fase C — retorno ao repouso</w:t>
+      </w:r>
+    </w:p>
+    <w:p>
+      <w:pPr>
+        <w:spacing w:after="120" w:line="360"/>
+        <w:ind w:firstLine="709"/>
+        <w:jc w:val="both"/>
+      </w:pPr>
+      <w:r>
+        <w:rPr>
+          <w:rFonts w:ascii="Times New Roman" w:cs="Times New Roman" w:eastAsia="Times New Roman" w:hAnsi="Times New Roman"/>
+          <w:sz w:val="24"/>
+          <w:szCs w:val="24"/>
+        </w:rPr>
+        <w:t xml:space="preserve">Após o embarque e o desembarque, a curva de inclinação mostra uma oscilação de cerca de ±0,5°, com período da ordem de 1 a 2 s (0,5 a 1 Hz), que se amortece até ≈135 s. É a resposta livre do conjunto suspensão-carroceria-antena depois de excitado: a faixa de 0,5 a 1,5 Hz é a típica do balanço de carroceria de veículos sobre suspensão. Não houve novos extremos, porque a oscilação ficou dentro da faixa já registrada.</w:t>
+      </w:r>
+    </w:p>
+    <w:p>
+      <w:pPr>
+        <w:pStyle w:val="Heading2"/>
+        <w:spacing w:after="120" w:before="240" w:line="360"/>
+      </w:pPr>
+      <w:r>
+        <w:rPr>
+          <w:rFonts w:ascii="Times New Roman" w:cs="Times New Roman" w:eastAsia="Times New Roman" w:hAnsi="Times New Roman"/>
+          <w:b/>
+          <w:bCs/>
+          <w:sz w:val="24"/>
+          <w:szCs w:val="24"/>
+        </w:rPr>
+        <w:t xml:space="preserve">2.4 Leitura em graus e deslocamento no topo da antena</w:t>
+      </w:r>
+    </w:p>
+    <w:p>
+      <w:pPr>
+        <w:spacing w:after="120" w:line="360"/>
+        <w:ind w:firstLine="709"/>
+        <w:jc w:val="both"/>
+      </w:pPr>
+      <w:r>
+        <w:rPr>
+          <w:rFonts w:ascii="Times New Roman" w:cs="Times New Roman" w:eastAsia="Times New Roman" w:hAnsi="Times New Roman"/>
+          <w:sz w:val="24"/>
+          <w:szCs w:val="24"/>
+        </w:rPr>
+        <w:t xml:space="preserve">Com o sensor a L = 7 m de altura, um mesmo valor em graus pode corresponder a deslocamentos muito diferentes do topo da antena, conforme a frequência do movimento. Isso acontece porque o acelerômetro mede inclinação somada à aceleração lateral: num balanço de frequência f e deslocamento x no topo, a leitura é aproximadamente θ_lido ≈ x/L + x·(2πf)²/g. A primeira parcela é a inclinação real; a segunda é a aceleração do balanço lida como inclinação, e cresce com o quadrado da frequência. O deslocamento correspondente a uma leitura é, portanto, x ≈ θ_lido / (1/L + (2πf)²/g) (Tabela 5).</w:t>
       </w:r>
     </w:p>
     <w:p>
@@ -3539,7 +4340,1145 @@
           <w:sz w:val="20"/>
           <w:szCs w:val="20"/>
         </w:rPr>
-        <w:t xml:space="preserve">Tabela 4 — Resultados da captura de vibração</w:t>
+        <w:t xml:space="preserve">Tabela 5 — Deslocamento do topo da antena (L = 7 m) correspondente a cada leitura</w:t>
+      </w:r>
+    </w:p>
+    <w:tbl>
+      <w:tblPr>
+        <w:tblW w:type="dxa" w:w="9072"/>
+        <w:tblBorders>
+          <w:top w:val="single" w:color="auto" w:sz="4"/>
+          <w:left w:val="single" w:color="auto" w:sz="4"/>
+          <w:bottom w:val="single" w:color="auto" w:sz="4"/>
+          <w:right w:val="single" w:color="auto" w:sz="4"/>
+          <w:insideH w:val="single" w:color="auto" w:sz="4"/>
+          <w:insideV w:val="single" w:color="auto" w:sz="4"/>
+        </w:tblBorders>
+      </w:tblPr>
+      <w:tblGrid>
+        <w:gridCol w:w="2268"/>
+        <w:gridCol w:w="1701"/>
+        <w:gridCol w:w="1701"/>
+        <w:gridCol w:w="1701"/>
+        <w:gridCol w:w="1701"/>
+      </w:tblGrid>
+      <w:tr>
+        <w:trPr>
+          <w:tblHeader/>
+        </w:trPr>
+        <w:tc>
+          <w:tcPr>
+            <w:tcW w:type="dxa" w:w="2268"/>
+            <w:tcBorders>
+              <w:top w:val="single" w:color="000000" w:sz="4"/>
+              <w:left w:val="single" w:color="000000" w:sz="4"/>
+              <w:bottom w:val="single" w:color="000000" w:sz="4"/>
+              <w:right w:val="single" w:color="000000" w:sz="4"/>
+            </w:tcBorders>
+            <w:shd w:fill="D9D9D9" w:color="auto" w:val="clear"/>
+            <w:tcMar>
+              <w:top w:type="dxa" w:w="60"/>
+              <w:left w:type="dxa" w:w="100"/>
+              <w:bottom w:type="dxa" w:w="60"/>
+              <w:right w:type="dxa" w:w="100"/>
+            </w:tcMar>
+            <w:vAlign w:val="center"/>
+          </w:tcPr>
+          <w:p>
+            <w:pPr>
+              <w:spacing w:line="240"/>
+              <w:jc w:val="left"/>
+            </w:pPr>
+            <w:r>
+              <w:rPr>
+                <w:rFonts w:ascii="Times New Roman" w:cs="Times New Roman" w:eastAsia="Times New Roman" w:hAnsi="Times New Roman"/>
+                <w:b/>
+                <w:bCs/>
+                <w:sz w:val="20"/>
+                <w:szCs w:val="20"/>
+              </w:rPr>
+              <w:t xml:space="preserve">Movimento</w:t>
+            </w:r>
+          </w:p>
+        </w:tc>
+        <w:tc>
+          <w:tcPr>
+            <w:tcW w:type="dxa" w:w="1701"/>
+            <w:tcBorders>
+              <w:top w:val="single" w:color="000000" w:sz="4"/>
+              <w:left w:val="single" w:color="000000" w:sz="4"/>
+              <w:bottom w:val="single" w:color="000000" w:sz="4"/>
+              <w:right w:val="single" w:color="000000" w:sz="4"/>
+            </w:tcBorders>
+            <w:shd w:fill="D9D9D9" w:color="auto" w:val="clear"/>
+            <w:tcMar>
+              <w:top w:type="dxa" w:w="60"/>
+              <w:left w:type="dxa" w:w="100"/>
+              <w:bottom w:type="dxa" w:w="60"/>
+              <w:right w:type="dxa" w:w="100"/>
+            </w:tcMar>
+            <w:vAlign w:val="center"/>
+          </w:tcPr>
+          <w:p>
+            <w:pPr>
+              <w:spacing w:line="240"/>
+              <w:jc w:val="center"/>
+            </w:pPr>
+            <w:r>
+              <w:rPr>
+                <w:rFonts w:ascii="Times New Roman" w:cs="Times New Roman" w:eastAsia="Times New Roman" w:hAnsi="Times New Roman"/>
+                <w:b/>
+                <w:bCs/>
+                <w:sz w:val="20"/>
+                <w:szCs w:val="20"/>
+              </w:rPr>
+              <w:t xml:space="preserve">Frequência</w:t>
+            </w:r>
+          </w:p>
+        </w:tc>
+        <w:tc>
+          <w:tcPr>
+            <w:tcW w:type="dxa" w:w="1701"/>
+            <w:tcBorders>
+              <w:top w:val="single" w:color="000000" w:sz="4"/>
+              <w:left w:val="single" w:color="000000" w:sz="4"/>
+              <w:bottom w:val="single" w:color="000000" w:sz="4"/>
+              <w:right w:val="single" w:color="000000" w:sz="4"/>
+            </w:tcBorders>
+            <w:shd w:fill="D9D9D9" w:color="auto" w:val="clear"/>
+            <w:tcMar>
+              <w:top w:type="dxa" w:w="60"/>
+              <w:left w:type="dxa" w:w="100"/>
+              <w:bottom w:type="dxa" w:w="60"/>
+              <w:right w:type="dxa" w:w="100"/>
+            </w:tcMar>
+            <w:vAlign w:val="center"/>
+          </w:tcPr>
+          <w:p>
+            <w:pPr>
+              <w:spacing w:line="240"/>
+              <w:jc w:val="center"/>
+            </w:pPr>
+            <w:r>
+              <w:rPr>
+                <w:rFonts w:ascii="Times New Roman" w:cs="Times New Roman" w:eastAsia="Times New Roman" w:hAnsi="Times New Roman"/>
+                <w:b/>
+                <w:bCs/>
+                <w:sz w:val="20"/>
+                <w:szCs w:val="20"/>
+              </w:rPr>
+              <w:t xml:space="preserve">Leitura de 0,5°</w:t>
+            </w:r>
+          </w:p>
+        </w:tc>
+        <w:tc>
+          <w:tcPr>
+            <w:tcW w:type="dxa" w:w="1701"/>
+            <w:tcBorders>
+              <w:top w:val="single" w:color="000000" w:sz="4"/>
+              <w:left w:val="single" w:color="000000" w:sz="4"/>
+              <w:bottom w:val="single" w:color="000000" w:sz="4"/>
+              <w:right w:val="single" w:color="000000" w:sz="4"/>
+            </w:tcBorders>
+            <w:shd w:fill="D9D9D9" w:color="auto" w:val="clear"/>
+            <w:tcMar>
+              <w:top w:type="dxa" w:w="60"/>
+              <w:left w:type="dxa" w:w="100"/>
+              <w:bottom w:type="dxa" w:w="60"/>
+              <w:right w:type="dxa" w:w="100"/>
+            </w:tcMar>
+            <w:vAlign w:val="center"/>
+          </w:tcPr>
+          <w:p>
+            <w:pPr>
+              <w:spacing w:line="240"/>
+              <w:jc w:val="center"/>
+            </w:pPr>
+            <w:r>
+              <w:rPr>
+                <w:rFonts w:ascii="Times New Roman" w:cs="Times New Roman" w:eastAsia="Times New Roman" w:hAnsi="Times New Roman"/>
+                <w:b/>
+                <w:bCs/>
+                <w:sz w:val="20"/>
+                <w:szCs w:val="20"/>
+              </w:rPr>
+              <w:t xml:space="preserve">Leitura de 2,17°</w:t>
+            </w:r>
+          </w:p>
+        </w:tc>
+        <w:tc>
+          <w:tcPr>
+            <w:tcW w:type="dxa" w:w="1701"/>
+            <w:tcBorders>
+              <w:top w:val="single" w:color="000000" w:sz="4"/>
+              <w:left w:val="single" w:color="000000" w:sz="4"/>
+              <w:bottom w:val="single" w:color="000000" w:sz="4"/>
+              <w:right w:val="single" w:color="000000" w:sz="4"/>
+            </w:tcBorders>
+            <w:shd w:fill="D9D9D9" w:color="auto" w:val="clear"/>
+            <w:tcMar>
+              <w:top w:type="dxa" w:w="60"/>
+              <w:left w:type="dxa" w:w="100"/>
+              <w:bottom w:type="dxa" w:w="60"/>
+              <w:right w:type="dxa" w:w="100"/>
+            </w:tcMar>
+            <w:vAlign w:val="center"/>
+          </w:tcPr>
+          <w:p>
+            <w:pPr>
+              <w:spacing w:line="240"/>
+              <w:jc w:val="center"/>
+            </w:pPr>
+            <w:r>
+              <w:rPr>
+                <w:rFonts w:ascii="Times New Roman" w:cs="Times New Roman" w:eastAsia="Times New Roman" w:hAnsi="Times New Roman"/>
+                <w:b/>
+                <w:bCs/>
+                <w:sz w:val="20"/>
+                <w:szCs w:val="20"/>
+              </w:rPr>
+              <w:t xml:space="preserve">Leitura de 2,67°</w:t>
+            </w:r>
+          </w:p>
+        </w:tc>
+      </w:tr>
+      <w:tr>
+        <w:trPr>
+          <w:tblHeader w:val="false"/>
+        </w:trPr>
+        <w:tc>
+          <w:tcPr>
+            <w:tcW w:type="dxa" w:w="2268"/>
+            <w:tcBorders>
+              <w:top w:val="single" w:color="000000" w:sz="4"/>
+              <w:left w:val="single" w:color="000000" w:sz="4"/>
+              <w:bottom w:val="single" w:color="000000" w:sz="4"/>
+              <w:right w:val="single" w:color="000000" w:sz="4"/>
+            </w:tcBorders>
+            <w:tcMar>
+              <w:top w:type="dxa" w:w="60"/>
+              <w:left w:type="dxa" w:w="100"/>
+              <w:bottom w:type="dxa" w:w="60"/>
+              <w:right w:type="dxa" w:w="100"/>
+            </w:tcMar>
+            <w:vAlign w:val="center"/>
+          </w:tcPr>
+          <w:p>
+            <w:pPr>
+              <w:spacing w:line="240"/>
+              <w:jc w:val="left"/>
+            </w:pPr>
+            <w:r>
+              <w:rPr>
+                <w:rFonts w:ascii="Times New Roman" w:cs="Times New Roman" w:eastAsia="Times New Roman" w:hAnsi="Times New Roman"/>
+                <w:b w:val="false"/>
+                <w:bCs w:val="false"/>
+                <w:sz w:val="20"/>
+                <w:szCs w:val="20"/>
+              </w:rPr>
+              <w:t xml:space="preserve">Inclinação estática da viatura</w:t>
+            </w:r>
+          </w:p>
+        </w:tc>
+        <w:tc>
+          <w:tcPr>
+            <w:tcW w:type="dxa" w:w="1701"/>
+            <w:tcBorders>
+              <w:top w:val="single" w:color="000000" w:sz="4"/>
+              <w:left w:val="single" w:color="000000" w:sz="4"/>
+              <w:bottom w:val="single" w:color="000000" w:sz="4"/>
+              <w:right w:val="single" w:color="000000" w:sz="4"/>
+            </w:tcBorders>
+            <w:tcMar>
+              <w:top w:type="dxa" w:w="60"/>
+              <w:left w:type="dxa" w:w="100"/>
+              <w:bottom w:type="dxa" w:w="60"/>
+              <w:right w:type="dxa" w:w="100"/>
+            </w:tcMar>
+            <w:vAlign w:val="center"/>
+          </w:tcPr>
+          <w:p>
+            <w:pPr>
+              <w:spacing w:line="240"/>
+              <w:jc w:val="center"/>
+            </w:pPr>
+            <w:r>
+              <w:rPr>
+                <w:rFonts w:ascii="Times New Roman" w:cs="Times New Roman" w:eastAsia="Times New Roman" w:hAnsi="Times New Roman"/>
+                <w:b w:val="false"/>
+                <w:bCs w:val="false"/>
+                <w:sz w:val="20"/>
+                <w:szCs w:val="20"/>
+              </w:rPr>
+              <w:t xml:space="preserve">0 Hz</w:t>
+            </w:r>
+          </w:p>
+        </w:tc>
+        <w:tc>
+          <w:tcPr>
+            <w:tcW w:type="dxa" w:w="1701"/>
+            <w:tcBorders>
+              <w:top w:val="single" w:color="000000" w:sz="4"/>
+              <w:left w:val="single" w:color="000000" w:sz="4"/>
+              <w:bottom w:val="single" w:color="000000" w:sz="4"/>
+              <w:right w:val="single" w:color="000000" w:sz="4"/>
+            </w:tcBorders>
+            <w:tcMar>
+              <w:top w:type="dxa" w:w="60"/>
+              <w:left w:type="dxa" w:w="100"/>
+              <w:bottom w:type="dxa" w:w="60"/>
+              <w:right w:type="dxa" w:w="100"/>
+            </w:tcMar>
+            <w:vAlign w:val="center"/>
+          </w:tcPr>
+          <w:p>
+            <w:pPr>
+              <w:spacing w:line="240"/>
+              <w:jc w:val="center"/>
+            </w:pPr>
+            <w:r>
+              <w:rPr>
+                <w:rFonts w:ascii="Times New Roman" w:cs="Times New Roman" w:eastAsia="Times New Roman" w:hAnsi="Times New Roman"/>
+                <w:b w:val="false"/>
+                <w:bCs w:val="false"/>
+                <w:sz w:val="20"/>
+                <w:szCs w:val="20"/>
+              </w:rPr>
+              <w:t xml:space="preserve">≈61 mm</w:t>
+            </w:r>
+          </w:p>
+        </w:tc>
+        <w:tc>
+          <w:tcPr>
+            <w:tcW w:type="dxa" w:w="1701"/>
+            <w:tcBorders>
+              <w:top w:val="single" w:color="000000" w:sz="4"/>
+              <w:left w:val="single" w:color="000000" w:sz="4"/>
+              <w:bottom w:val="single" w:color="000000" w:sz="4"/>
+              <w:right w:val="single" w:color="000000" w:sz="4"/>
+            </w:tcBorders>
+            <w:tcMar>
+              <w:top w:type="dxa" w:w="60"/>
+              <w:left w:type="dxa" w:w="100"/>
+              <w:bottom w:type="dxa" w:w="60"/>
+              <w:right w:type="dxa" w:w="100"/>
+            </w:tcMar>
+            <w:vAlign w:val="center"/>
+          </w:tcPr>
+          <w:p>
+            <w:pPr>
+              <w:spacing w:line="240"/>
+              <w:jc w:val="center"/>
+            </w:pPr>
+            <w:r>
+              <w:rPr>
+                <w:rFonts w:ascii="Times New Roman" w:cs="Times New Roman" w:eastAsia="Times New Roman" w:hAnsi="Times New Roman"/>
+                <w:b w:val="false"/>
+                <w:bCs w:val="false"/>
+                <w:sz w:val="20"/>
+                <w:szCs w:val="20"/>
+              </w:rPr>
+              <w:t xml:space="preserve">≈265 mm</w:t>
+            </w:r>
+          </w:p>
+        </w:tc>
+        <w:tc>
+          <w:tcPr>
+            <w:tcW w:type="dxa" w:w="1701"/>
+            <w:tcBorders>
+              <w:top w:val="single" w:color="000000" w:sz="4"/>
+              <w:left w:val="single" w:color="000000" w:sz="4"/>
+              <w:bottom w:val="single" w:color="000000" w:sz="4"/>
+              <w:right w:val="single" w:color="000000" w:sz="4"/>
+            </w:tcBorders>
+            <w:tcMar>
+              <w:top w:type="dxa" w:w="60"/>
+              <w:left w:type="dxa" w:w="100"/>
+              <w:bottom w:type="dxa" w:w="60"/>
+              <w:right w:type="dxa" w:w="100"/>
+            </w:tcMar>
+            <w:vAlign w:val="center"/>
+          </w:tcPr>
+          <w:p>
+            <w:pPr>
+              <w:spacing w:line="240"/>
+              <w:jc w:val="center"/>
+            </w:pPr>
+            <w:r>
+              <w:rPr>
+                <w:rFonts w:ascii="Times New Roman" w:cs="Times New Roman" w:eastAsia="Times New Roman" w:hAnsi="Times New Roman"/>
+                <w:b w:val="false"/>
+                <w:bCs w:val="false"/>
+                <w:sz w:val="20"/>
+                <w:szCs w:val="20"/>
+              </w:rPr>
+              <w:t xml:space="preserve">≈326 mm</w:t>
+            </w:r>
+          </w:p>
+        </w:tc>
+      </w:tr>
+      <w:tr>
+        <w:trPr>
+          <w:tblHeader w:val="false"/>
+        </w:trPr>
+        <w:tc>
+          <w:tcPr>
+            <w:tcW w:type="dxa" w:w="2268"/>
+            <w:tcBorders>
+              <w:top w:val="single" w:color="000000" w:sz="4"/>
+              <w:left w:val="single" w:color="000000" w:sz="4"/>
+              <w:bottom w:val="single" w:color="000000" w:sz="4"/>
+              <w:right w:val="single" w:color="000000" w:sz="4"/>
+            </w:tcBorders>
+            <w:tcMar>
+              <w:top w:type="dxa" w:w="60"/>
+              <w:left w:type="dxa" w:w="100"/>
+              <w:bottom w:type="dxa" w:w="60"/>
+              <w:right w:type="dxa" w:w="100"/>
+            </w:tcMar>
+            <w:vAlign w:val="center"/>
+          </w:tcPr>
+          <w:p>
+            <w:pPr>
+              <w:spacing w:line="240"/>
+              <w:jc w:val="left"/>
+            </w:pPr>
+            <w:r>
+              <w:rPr>
+                <w:rFonts w:ascii="Times New Roman" w:cs="Times New Roman" w:eastAsia="Times New Roman" w:hAnsi="Times New Roman"/>
+                <w:b w:val="false"/>
+                <w:bCs w:val="false"/>
+                <w:sz w:val="20"/>
+                <w:szCs w:val="20"/>
+              </w:rPr>
+              <w:t xml:space="preserve">Balanço lento da carroceria</w:t>
+            </w:r>
+          </w:p>
+        </w:tc>
+        <w:tc>
+          <w:tcPr>
+            <w:tcW w:type="dxa" w:w="1701"/>
+            <w:tcBorders>
+              <w:top w:val="single" w:color="000000" w:sz="4"/>
+              <w:left w:val="single" w:color="000000" w:sz="4"/>
+              <w:bottom w:val="single" w:color="000000" w:sz="4"/>
+              <w:right w:val="single" w:color="000000" w:sz="4"/>
+            </w:tcBorders>
+            <w:tcMar>
+              <w:top w:type="dxa" w:w="60"/>
+              <w:left w:type="dxa" w:w="100"/>
+              <w:bottom w:type="dxa" w:w="60"/>
+              <w:right w:type="dxa" w:w="100"/>
+            </w:tcMar>
+            <w:vAlign w:val="center"/>
+          </w:tcPr>
+          <w:p>
+            <w:pPr>
+              <w:spacing w:line="240"/>
+              <w:jc w:val="center"/>
+            </w:pPr>
+            <w:r>
+              <w:rPr>
+                <w:rFonts w:ascii="Times New Roman" w:cs="Times New Roman" w:eastAsia="Times New Roman" w:hAnsi="Times New Roman"/>
+                <w:b w:val="false"/>
+                <w:bCs w:val="false"/>
+                <w:sz w:val="20"/>
+                <w:szCs w:val="20"/>
+              </w:rPr>
+              <w:t xml:space="preserve">0,5 Hz</w:t>
+            </w:r>
+          </w:p>
+        </w:tc>
+        <w:tc>
+          <w:tcPr>
+            <w:tcW w:type="dxa" w:w="1701"/>
+            <w:tcBorders>
+              <w:top w:val="single" w:color="000000" w:sz="4"/>
+              <w:left w:val="single" w:color="000000" w:sz="4"/>
+              <w:bottom w:val="single" w:color="000000" w:sz="4"/>
+              <w:right w:val="single" w:color="000000" w:sz="4"/>
+            </w:tcBorders>
+            <w:tcMar>
+              <w:top w:type="dxa" w:w="60"/>
+              <w:left w:type="dxa" w:w="100"/>
+              <w:bottom w:type="dxa" w:w="60"/>
+              <w:right w:type="dxa" w:w="100"/>
+            </w:tcMar>
+            <w:vAlign w:val="center"/>
+          </w:tcPr>
+          <w:p>
+            <w:pPr>
+              <w:spacing w:line="240"/>
+              <w:jc w:val="center"/>
+            </w:pPr>
+            <w:r>
+              <w:rPr>
+                <w:rFonts w:ascii="Times New Roman" w:cs="Times New Roman" w:eastAsia="Times New Roman" w:hAnsi="Times New Roman"/>
+                <w:b w:val="false"/>
+                <w:bCs w:val="false"/>
+                <w:sz w:val="20"/>
+                <w:szCs w:val="20"/>
+              </w:rPr>
+              <w:t xml:space="preserve">≈7,6 mm</w:t>
+            </w:r>
+          </w:p>
+        </w:tc>
+        <w:tc>
+          <w:tcPr>
+            <w:tcW w:type="dxa" w:w="1701"/>
+            <w:tcBorders>
+              <w:top w:val="single" w:color="000000" w:sz="4"/>
+              <w:left w:val="single" w:color="000000" w:sz="4"/>
+              <w:bottom w:val="single" w:color="000000" w:sz="4"/>
+              <w:right w:val="single" w:color="000000" w:sz="4"/>
+            </w:tcBorders>
+            <w:tcMar>
+              <w:top w:type="dxa" w:w="60"/>
+              <w:left w:type="dxa" w:w="100"/>
+              <w:bottom w:type="dxa" w:w="60"/>
+              <w:right w:type="dxa" w:w="100"/>
+            </w:tcMar>
+            <w:vAlign w:val="center"/>
+          </w:tcPr>
+          <w:p>
+            <w:pPr>
+              <w:spacing w:line="240"/>
+              <w:jc w:val="center"/>
+            </w:pPr>
+            <w:r>
+              <w:rPr>
+                <w:rFonts w:ascii="Times New Roman" w:cs="Times New Roman" w:eastAsia="Times New Roman" w:hAnsi="Times New Roman"/>
+                <w:b w:val="false"/>
+                <w:bCs w:val="false"/>
+                <w:sz w:val="20"/>
+                <w:szCs w:val="20"/>
+              </w:rPr>
+              <w:t xml:space="preserve">≈33 mm</w:t>
+            </w:r>
+          </w:p>
+        </w:tc>
+        <w:tc>
+          <w:tcPr>
+            <w:tcW w:type="dxa" w:w="1701"/>
+            <w:tcBorders>
+              <w:top w:val="single" w:color="000000" w:sz="4"/>
+              <w:left w:val="single" w:color="000000" w:sz="4"/>
+              <w:bottom w:val="single" w:color="000000" w:sz="4"/>
+              <w:right w:val="single" w:color="000000" w:sz="4"/>
+            </w:tcBorders>
+            <w:tcMar>
+              <w:top w:type="dxa" w:w="60"/>
+              <w:left w:type="dxa" w:w="100"/>
+              <w:bottom w:type="dxa" w:w="60"/>
+              <w:right w:type="dxa" w:w="100"/>
+            </w:tcMar>
+            <w:vAlign w:val="center"/>
+          </w:tcPr>
+          <w:p>
+            <w:pPr>
+              <w:spacing w:line="240"/>
+              <w:jc w:val="center"/>
+            </w:pPr>
+            <w:r>
+              <w:rPr>
+                <w:rFonts w:ascii="Times New Roman" w:cs="Times New Roman" w:eastAsia="Times New Roman" w:hAnsi="Times New Roman"/>
+                <w:b w:val="false"/>
+                <w:bCs w:val="false"/>
+                <w:sz w:val="20"/>
+                <w:szCs w:val="20"/>
+              </w:rPr>
+              <w:t xml:space="preserve">≈41 mm</w:t>
+            </w:r>
+          </w:p>
+        </w:tc>
+      </w:tr>
+      <w:tr>
+        <w:trPr>
+          <w:tblHeader w:val="false"/>
+        </w:trPr>
+        <w:tc>
+          <w:tcPr>
+            <w:tcW w:type="dxa" w:w="2268"/>
+            <w:tcBorders>
+              <w:top w:val="single" w:color="000000" w:sz="4"/>
+              <w:left w:val="single" w:color="000000" w:sz="4"/>
+              <w:bottom w:val="single" w:color="000000" w:sz="4"/>
+              <w:right w:val="single" w:color="000000" w:sz="4"/>
+            </w:tcBorders>
+            <w:tcMar>
+              <w:top w:type="dxa" w:w="60"/>
+              <w:left w:type="dxa" w:w="100"/>
+              <w:bottom w:type="dxa" w:w="60"/>
+              <w:right w:type="dxa" w:w="100"/>
+            </w:tcMar>
+            <w:vAlign w:val="center"/>
+          </w:tcPr>
+          <w:p>
+            <w:pPr>
+              <w:spacing w:line="240"/>
+              <w:jc w:val="left"/>
+            </w:pPr>
+            <w:r>
+              <w:rPr>
+                <w:rFonts w:ascii="Times New Roman" w:cs="Times New Roman" w:eastAsia="Times New Roman" w:hAnsi="Times New Roman"/>
+                <w:b w:val="false"/>
+                <w:bCs w:val="false"/>
+                <w:sz w:val="20"/>
+                <w:szCs w:val="20"/>
+              </w:rPr>
+              <w:t xml:space="preserve">Balanço da carroceria/antena</w:t>
+            </w:r>
+          </w:p>
+        </w:tc>
+        <w:tc>
+          <w:tcPr>
+            <w:tcW w:type="dxa" w:w="1701"/>
+            <w:tcBorders>
+              <w:top w:val="single" w:color="000000" w:sz="4"/>
+              <w:left w:val="single" w:color="000000" w:sz="4"/>
+              <w:bottom w:val="single" w:color="000000" w:sz="4"/>
+              <w:right w:val="single" w:color="000000" w:sz="4"/>
+            </w:tcBorders>
+            <w:tcMar>
+              <w:top w:type="dxa" w:w="60"/>
+              <w:left w:type="dxa" w:w="100"/>
+              <w:bottom w:type="dxa" w:w="60"/>
+              <w:right w:type="dxa" w:w="100"/>
+            </w:tcMar>
+            <w:vAlign w:val="center"/>
+          </w:tcPr>
+          <w:p>
+            <w:pPr>
+              <w:spacing w:line="240"/>
+              <w:jc w:val="center"/>
+            </w:pPr>
+            <w:r>
+              <w:rPr>
+                <w:rFonts w:ascii="Times New Roman" w:cs="Times New Roman" w:eastAsia="Times New Roman" w:hAnsi="Times New Roman"/>
+                <w:b w:val="false"/>
+                <w:bCs w:val="false"/>
+                <w:sz w:val="20"/>
+                <w:szCs w:val="20"/>
+              </w:rPr>
+              <w:t xml:space="preserve">1 Hz</w:t>
+            </w:r>
+          </w:p>
+        </w:tc>
+        <w:tc>
+          <w:tcPr>
+            <w:tcW w:type="dxa" w:w="1701"/>
+            <w:tcBorders>
+              <w:top w:val="single" w:color="000000" w:sz="4"/>
+              <w:left w:val="single" w:color="000000" w:sz="4"/>
+              <w:bottom w:val="single" w:color="000000" w:sz="4"/>
+              <w:right w:val="single" w:color="000000" w:sz="4"/>
+            </w:tcBorders>
+            <w:tcMar>
+              <w:top w:type="dxa" w:w="60"/>
+              <w:left w:type="dxa" w:w="100"/>
+              <w:bottom w:type="dxa" w:w="60"/>
+              <w:right w:type="dxa" w:w="100"/>
+            </w:tcMar>
+            <w:vAlign w:val="center"/>
+          </w:tcPr>
+          <w:p>
+            <w:pPr>
+              <w:spacing w:line="240"/>
+              <w:jc w:val="center"/>
+            </w:pPr>
+            <w:r>
+              <w:rPr>
+                <w:rFonts w:ascii="Times New Roman" w:cs="Times New Roman" w:eastAsia="Times New Roman" w:hAnsi="Times New Roman"/>
+                <w:b w:val="false"/>
+                <w:bCs w:val="false"/>
+                <w:sz w:val="20"/>
+                <w:szCs w:val="20"/>
+              </w:rPr>
+              <w:t xml:space="preserve">≈2,1 mm</w:t>
+            </w:r>
+          </w:p>
+        </w:tc>
+        <w:tc>
+          <w:tcPr>
+            <w:tcW w:type="dxa" w:w="1701"/>
+            <w:tcBorders>
+              <w:top w:val="single" w:color="000000" w:sz="4"/>
+              <w:left w:val="single" w:color="000000" w:sz="4"/>
+              <w:bottom w:val="single" w:color="000000" w:sz="4"/>
+              <w:right w:val="single" w:color="000000" w:sz="4"/>
+            </w:tcBorders>
+            <w:tcMar>
+              <w:top w:type="dxa" w:w="60"/>
+              <w:left w:type="dxa" w:w="100"/>
+              <w:bottom w:type="dxa" w:w="60"/>
+              <w:right w:type="dxa" w:w="100"/>
+            </w:tcMar>
+            <w:vAlign w:val="center"/>
+          </w:tcPr>
+          <w:p>
+            <w:pPr>
+              <w:spacing w:line="240"/>
+              <w:jc w:val="center"/>
+            </w:pPr>
+            <w:r>
+              <w:rPr>
+                <w:rFonts w:ascii="Times New Roman" w:cs="Times New Roman" w:eastAsia="Times New Roman" w:hAnsi="Times New Roman"/>
+                <w:b w:val="false"/>
+                <w:bCs w:val="false"/>
+                <w:sz w:val="20"/>
+                <w:szCs w:val="20"/>
+              </w:rPr>
+              <w:t xml:space="preserve">≈9 mm</w:t>
+            </w:r>
+          </w:p>
+        </w:tc>
+        <w:tc>
+          <w:tcPr>
+            <w:tcW w:type="dxa" w:w="1701"/>
+            <w:tcBorders>
+              <w:top w:val="single" w:color="000000" w:sz="4"/>
+              <w:left w:val="single" w:color="000000" w:sz="4"/>
+              <w:bottom w:val="single" w:color="000000" w:sz="4"/>
+              <w:right w:val="single" w:color="000000" w:sz="4"/>
+            </w:tcBorders>
+            <w:tcMar>
+              <w:top w:type="dxa" w:w="60"/>
+              <w:left w:type="dxa" w:w="100"/>
+              <w:bottom w:type="dxa" w:w="60"/>
+              <w:right w:type="dxa" w:w="100"/>
+            </w:tcMar>
+            <w:vAlign w:val="center"/>
+          </w:tcPr>
+          <w:p>
+            <w:pPr>
+              <w:spacing w:line="240"/>
+              <w:jc w:val="center"/>
+            </w:pPr>
+            <w:r>
+              <w:rPr>
+                <w:rFonts w:ascii="Times New Roman" w:cs="Times New Roman" w:eastAsia="Times New Roman" w:hAnsi="Times New Roman"/>
+                <w:b w:val="false"/>
+                <w:bCs w:val="false"/>
+                <w:sz w:val="20"/>
+                <w:szCs w:val="20"/>
+              </w:rPr>
+              <w:t xml:space="preserve">≈11 mm</w:t>
+            </w:r>
+          </w:p>
+        </w:tc>
+      </w:tr>
+      <w:tr>
+        <w:trPr>
+          <w:tblHeader w:val="false"/>
+        </w:trPr>
+        <w:tc>
+          <w:tcPr>
+            <w:tcW w:type="dxa" w:w="2268"/>
+            <w:tcBorders>
+              <w:top w:val="single" w:color="000000" w:sz="4"/>
+              <w:left w:val="single" w:color="000000" w:sz="4"/>
+              <w:bottom w:val="single" w:color="000000" w:sz="4"/>
+              <w:right w:val="single" w:color="000000" w:sz="4"/>
+            </w:tcBorders>
+            <w:tcMar>
+              <w:top w:type="dxa" w:w="60"/>
+              <w:left w:type="dxa" w:w="100"/>
+              <w:bottom w:type="dxa" w:w="60"/>
+              <w:right w:type="dxa" w:w="100"/>
+            </w:tcMar>
+            <w:vAlign w:val="center"/>
+          </w:tcPr>
+          <w:p>
+            <w:pPr>
+              <w:spacing w:line="240"/>
+              <w:jc w:val="left"/>
+            </w:pPr>
+            <w:r>
+              <w:rPr>
+                <w:rFonts w:ascii="Times New Roman" w:cs="Times New Roman" w:eastAsia="Times New Roman" w:hAnsi="Times New Roman"/>
+                <w:b w:val="false"/>
+                <w:bCs w:val="false"/>
+                <w:sz w:val="20"/>
+                <w:szCs w:val="20"/>
+              </w:rPr>
+              <w:t xml:space="preserve">Flexão rápida da antena</w:t>
+            </w:r>
+          </w:p>
+        </w:tc>
+        <w:tc>
+          <w:tcPr>
+            <w:tcW w:type="dxa" w:w="1701"/>
+            <w:tcBorders>
+              <w:top w:val="single" w:color="000000" w:sz="4"/>
+              <w:left w:val="single" w:color="000000" w:sz="4"/>
+              <w:bottom w:val="single" w:color="000000" w:sz="4"/>
+              <w:right w:val="single" w:color="000000" w:sz="4"/>
+            </w:tcBorders>
+            <w:tcMar>
+              <w:top w:type="dxa" w:w="60"/>
+              <w:left w:type="dxa" w:w="100"/>
+              <w:bottom w:type="dxa" w:w="60"/>
+              <w:right w:type="dxa" w:w="100"/>
+            </w:tcMar>
+            <w:vAlign w:val="center"/>
+          </w:tcPr>
+          <w:p>
+            <w:pPr>
+              <w:spacing w:line="240"/>
+              <w:jc w:val="center"/>
+            </w:pPr>
+            <w:r>
+              <w:rPr>
+                <w:rFonts w:ascii="Times New Roman" w:cs="Times New Roman" w:eastAsia="Times New Roman" w:hAnsi="Times New Roman"/>
+                <w:b w:val="false"/>
+                <w:bCs w:val="false"/>
+                <w:sz w:val="20"/>
+                <w:szCs w:val="20"/>
+              </w:rPr>
+              <w:t xml:space="preserve">2 Hz</w:t>
+            </w:r>
+          </w:p>
+        </w:tc>
+        <w:tc>
+          <w:tcPr>
+            <w:tcW w:type="dxa" w:w="1701"/>
+            <w:tcBorders>
+              <w:top w:val="single" w:color="000000" w:sz="4"/>
+              <w:left w:val="single" w:color="000000" w:sz="4"/>
+              <w:bottom w:val="single" w:color="000000" w:sz="4"/>
+              <w:right w:val="single" w:color="000000" w:sz="4"/>
+            </w:tcBorders>
+            <w:tcMar>
+              <w:top w:type="dxa" w:w="60"/>
+              <w:left w:type="dxa" w:w="100"/>
+              <w:bottom w:type="dxa" w:w="60"/>
+              <w:right w:type="dxa" w:w="100"/>
+            </w:tcMar>
+            <w:vAlign w:val="center"/>
+          </w:tcPr>
+          <w:p>
+            <w:pPr>
+              <w:spacing w:line="240"/>
+              <w:jc w:val="center"/>
+            </w:pPr>
+            <w:r>
+              <w:rPr>
+                <w:rFonts w:ascii="Times New Roman" w:cs="Times New Roman" w:eastAsia="Times New Roman" w:hAnsi="Times New Roman"/>
+                <w:b w:val="false"/>
+                <w:bCs w:val="false"/>
+                <w:sz w:val="20"/>
+                <w:szCs w:val="20"/>
+              </w:rPr>
+              <w:t xml:space="preserve">≈0,5 mm</w:t>
+            </w:r>
+          </w:p>
+        </w:tc>
+        <w:tc>
+          <w:tcPr>
+            <w:tcW w:type="dxa" w:w="1701"/>
+            <w:tcBorders>
+              <w:top w:val="single" w:color="000000" w:sz="4"/>
+              <w:left w:val="single" w:color="000000" w:sz="4"/>
+              <w:bottom w:val="single" w:color="000000" w:sz="4"/>
+              <w:right w:val="single" w:color="000000" w:sz="4"/>
+            </w:tcBorders>
+            <w:tcMar>
+              <w:top w:type="dxa" w:w="60"/>
+              <w:left w:type="dxa" w:w="100"/>
+              <w:bottom w:type="dxa" w:w="60"/>
+              <w:right w:type="dxa" w:w="100"/>
+            </w:tcMar>
+            <w:vAlign w:val="center"/>
+          </w:tcPr>
+          <w:p>
+            <w:pPr>
+              <w:spacing w:line="240"/>
+              <w:jc w:val="center"/>
+            </w:pPr>
+            <w:r>
+              <w:rPr>
+                <w:rFonts w:ascii="Times New Roman" w:cs="Times New Roman" w:eastAsia="Times New Roman" w:hAnsi="Times New Roman"/>
+                <w:b w:val="false"/>
+                <w:bCs w:val="false"/>
+                <w:sz w:val="20"/>
+                <w:szCs w:val="20"/>
+              </w:rPr>
+              <w:t xml:space="preserve">≈2,3 mm</w:t>
+            </w:r>
+          </w:p>
+        </w:tc>
+        <w:tc>
+          <w:tcPr>
+            <w:tcW w:type="dxa" w:w="1701"/>
+            <w:tcBorders>
+              <w:top w:val="single" w:color="000000" w:sz="4"/>
+              <w:left w:val="single" w:color="000000" w:sz="4"/>
+              <w:bottom w:val="single" w:color="000000" w:sz="4"/>
+              <w:right w:val="single" w:color="000000" w:sz="4"/>
+            </w:tcBorders>
+            <w:tcMar>
+              <w:top w:type="dxa" w:w="60"/>
+              <w:left w:type="dxa" w:w="100"/>
+              <w:bottom w:type="dxa" w:w="60"/>
+              <w:right w:type="dxa" w:w="100"/>
+            </w:tcMar>
+            <w:vAlign w:val="center"/>
+          </w:tcPr>
+          <w:p>
+            <w:pPr>
+              <w:spacing w:line="240"/>
+              <w:jc w:val="center"/>
+            </w:pPr>
+            <w:r>
+              <w:rPr>
+                <w:rFonts w:ascii="Times New Roman" w:cs="Times New Roman" w:eastAsia="Times New Roman" w:hAnsi="Times New Roman"/>
+                <w:b w:val="false"/>
+                <w:bCs w:val="false"/>
+                <w:sz w:val="20"/>
+                <w:szCs w:val="20"/>
+              </w:rPr>
+              <w:t xml:space="preserve">≈2,9 mm</w:t>
+            </w:r>
+          </w:p>
+        </w:tc>
+      </w:tr>
+      <w:tr>
+        <w:trPr>
+          <w:tblHeader w:val="false"/>
+        </w:trPr>
+        <w:tc>
+          <w:tcPr>
+            <w:tcW w:type="dxa" w:w="2268"/>
+            <w:tcBorders>
+              <w:top w:val="single" w:color="000000" w:sz="4"/>
+              <w:left w:val="single" w:color="000000" w:sz="4"/>
+              <w:bottom w:val="single" w:color="000000" w:sz="4"/>
+              <w:right w:val="single" w:color="000000" w:sz="4"/>
+            </w:tcBorders>
+            <w:tcMar>
+              <w:top w:type="dxa" w:w="60"/>
+              <w:left w:type="dxa" w:w="100"/>
+              <w:bottom w:type="dxa" w:w="60"/>
+              <w:right w:type="dxa" w:w="100"/>
+            </w:tcMar>
+            <w:vAlign w:val="center"/>
+          </w:tcPr>
+          <w:p>
+            <w:pPr>
+              <w:spacing w:line="240"/>
+              <w:jc w:val="left"/>
+            </w:pPr>
+            <w:r>
+              <w:rPr>
+                <w:rFonts w:ascii="Times New Roman" w:cs="Times New Roman" w:eastAsia="Times New Roman" w:hAnsi="Times New Roman"/>
+                <w:b w:val="false"/>
+                <w:bCs w:val="false"/>
+                <w:sz w:val="20"/>
+                <w:szCs w:val="20"/>
+              </w:rPr>
+              <w:t xml:space="preserve">Vibração do motor</w:t>
+            </w:r>
+          </w:p>
+        </w:tc>
+        <w:tc>
+          <w:tcPr>
+            <w:tcW w:type="dxa" w:w="1701"/>
+            <w:tcBorders>
+              <w:top w:val="single" w:color="000000" w:sz="4"/>
+              <w:left w:val="single" w:color="000000" w:sz="4"/>
+              <w:bottom w:val="single" w:color="000000" w:sz="4"/>
+              <w:right w:val="single" w:color="000000" w:sz="4"/>
+            </w:tcBorders>
+            <w:tcMar>
+              <w:top w:type="dxa" w:w="60"/>
+              <w:left w:type="dxa" w:w="100"/>
+              <w:bottom w:type="dxa" w:w="60"/>
+              <w:right w:type="dxa" w:w="100"/>
+            </w:tcMar>
+            <w:vAlign w:val="center"/>
+          </w:tcPr>
+          <w:p>
+            <w:pPr>
+              <w:spacing w:line="240"/>
+              <w:jc w:val="center"/>
+            </w:pPr>
+            <w:r>
+              <w:rPr>
+                <w:rFonts w:ascii="Times New Roman" w:cs="Times New Roman" w:eastAsia="Times New Roman" w:hAnsi="Times New Roman"/>
+                <w:b w:val="false"/>
+                <w:bCs w:val="false"/>
+                <w:sz w:val="20"/>
+                <w:szCs w:val="20"/>
+              </w:rPr>
+              <w:t xml:space="preserve">17,63 Hz</w:t>
+            </w:r>
+          </w:p>
+        </w:tc>
+        <w:tc>
+          <w:tcPr>
+            <w:tcW w:type="dxa" w:w="1701"/>
+            <w:tcBorders>
+              <w:top w:val="single" w:color="000000" w:sz="4"/>
+              <w:left w:val="single" w:color="000000" w:sz="4"/>
+              <w:bottom w:val="single" w:color="000000" w:sz="4"/>
+              <w:right w:val="single" w:color="000000" w:sz="4"/>
+            </w:tcBorders>
+            <w:tcMar>
+              <w:top w:type="dxa" w:w="60"/>
+              <w:left w:type="dxa" w:w="100"/>
+              <w:bottom w:type="dxa" w:w="60"/>
+              <w:right w:type="dxa" w:w="100"/>
+            </w:tcMar>
+            <w:vAlign w:val="center"/>
+          </w:tcPr>
+          <w:p>
+            <w:pPr>
+              <w:spacing w:line="240"/>
+              <w:jc w:val="center"/>
+            </w:pPr>
+            <w:r>
+              <w:rPr>
+                <w:rFonts w:ascii="Times New Roman" w:cs="Times New Roman" w:eastAsia="Times New Roman" w:hAnsi="Times New Roman"/>
+                <w:b w:val="false"/>
+                <w:bCs w:val="false"/>
+                <w:sz w:val="20"/>
+                <w:szCs w:val="20"/>
+              </w:rPr>
+              <w:t xml:space="preserve">≈7 µm</w:t>
+            </w:r>
+          </w:p>
+        </w:tc>
+        <w:tc>
+          <w:tcPr>
+            <w:tcW w:type="dxa" w:w="1701"/>
+            <w:tcBorders>
+              <w:top w:val="single" w:color="000000" w:sz="4"/>
+              <w:left w:val="single" w:color="000000" w:sz="4"/>
+              <w:bottom w:val="single" w:color="000000" w:sz="4"/>
+              <w:right w:val="single" w:color="000000" w:sz="4"/>
+            </w:tcBorders>
+            <w:tcMar>
+              <w:top w:type="dxa" w:w="60"/>
+              <w:left w:type="dxa" w:w="100"/>
+              <w:bottom w:type="dxa" w:w="60"/>
+              <w:right w:type="dxa" w:w="100"/>
+            </w:tcMar>
+            <w:vAlign w:val="center"/>
+          </w:tcPr>
+          <w:p>
+            <w:pPr>
+              <w:spacing w:line="240"/>
+              <w:jc w:val="center"/>
+            </w:pPr>
+            <w:r>
+              <w:rPr>
+                <w:rFonts w:ascii="Times New Roman" w:cs="Times New Roman" w:eastAsia="Times New Roman" w:hAnsi="Times New Roman"/>
+                <w:b w:val="false"/>
+                <w:bCs w:val="false"/>
+                <w:sz w:val="20"/>
+                <w:szCs w:val="20"/>
+              </w:rPr>
+              <w:t xml:space="preserve">≈30 µm</w:t>
+            </w:r>
+          </w:p>
+        </w:tc>
+        <w:tc>
+          <w:tcPr>
+            <w:tcW w:type="dxa" w:w="1701"/>
+            <w:tcBorders>
+              <w:top w:val="single" w:color="000000" w:sz="4"/>
+              <w:left w:val="single" w:color="000000" w:sz="4"/>
+              <w:bottom w:val="single" w:color="000000" w:sz="4"/>
+              <w:right w:val="single" w:color="000000" w:sz="4"/>
+            </w:tcBorders>
+            <w:tcMar>
+              <w:top w:type="dxa" w:w="60"/>
+              <w:left w:type="dxa" w:w="100"/>
+              <w:bottom w:type="dxa" w:w="60"/>
+              <w:right w:type="dxa" w:w="100"/>
+            </w:tcMar>
+            <w:vAlign w:val="center"/>
+          </w:tcPr>
+          <w:p>
+            <w:pPr>
+              <w:spacing w:line="240"/>
+              <w:jc w:val="center"/>
+            </w:pPr>
+            <w:r>
+              <w:rPr>
+                <w:rFonts w:ascii="Times New Roman" w:cs="Times New Roman" w:eastAsia="Times New Roman" w:hAnsi="Times New Roman"/>
+                <w:b w:val="false"/>
+                <w:bCs w:val="false"/>
+                <w:sz w:val="20"/>
+                <w:szCs w:val="20"/>
+              </w:rPr>
+              <w:t xml:space="preserve">≈37 µm</w:t>
+            </w:r>
+          </w:p>
+        </w:tc>
+      </w:tr>
+    </w:tbl>
+    <w:p>
+      <w:pPr>
+        <w:spacing w:after="200" w:line="240"/>
+        <w:jc w:val="center"/>
+      </w:pPr>
+      <w:r>
+        <w:rPr>
+          <w:rFonts w:ascii="Times New Roman" w:cs="Times New Roman" w:eastAsia="Times New Roman" w:hAnsi="Times New Roman"/>
+          <w:sz w:val="20"/>
+          <w:szCs w:val="20"/>
+        </w:rPr>
+        <w:t xml:space="preserve">Fonte: elaborado pelo autor. Modelo de rotação rígida em torno da base: x ≈ θ/(1/L + (2πf)²/g), com g = 9,81 m/s². Na fase C, a leitura de ±0,5° a 0,5–1 Hz corresponde a 2 a 8 mm no topo.</w:t>
+      </w:r>
+    </w:p>
+    <w:p>
+      <w:pPr>
+        <w:spacing w:after="120" w:line="360"/>
+        <w:ind w:firstLine="709"/>
+        <w:jc w:val="both"/>
+      </w:pPr>
+      <w:r>
+        <w:rPr>
+          <w:rFonts w:ascii="Times New Roman" w:cs="Times New Roman" w:eastAsia="Times New Roman" w:hAnsi="Times New Roman"/>
+          <w:sz w:val="24"/>
+          <w:szCs w:val="24"/>
+        </w:rPr>
+        <w:t xml:space="preserve">Duas consequências práticas: (a) os ±2,5° da fase B não significam necessariamente que o topo da antena se deslocou 30 cm — se foram balanço de cerca de 1 Hz, o deslocamento real foi da ordem de 1 cm, e só a parcela estática (a viatura que fica inclinada com o peso de alguém sobre ela) corresponde à inclinação lida; (b) para medir a inclinação real da antena, devem-se usar leituras com o conjunto em repouso, ou médias de alguns segundos, nunca os extremos registrados durante o balanço.</w:t>
+      </w:r>
+    </w:p>
+    <w:p>
+      <w:pPr>
+        <w:pStyle w:val="Heading1"/>
+        <w:pageBreakBefore/>
+        <w:spacing w:after="240" w:before="240" w:line="360"/>
+      </w:pPr>
+      <w:r>
+        <w:rPr>
+          <w:rFonts w:ascii="Times New Roman" w:cs="Times New Roman" w:eastAsia="Times New Roman" w:hAnsi="Times New Roman"/>
+          <w:b/>
+          <w:bCs/>
+          <w:caps/>
+          <w:sz w:val="24"/>
+          <w:szCs w:val="24"/>
+        </w:rPr>
+        <w:t xml:space="preserve">3 Captura de vibração</w:t>
+      </w:r>
+    </w:p>
+    <w:p>
+      <w:pPr>
+        <w:keepNext/>
+        <w:keepLines/>
+        <w:spacing w:after="60" w:before="200" w:line="240"/>
+        <w:jc w:val="center"/>
+      </w:pPr>
+      <w:r>
+        <w:rPr>
+          <w:rFonts w:ascii="Times New Roman" w:cs="Times New Roman" w:eastAsia="Times New Roman" w:hAnsi="Times New Roman"/>
+          <w:sz w:val="20"/>
+          <w:szCs w:val="20"/>
+        </w:rPr>
+        <w:t xml:space="preserve">Tabela 6 — Resultados da captura de vibração</w:t>
       </w:r>
     </w:p>
     <w:tbl>
@@ -4537,7 +6476,7 @@
           <w:sz w:val="20"/>
           <w:szCs w:val="20"/>
         </w:rPr>
-        <w:t xml:space="preserve">Fonte: relatorio_vibracao_20261026_162213.pdf (início 16:22:11; 8 s configurados, 7,98 s efetivos; 60 Hz; 480 amostras).</w:t>
+        <w:t xml:space="preserve">Fonte: relatorio_vibracao_20261026_162213.pdf (início 16:22:11; 8 s configurados, 7,98 s efetivos; 60 Hz; 480 amostras; viatura com motor ligado, sensor na antena a 7 m).</w:t>
       </w:r>
     </w:p>
     <w:p>
@@ -4872,7 +6811,7 @@
           <w:sz w:val="24"/>
           <w:szCs w:val="24"/>
         </w:rPr>
-        <w:t xml:space="preserve">A inclinação tem um pico único e estreito em 17,63 Hz, com amplitude de 2,01° e 46 dB acima do ruído: é uma vibração periódica, estável durante os 8 s, e não ruído aleatório. A forma de onda (Figura 3) confirma uma oscilação regular, com picos variando de ciclo a ciclo — efeito esperado quando o período (56,7 ms) não é múltiplo do intervalo de amostragem (16,7 ms). Picos secundários menores aparecem em 22,3 Hz, 23,3 Hz e 24,7 Hz (0,17° a 0,35°).</w:t>
+        <w:t xml:space="preserve">A inclinação tem um pico único e estreito em 17,63 Hz, com amplitude de 2,01° e 46 dB acima do ruído: é uma vibração periódica, estável durante os 8 s, e não ruído aleatório — exatamente o tipo de assinatura de um motor funcionando em rotação constante. A forma de onda (Figura 3) confirma uma oscilação regular, com picos variando de ciclo a ciclo — efeito esperado quando o período (56,7 ms) não é múltiplo do intervalo de amostragem (16,7 ms). Picos secundários menores aparecem em 22,3 Hz, 23,3 Hz e 24,7 Hz (0,17° a 0,35°), compatíveis com outras ordens do motor ou com acessórios acionados por ele (alternador, ventilador).</w:t>
       </w:r>
     </w:p>
     <w:p>
@@ -4887,7 +6826,7 @@
           <w:sz w:val="24"/>
           <w:szCs w:val="24"/>
         </w:rPr>
-        <w:t xml:space="preserve">A média de −0,196° indica que o centro da oscilação estava levemente deslocado do zero calibrado — por exemplo, por uma pequena mudança de apoio após a calibração ou pela própria assimetria da vibração (mínimo de −2,96° contra máximo de +1,92°).</w:t>
+        <w:t xml:space="preserve">A média de −0,196° indica que o centro da oscilação estava levemente deslocado do zero calibrado — por exemplo, pela inclinação estática da viatura ou da antena no momento da captura, diferente da do momento da calibração, ou pela própria assimetria da vibração (mínimo de −2,96° contra máximo de +1,92°).</w:t>
       </w:r>
     </w:p>
     <w:p>
@@ -4918,7 +6857,7 @@
           <w:sz w:val="24"/>
           <w:szCs w:val="24"/>
         </w:rPr>
-        <w:t xml:space="preserve">O acelerômetro não distingue inclinação de aceleração linear: uma aceleração lateral a soma-se à gravidade e aparece como um ângulo de cerca de a/g radianos. A Tabela 5 compara as duas hipóteses para a oscilação medida.</w:t>
+        <w:t xml:space="preserve">O acelerômetro não distingue inclinação de aceleração linear: uma aceleração lateral a soma-se à gravidade e aparece como um ângulo de cerca de a/g radianos (Seção 2.4). A Tabela 7 compara as duas hipóteses para a oscilação medida.</w:t>
       </w:r>
     </w:p>
     <w:p>
@@ -4934,7 +6873,7 @@
           <w:sz w:val="20"/>
           <w:szCs w:val="20"/>
         </w:rPr>
-        <w:t xml:space="preserve">Tabela 5 — Duas interpretações da oscilação de 2,01° a 17,63 Hz</w:t>
+        <w:t xml:space="preserve">Tabela 7 — Duas interpretações da oscilação de 2,01° a 17,63 Hz</w:t>
       </w:r>
     </w:p>
     <w:tbl>
@@ -5346,7 +7285,7 @@
                 <w:sz w:val="20"/>
                 <w:szCs w:val="20"/>
               </w:rPr>
-              <w:t xml:space="preserve">≈431 rad/s² de aceleração angular</w:t>
+              <w:t xml:space="preserve">≈431 rad/s² de aceleração angular; ±25 cm no topo de 7 m a 17,63 Hz</w:t>
             </w:r>
           </w:p>
         </w:tc>
@@ -5419,7 +7358,7 @@
                 <w:sz w:val="20"/>
                 <w:szCs w:val="20"/>
               </w:rPr>
-              <w:t xml:space="preserve">Plausibilidade em bancada</w:t>
+              <w:t xml:space="preserve">Plausibilidade na antena</w:t>
             </w:r>
           </w:p>
         </w:tc>
@@ -5453,7 +7392,7 @@
                 <w:sz w:val="20"/>
                 <w:szCs w:val="20"/>
               </w:rPr>
-              <w:t xml:space="preserve">Muito baixa: seria um giro violento e audível</w:t>
+              <w:t xml:space="preserve">Nula: uma antena de 7 m não gira ±2° dezessete vezes por segundo</w:t>
             </w:r>
           </w:p>
         </w:tc>
@@ -5487,7 +7426,7 @@
                 <w:sz w:val="20"/>
                 <w:szCs w:val="20"/>
               </w:rPr>
-              <w:t xml:space="preserve">Alta: vibração típica de máquinas, ventiladores e bancadas</w:t>
+              <w:t xml:space="preserve">Alta: vibração do motor transmitida pelo chassi</w:t>
             </w:r>
           </w:p>
         </w:tc>
@@ -5519,7 +7458,7 @@
           <w:sz w:val="24"/>
           <w:szCs w:val="24"/>
         </w:rPr>
-        <w:t xml:space="preserve">A conclusão é que a oscilação registrada na inclinação é, com grande probabilidade, uma vibração mecânica do apoio — de dezenas de micrômetros — e não uma inclinação de 2° do conjunto. Para o ensaio do mastro isso é relevante: no topo de um mastro sob vento, a flexão angular (o que se quer medir) ocorre em frequências baixas, tipicamente de 1 a 5 Hz, enquanto vibrações acima de ~10 Hz tendem a ser acelerações de máquinas ou da estrutura, que o acelerômetro também lê como "inclinação".</w:t>
+        <w:t xml:space="preserve">A conclusão é que a oscilação registrada na inclinação é a vibração do motor chegando ao topo da antena como um movimento linear de dezenas de micrômetros, e não uma inclinação de 2° da antena. A confirmação independente vem do azimute (Seção 3.5): o giroscópio, que mede rotação de fato, não viu a vibração. Para o monitoramento da antena isso é relevante: a flexão angular que se quer medir ocorre em frequências baixas, tipicamente abaixo de 5 Hz, enquanto vibrações acima de ~10 Hz são acelerações do motor ou da estrutura, que o acelerômetro também lê como "inclinação".</w:t>
       </w:r>
     </w:p>
     <w:p>
@@ -5581,7 +7520,7 @@
           <w:sz w:val="24"/>
           <w:szCs w:val="24"/>
         </w:rPr>
-        <w:t xml:space="preserve">3.4 Azimute durante a vibração</w:t>
+        <w:t xml:space="preserve">3.4 Origem provável: o motor da viatura</w:t>
       </w:r>
     </w:p>
     <w:p>
@@ -5596,40 +7535,7 @@
           <w:sz w:val="24"/>
           <w:szCs w:val="24"/>
         </w:rPr>
-        <w:t xml:space="preserve">O azimute ficou praticamente imóvel: desvio padrão de 0,005° e pico a pico de 0,022°, com a mesma componente de 17,63 Hz em apenas 0,001°. Isso confirma que a vibração não é uma rotação em torno da vertical e dá a medida do piso de ruído do canal de azimute nesta captura. Os demais picos do espectro do azimute (0,3 a 0,5 Hz e 8,8 Hz) estão abaixo de 0,004° e correspondem ao resíduo da integração da velocidade angular depois da remoção de tendência; o pico de 8,8 Hz coincide com a metade de 17,63 Hz, o que sugere uma componente mecânica da mesma fonte.</w:t>
-      </w:r>
-    </w:p>
-    <w:p>
-      <w:pPr>
-        <w:pStyle w:val="Heading1"/>
-        <w:pageBreakBefore/>
-        <w:spacing w:after="240" w:before="240" w:line="360"/>
-      </w:pPr>
-      <w:r>
-        <w:rPr>
-          <w:rFonts w:ascii="Times New Roman" w:cs="Times New Roman" w:eastAsia="Times New Roman" w:hAnsi="Times New Roman"/>
-          <w:b/>
-          <w:bCs/>
-          <w:caps/>
-          <w:sz w:val="24"/>
-          <w:szCs w:val="24"/>
-        </w:rPr>
-        <w:t xml:space="preserve">4 Relação entre os dois relatórios</w:t>
-      </w:r>
-    </w:p>
-    <w:p>
-      <w:pPr>
-        <w:spacing w:after="120" w:line="360"/>
-        <w:ind w:firstLine="709"/>
-        <w:jc w:val="both"/>
-      </w:pPr>
-      <w:r>
-        <w:rPr>
-          <w:rFonts w:ascii="Times New Roman" w:cs="Times New Roman" w:eastAsia="Times New Roman" w:hAnsi="Times New Roman"/>
-          <w:sz w:val="24"/>
-          <w:szCs w:val="24"/>
-        </w:rPr>
-        <w:t xml:space="preserve">A captura de vibração começou 3 min 13 s depois do início da leitura contínua (16:22:11, contra 16:18:58), em outro momento. Os dois relatórios medem a mesma inclinação, mas por caminhos que reagem de modo oposto à vibração de alta frequência (Tabela 6).</w:t>
+        <w:t xml:space="preserve">A vibração de um motor de combustão aparece em frequências proporcionais à rotação: a 1ª ordem (desbalanceamento do virabrequim) em rpm/60 e a ordem de combustão — a mais forte em motores de quatro tempos — em (n/2)·rpm/60, onde n é o número de cilindros. A Tabela 8 mostra a rotação que cada hipótese exigiria.</w:t>
       </w:r>
     </w:p>
     <w:p>
@@ -5645,7 +7551,703 @@
           <w:sz w:val="20"/>
           <w:szCs w:val="20"/>
         </w:rPr>
-        <w:t xml:space="preserve">Tabela 6 — A mesma vibração de 2,01° a 17,63 Hz vista por cada caminho</w:t>
+        <w:t xml:space="preserve">Tabela 8 — Rotação do motor compatível com cada frequência</w:t>
+      </w:r>
+    </w:p>
+    <w:tbl>
+      <w:tblPr>
+        <w:tblW w:type="dxa" w:w="9074"/>
+        <w:tblBorders>
+          <w:top w:val="single" w:color="auto" w:sz="4"/>
+          <w:left w:val="single" w:color="auto" w:sz="4"/>
+          <w:bottom w:val="single" w:color="auto" w:sz="4"/>
+          <w:right w:val="single" w:color="auto" w:sz="4"/>
+          <w:insideH w:val="single" w:color="auto" w:sz="4"/>
+          <w:insideV w:val="single" w:color="auto" w:sz="4"/>
+        </w:tblBorders>
+      </w:tblPr>
+      <w:tblGrid>
+        <w:gridCol w:w="3119"/>
+        <w:gridCol w:w="1985"/>
+        <w:gridCol w:w="1985"/>
+        <w:gridCol w:w="1985"/>
+      </w:tblGrid>
+      <w:tr>
+        <w:trPr>
+          <w:tblHeader/>
+        </w:trPr>
+        <w:tc>
+          <w:tcPr>
+            <w:tcW w:type="dxa" w:w="3119"/>
+            <w:tcBorders>
+              <w:top w:val="single" w:color="000000" w:sz="4"/>
+              <w:left w:val="single" w:color="000000" w:sz="4"/>
+              <w:bottom w:val="single" w:color="000000" w:sz="4"/>
+              <w:right w:val="single" w:color="000000" w:sz="4"/>
+            </w:tcBorders>
+            <w:shd w:fill="D9D9D9" w:color="auto" w:val="clear"/>
+            <w:tcMar>
+              <w:top w:type="dxa" w:w="60"/>
+              <w:left w:type="dxa" w:w="100"/>
+              <w:bottom w:type="dxa" w:w="60"/>
+              <w:right w:type="dxa" w:w="100"/>
+            </w:tcMar>
+            <w:vAlign w:val="center"/>
+          </w:tcPr>
+          <w:p>
+            <w:pPr>
+              <w:spacing w:line="240"/>
+              <w:jc w:val="left"/>
+            </w:pPr>
+            <w:r>
+              <w:rPr>
+                <w:rFonts w:ascii="Times New Roman" w:cs="Times New Roman" w:eastAsia="Times New Roman" w:hAnsi="Times New Roman"/>
+                <w:b/>
+                <w:bCs/>
+                <w:sz w:val="20"/>
+                <w:szCs w:val="20"/>
+              </w:rPr>
+              <w:t xml:space="preserve">Componente do motor</w:t>
+            </w:r>
+          </w:p>
+        </w:tc>
+        <w:tc>
+          <w:tcPr>
+            <w:tcW w:type="dxa" w:w="1985"/>
+            <w:tcBorders>
+              <w:top w:val="single" w:color="000000" w:sz="4"/>
+              <w:left w:val="single" w:color="000000" w:sz="4"/>
+              <w:bottom w:val="single" w:color="000000" w:sz="4"/>
+              <w:right w:val="single" w:color="000000" w:sz="4"/>
+            </w:tcBorders>
+            <w:shd w:fill="D9D9D9" w:color="auto" w:val="clear"/>
+            <w:tcMar>
+              <w:top w:type="dxa" w:w="60"/>
+              <w:left w:type="dxa" w:w="100"/>
+              <w:bottom w:type="dxa" w:w="60"/>
+              <w:right w:type="dxa" w:w="100"/>
+            </w:tcMar>
+            <w:vAlign w:val="center"/>
+          </w:tcPr>
+          <w:p>
+            <w:pPr>
+              <w:spacing w:line="240"/>
+              <w:jc w:val="center"/>
+            </w:pPr>
+            <w:r>
+              <w:rPr>
+                <w:rFonts w:ascii="Times New Roman" w:cs="Times New Roman" w:eastAsia="Times New Roman" w:hAnsi="Times New Roman"/>
+                <w:b/>
+                <w:bCs/>
+                <w:sz w:val="20"/>
+                <w:szCs w:val="20"/>
+              </w:rPr>
+              <w:t xml:space="preserve">Ordem</w:t>
+            </w:r>
+          </w:p>
+        </w:tc>
+        <w:tc>
+          <w:tcPr>
+            <w:tcW w:type="dxa" w:w="1985"/>
+            <w:tcBorders>
+              <w:top w:val="single" w:color="000000" w:sz="4"/>
+              <w:left w:val="single" w:color="000000" w:sz="4"/>
+              <w:bottom w:val="single" w:color="000000" w:sz="4"/>
+              <w:right w:val="single" w:color="000000" w:sz="4"/>
+            </w:tcBorders>
+            <w:shd w:fill="D9D9D9" w:color="auto" w:val="clear"/>
+            <w:tcMar>
+              <w:top w:type="dxa" w:w="60"/>
+              <w:left w:type="dxa" w:w="100"/>
+              <w:bottom w:type="dxa" w:w="60"/>
+              <w:right w:type="dxa" w:w="100"/>
+            </w:tcMar>
+            <w:vAlign w:val="center"/>
+          </w:tcPr>
+          <w:p>
+            <w:pPr>
+              <w:spacing w:line="240"/>
+              <w:jc w:val="center"/>
+            </w:pPr>
+            <w:r>
+              <w:rPr>
+                <w:rFonts w:ascii="Times New Roman" w:cs="Times New Roman" w:eastAsia="Times New Roman" w:hAnsi="Times New Roman"/>
+                <w:b/>
+                <w:bCs/>
+                <w:sz w:val="20"/>
+                <w:szCs w:val="20"/>
+              </w:rPr>
+              <w:t xml:space="preserve">Se 17,63 Hz</w:t>
+            </w:r>
+          </w:p>
+        </w:tc>
+        <w:tc>
+          <w:tcPr>
+            <w:tcW w:type="dxa" w:w="1985"/>
+            <w:tcBorders>
+              <w:top w:val="single" w:color="000000" w:sz="4"/>
+              <w:left w:val="single" w:color="000000" w:sz="4"/>
+              <w:bottom w:val="single" w:color="000000" w:sz="4"/>
+              <w:right w:val="single" w:color="000000" w:sz="4"/>
+            </w:tcBorders>
+            <w:shd w:fill="D9D9D9" w:color="auto" w:val="clear"/>
+            <w:tcMar>
+              <w:top w:type="dxa" w:w="60"/>
+              <w:left w:type="dxa" w:w="100"/>
+              <w:bottom w:type="dxa" w:w="60"/>
+              <w:right w:type="dxa" w:w="100"/>
+            </w:tcMar>
+            <w:vAlign w:val="center"/>
+          </w:tcPr>
+          <w:p>
+            <w:pPr>
+              <w:spacing w:line="240"/>
+              <w:jc w:val="center"/>
+            </w:pPr>
+            <w:r>
+              <w:rPr>
+                <w:rFonts w:ascii="Times New Roman" w:cs="Times New Roman" w:eastAsia="Times New Roman" w:hAnsi="Times New Roman"/>
+                <w:b/>
+                <w:bCs/>
+                <w:sz w:val="20"/>
+                <w:szCs w:val="20"/>
+              </w:rPr>
+              <w:t xml:space="preserve">Se 42,37 Hz</w:t>
+            </w:r>
+          </w:p>
+        </w:tc>
+      </w:tr>
+      <w:tr>
+        <w:trPr>
+          <w:tblHeader w:val="false"/>
+        </w:trPr>
+        <w:tc>
+          <w:tcPr>
+            <w:tcW w:type="dxa" w:w="3119"/>
+            <w:tcBorders>
+              <w:top w:val="single" w:color="000000" w:sz="4"/>
+              <w:left w:val="single" w:color="000000" w:sz="4"/>
+              <w:bottom w:val="single" w:color="000000" w:sz="4"/>
+              <w:right w:val="single" w:color="000000" w:sz="4"/>
+            </w:tcBorders>
+            <w:tcMar>
+              <w:top w:type="dxa" w:w="60"/>
+              <w:left w:type="dxa" w:w="100"/>
+              <w:bottom w:type="dxa" w:w="60"/>
+              <w:right w:type="dxa" w:w="100"/>
+            </w:tcMar>
+            <w:vAlign w:val="center"/>
+          </w:tcPr>
+          <w:p>
+            <w:pPr>
+              <w:spacing w:line="240"/>
+              <w:jc w:val="left"/>
+            </w:pPr>
+            <w:r>
+              <w:rPr>
+                <w:rFonts w:ascii="Times New Roman" w:cs="Times New Roman" w:eastAsia="Times New Roman" w:hAnsi="Times New Roman"/>
+                <w:b w:val="false"/>
+                <w:bCs w:val="false"/>
+                <w:sz w:val="20"/>
+                <w:szCs w:val="20"/>
+              </w:rPr>
+              <w:t xml:space="preserve">Desbalanceamento do virabrequim</w:t>
+            </w:r>
+          </w:p>
+        </w:tc>
+        <w:tc>
+          <w:tcPr>
+            <w:tcW w:type="dxa" w:w="1985"/>
+            <w:tcBorders>
+              <w:top w:val="single" w:color="000000" w:sz="4"/>
+              <w:left w:val="single" w:color="000000" w:sz="4"/>
+              <w:bottom w:val="single" w:color="000000" w:sz="4"/>
+              <w:right w:val="single" w:color="000000" w:sz="4"/>
+            </w:tcBorders>
+            <w:tcMar>
+              <w:top w:type="dxa" w:w="60"/>
+              <w:left w:type="dxa" w:w="100"/>
+              <w:bottom w:type="dxa" w:w="60"/>
+              <w:right w:type="dxa" w:w="100"/>
+            </w:tcMar>
+            <w:vAlign w:val="center"/>
+          </w:tcPr>
+          <w:p>
+            <w:pPr>
+              <w:spacing w:line="240"/>
+              <w:jc w:val="center"/>
+            </w:pPr>
+            <w:r>
+              <w:rPr>
+                <w:rFonts w:ascii="Times New Roman" w:cs="Times New Roman" w:eastAsia="Times New Roman" w:hAnsi="Times New Roman"/>
+                <w:b w:val="false"/>
+                <w:bCs w:val="false"/>
+                <w:sz w:val="20"/>
+                <w:szCs w:val="20"/>
+              </w:rPr>
+              <w:t xml:space="preserve">1ª</w:t>
+            </w:r>
+          </w:p>
+        </w:tc>
+        <w:tc>
+          <w:tcPr>
+            <w:tcW w:type="dxa" w:w="1985"/>
+            <w:tcBorders>
+              <w:top w:val="single" w:color="000000" w:sz="4"/>
+              <w:left w:val="single" w:color="000000" w:sz="4"/>
+              <w:bottom w:val="single" w:color="000000" w:sz="4"/>
+              <w:right w:val="single" w:color="000000" w:sz="4"/>
+            </w:tcBorders>
+            <w:tcMar>
+              <w:top w:type="dxa" w:w="60"/>
+              <w:left w:type="dxa" w:w="100"/>
+              <w:bottom w:type="dxa" w:w="60"/>
+              <w:right w:type="dxa" w:w="100"/>
+            </w:tcMar>
+            <w:vAlign w:val="center"/>
+          </w:tcPr>
+          <w:p>
+            <w:pPr>
+              <w:spacing w:line="240"/>
+              <w:jc w:val="center"/>
+            </w:pPr>
+            <w:r>
+              <w:rPr>
+                <w:rFonts w:ascii="Times New Roman" w:cs="Times New Roman" w:eastAsia="Times New Roman" w:hAnsi="Times New Roman"/>
+                <w:b w:val="false"/>
+                <w:bCs w:val="false"/>
+                <w:sz w:val="20"/>
+                <w:szCs w:val="20"/>
+              </w:rPr>
+              <w:t xml:space="preserve">≈1060 rpm</w:t>
+            </w:r>
+          </w:p>
+        </w:tc>
+        <w:tc>
+          <w:tcPr>
+            <w:tcW w:type="dxa" w:w="1985"/>
+            <w:tcBorders>
+              <w:top w:val="single" w:color="000000" w:sz="4"/>
+              <w:left w:val="single" w:color="000000" w:sz="4"/>
+              <w:bottom w:val="single" w:color="000000" w:sz="4"/>
+              <w:right w:val="single" w:color="000000" w:sz="4"/>
+            </w:tcBorders>
+            <w:tcMar>
+              <w:top w:type="dxa" w:w="60"/>
+              <w:left w:type="dxa" w:w="100"/>
+              <w:bottom w:type="dxa" w:w="60"/>
+              <w:right w:type="dxa" w:w="100"/>
+            </w:tcMar>
+            <w:vAlign w:val="center"/>
+          </w:tcPr>
+          <w:p>
+            <w:pPr>
+              <w:spacing w:line="240"/>
+              <w:jc w:val="center"/>
+            </w:pPr>
+            <w:r>
+              <w:rPr>
+                <w:rFonts w:ascii="Times New Roman" w:cs="Times New Roman" w:eastAsia="Times New Roman" w:hAnsi="Times New Roman"/>
+                <w:b w:val="false"/>
+                <w:bCs w:val="false"/>
+                <w:sz w:val="20"/>
+                <w:szCs w:val="20"/>
+              </w:rPr>
+              <w:t xml:space="preserve">≈2540 rpm</w:t>
+            </w:r>
+          </w:p>
+        </w:tc>
+      </w:tr>
+      <w:tr>
+        <w:trPr>
+          <w:tblHeader w:val="false"/>
+        </w:trPr>
+        <w:tc>
+          <w:tcPr>
+            <w:tcW w:type="dxa" w:w="3119"/>
+            <w:tcBorders>
+              <w:top w:val="single" w:color="000000" w:sz="4"/>
+              <w:left w:val="single" w:color="000000" w:sz="4"/>
+              <w:bottom w:val="single" w:color="000000" w:sz="4"/>
+              <w:right w:val="single" w:color="000000" w:sz="4"/>
+            </w:tcBorders>
+            <w:tcMar>
+              <w:top w:type="dxa" w:w="60"/>
+              <w:left w:type="dxa" w:w="100"/>
+              <w:bottom w:type="dxa" w:w="60"/>
+              <w:right w:type="dxa" w:w="100"/>
+            </w:tcMar>
+            <w:vAlign w:val="center"/>
+          </w:tcPr>
+          <w:p>
+            <w:pPr>
+              <w:spacing w:line="240"/>
+              <w:jc w:val="left"/>
+            </w:pPr>
+            <w:r>
+              <w:rPr>
+                <w:rFonts w:ascii="Times New Roman" w:cs="Times New Roman" w:eastAsia="Times New Roman" w:hAnsi="Times New Roman"/>
+                <w:b w:val="false"/>
+                <w:bCs w:val="false"/>
+                <w:sz w:val="20"/>
+                <w:szCs w:val="20"/>
+              </w:rPr>
+              <w:t xml:space="preserve">Combustão, motor de 4 cilindros</w:t>
+            </w:r>
+          </w:p>
+        </w:tc>
+        <w:tc>
+          <w:tcPr>
+            <w:tcW w:type="dxa" w:w="1985"/>
+            <w:tcBorders>
+              <w:top w:val="single" w:color="000000" w:sz="4"/>
+              <w:left w:val="single" w:color="000000" w:sz="4"/>
+              <w:bottom w:val="single" w:color="000000" w:sz="4"/>
+              <w:right w:val="single" w:color="000000" w:sz="4"/>
+            </w:tcBorders>
+            <w:tcMar>
+              <w:top w:type="dxa" w:w="60"/>
+              <w:left w:type="dxa" w:w="100"/>
+              <w:bottom w:type="dxa" w:w="60"/>
+              <w:right w:type="dxa" w:w="100"/>
+            </w:tcMar>
+            <w:vAlign w:val="center"/>
+          </w:tcPr>
+          <w:p>
+            <w:pPr>
+              <w:spacing w:line="240"/>
+              <w:jc w:val="center"/>
+            </w:pPr>
+            <w:r>
+              <w:rPr>
+                <w:rFonts w:ascii="Times New Roman" w:cs="Times New Roman" w:eastAsia="Times New Roman" w:hAnsi="Times New Roman"/>
+                <w:b w:val="false"/>
+                <w:bCs w:val="false"/>
+                <w:sz w:val="20"/>
+                <w:szCs w:val="20"/>
+              </w:rPr>
+              <w:t xml:space="preserve">2ª</w:t>
+            </w:r>
+          </w:p>
+        </w:tc>
+        <w:tc>
+          <w:tcPr>
+            <w:tcW w:type="dxa" w:w="1985"/>
+            <w:tcBorders>
+              <w:top w:val="single" w:color="000000" w:sz="4"/>
+              <w:left w:val="single" w:color="000000" w:sz="4"/>
+              <w:bottom w:val="single" w:color="000000" w:sz="4"/>
+              <w:right w:val="single" w:color="000000" w:sz="4"/>
+            </w:tcBorders>
+            <w:tcMar>
+              <w:top w:type="dxa" w:w="60"/>
+              <w:left w:type="dxa" w:w="100"/>
+              <w:bottom w:type="dxa" w:w="60"/>
+              <w:right w:type="dxa" w:w="100"/>
+            </w:tcMar>
+            <w:vAlign w:val="center"/>
+          </w:tcPr>
+          <w:p>
+            <w:pPr>
+              <w:spacing w:line="240"/>
+              <w:jc w:val="center"/>
+            </w:pPr>
+            <w:r>
+              <w:rPr>
+                <w:rFonts w:ascii="Times New Roman" w:cs="Times New Roman" w:eastAsia="Times New Roman" w:hAnsi="Times New Roman"/>
+                <w:b w:val="false"/>
+                <w:bCs w:val="false"/>
+                <w:sz w:val="20"/>
+                <w:szCs w:val="20"/>
+              </w:rPr>
+              <w:t xml:space="preserve">≈530 rpm</w:t>
+            </w:r>
+          </w:p>
+        </w:tc>
+        <w:tc>
+          <w:tcPr>
+            <w:tcW w:type="dxa" w:w="1985"/>
+            <w:tcBorders>
+              <w:top w:val="single" w:color="000000" w:sz="4"/>
+              <w:left w:val="single" w:color="000000" w:sz="4"/>
+              <w:bottom w:val="single" w:color="000000" w:sz="4"/>
+              <w:right w:val="single" w:color="000000" w:sz="4"/>
+            </w:tcBorders>
+            <w:tcMar>
+              <w:top w:type="dxa" w:w="60"/>
+              <w:left w:type="dxa" w:w="100"/>
+              <w:bottom w:type="dxa" w:w="60"/>
+              <w:right w:type="dxa" w:w="100"/>
+            </w:tcMar>
+            <w:vAlign w:val="center"/>
+          </w:tcPr>
+          <w:p>
+            <w:pPr>
+              <w:spacing w:line="240"/>
+              <w:jc w:val="center"/>
+            </w:pPr>
+            <w:r>
+              <w:rPr>
+                <w:rFonts w:ascii="Times New Roman" w:cs="Times New Roman" w:eastAsia="Times New Roman" w:hAnsi="Times New Roman"/>
+                <w:b w:val="false"/>
+                <w:bCs w:val="false"/>
+                <w:sz w:val="20"/>
+                <w:szCs w:val="20"/>
+              </w:rPr>
+              <w:t xml:space="preserve">≈1270 rpm</w:t>
+            </w:r>
+          </w:p>
+        </w:tc>
+      </w:tr>
+      <w:tr>
+        <w:trPr>
+          <w:tblHeader w:val="false"/>
+        </w:trPr>
+        <w:tc>
+          <w:tcPr>
+            <w:tcW w:type="dxa" w:w="3119"/>
+            <w:tcBorders>
+              <w:top w:val="single" w:color="000000" w:sz="4"/>
+              <w:left w:val="single" w:color="000000" w:sz="4"/>
+              <w:bottom w:val="single" w:color="000000" w:sz="4"/>
+              <w:right w:val="single" w:color="000000" w:sz="4"/>
+            </w:tcBorders>
+            <w:tcMar>
+              <w:top w:type="dxa" w:w="60"/>
+              <w:left w:type="dxa" w:w="100"/>
+              <w:bottom w:type="dxa" w:w="60"/>
+              <w:right w:type="dxa" w:w="100"/>
+            </w:tcMar>
+            <w:vAlign w:val="center"/>
+          </w:tcPr>
+          <w:p>
+            <w:pPr>
+              <w:spacing w:line="240"/>
+              <w:jc w:val="left"/>
+            </w:pPr>
+            <w:r>
+              <w:rPr>
+                <w:rFonts w:ascii="Times New Roman" w:cs="Times New Roman" w:eastAsia="Times New Roman" w:hAnsi="Times New Roman"/>
+                <w:b w:val="false"/>
+                <w:bCs w:val="false"/>
+                <w:sz w:val="20"/>
+                <w:szCs w:val="20"/>
+              </w:rPr>
+              <w:t xml:space="preserve">Combustão, motor de 6 cilindros</w:t>
+            </w:r>
+          </w:p>
+        </w:tc>
+        <w:tc>
+          <w:tcPr>
+            <w:tcW w:type="dxa" w:w="1985"/>
+            <w:tcBorders>
+              <w:top w:val="single" w:color="000000" w:sz="4"/>
+              <w:left w:val="single" w:color="000000" w:sz="4"/>
+              <w:bottom w:val="single" w:color="000000" w:sz="4"/>
+              <w:right w:val="single" w:color="000000" w:sz="4"/>
+            </w:tcBorders>
+            <w:tcMar>
+              <w:top w:type="dxa" w:w="60"/>
+              <w:left w:type="dxa" w:w="100"/>
+              <w:bottom w:type="dxa" w:w="60"/>
+              <w:right w:type="dxa" w:w="100"/>
+            </w:tcMar>
+            <w:vAlign w:val="center"/>
+          </w:tcPr>
+          <w:p>
+            <w:pPr>
+              <w:spacing w:line="240"/>
+              <w:jc w:val="center"/>
+            </w:pPr>
+            <w:r>
+              <w:rPr>
+                <w:rFonts w:ascii="Times New Roman" w:cs="Times New Roman" w:eastAsia="Times New Roman" w:hAnsi="Times New Roman"/>
+                <w:b w:val="false"/>
+                <w:bCs w:val="false"/>
+                <w:sz w:val="20"/>
+                <w:szCs w:val="20"/>
+              </w:rPr>
+              <w:t xml:space="preserve">3ª</w:t>
+            </w:r>
+          </w:p>
+        </w:tc>
+        <w:tc>
+          <w:tcPr>
+            <w:tcW w:type="dxa" w:w="1985"/>
+            <w:tcBorders>
+              <w:top w:val="single" w:color="000000" w:sz="4"/>
+              <w:left w:val="single" w:color="000000" w:sz="4"/>
+              <w:bottom w:val="single" w:color="000000" w:sz="4"/>
+              <w:right w:val="single" w:color="000000" w:sz="4"/>
+            </w:tcBorders>
+            <w:tcMar>
+              <w:top w:type="dxa" w:w="60"/>
+              <w:left w:type="dxa" w:w="100"/>
+              <w:bottom w:type="dxa" w:w="60"/>
+              <w:right w:type="dxa" w:w="100"/>
+            </w:tcMar>
+            <w:vAlign w:val="center"/>
+          </w:tcPr>
+          <w:p>
+            <w:pPr>
+              <w:spacing w:line="240"/>
+              <w:jc w:val="center"/>
+            </w:pPr>
+            <w:r>
+              <w:rPr>
+                <w:rFonts w:ascii="Times New Roman" w:cs="Times New Roman" w:eastAsia="Times New Roman" w:hAnsi="Times New Roman"/>
+                <w:b w:val="false"/>
+                <w:bCs w:val="false"/>
+                <w:sz w:val="20"/>
+                <w:szCs w:val="20"/>
+              </w:rPr>
+              <w:t xml:space="preserve">≈350 rpm</w:t>
+            </w:r>
+          </w:p>
+        </w:tc>
+        <w:tc>
+          <w:tcPr>
+            <w:tcW w:type="dxa" w:w="1985"/>
+            <w:tcBorders>
+              <w:top w:val="single" w:color="000000" w:sz="4"/>
+              <w:left w:val="single" w:color="000000" w:sz="4"/>
+              <w:bottom w:val="single" w:color="000000" w:sz="4"/>
+              <w:right w:val="single" w:color="000000" w:sz="4"/>
+            </w:tcBorders>
+            <w:tcMar>
+              <w:top w:type="dxa" w:w="60"/>
+              <w:left w:type="dxa" w:w="100"/>
+              <w:bottom w:type="dxa" w:w="60"/>
+              <w:right w:type="dxa" w:w="100"/>
+            </w:tcMar>
+            <w:vAlign w:val="center"/>
+          </w:tcPr>
+          <w:p>
+            <w:pPr>
+              <w:spacing w:line="240"/>
+              <w:jc w:val="center"/>
+            </w:pPr>
+            <w:r>
+              <w:rPr>
+                <w:rFonts w:ascii="Times New Roman" w:cs="Times New Roman" w:eastAsia="Times New Roman" w:hAnsi="Times New Roman"/>
+                <w:b w:val="false"/>
+                <w:bCs w:val="false"/>
+                <w:sz w:val="20"/>
+                <w:szCs w:val="20"/>
+              </w:rPr>
+              <w:t xml:space="preserve">≈850 rpm</w:t>
+            </w:r>
+          </w:p>
+        </w:tc>
+      </w:tr>
+    </w:tbl>
+    <w:p>
+      <w:pPr>
+        <w:spacing w:after="200" w:line="240"/>
+        <w:jc w:val="center"/>
+      </w:pPr>
+      <w:r>
+        <w:rPr>
+          <w:rFonts w:ascii="Times New Roman" w:cs="Times New Roman" w:eastAsia="Times New Roman" w:hAnsi="Times New Roman"/>
+          <w:sz w:val="20"/>
+          <w:szCs w:val="20"/>
+        </w:rPr>
+        <w:t xml:space="preserve">Fonte: elaborado pelo autor. rpm = 60·f/ordem.</w:t>
+      </w:r>
+    </w:p>
+    <w:p>
+      <w:pPr>
+        <w:spacing w:after="120" w:line="360"/>
+        <w:ind w:firstLine="709"/>
+        <w:jc w:val="both"/>
+      </w:pPr>
+      <w:r>
+        <w:rPr>
+          <w:rFonts w:ascii="Times New Roman" w:cs="Times New Roman" w:eastAsia="Times New Roman" w:hAnsi="Times New Roman"/>
+          <w:sz w:val="24"/>
+          <w:szCs w:val="24"/>
+        </w:rPr>
+        <w:t xml:space="preserve">Com a viatura parada em marcha lenta (tipicamente 600 a 900 rpm em motores diesel, mais alta quando há marcha lenta acelerada para alimentar equipamentos), a hipótese mais coerente é a de 42,37 Hz: a ordem de combustão de um motor de 6 cilindros a ≈850 rpm, ou de 4 cilindros em marcha lenta acelerada a ≈1270 rpm. A leitura de 17,63 Hz como frequência real só se explicaria pela 1ª ordem a ≈1060 rpm ou por uma ressonância da própria antena excitada pelo motor. Esse argumento reforça a suspeita de rebatimento da Seção 3.3, mas não a prova: a confirmação exige uma nova captura a 200 Hz ou mais com a rotação do motor anotada no tacômetro.</w:t>
+      </w:r>
+    </w:p>
+    <w:p>
+      <w:pPr>
+        <w:pStyle w:val="Heading2"/>
+        <w:spacing w:after="120" w:before="240" w:line="360"/>
+      </w:pPr>
+      <w:r>
+        <w:rPr>
+          <w:rFonts w:ascii="Times New Roman" w:cs="Times New Roman" w:eastAsia="Times New Roman" w:hAnsi="Times New Roman"/>
+          <w:b/>
+          <w:bCs/>
+          <w:sz w:val="24"/>
+          <w:szCs w:val="24"/>
+        </w:rPr>
+        <w:t xml:space="preserve">3.5 Azimute durante a vibração</w:t>
+      </w:r>
+    </w:p>
+    <w:p>
+      <w:pPr>
+        <w:spacing w:after="120" w:line="360"/>
+        <w:ind w:firstLine="709"/>
+        <w:jc w:val="both"/>
+      </w:pPr>
+      <w:r>
+        <w:rPr>
+          <w:rFonts w:ascii="Times New Roman" w:cs="Times New Roman" w:eastAsia="Times New Roman" w:hAnsi="Times New Roman"/>
+          <w:sz w:val="24"/>
+          <w:szCs w:val="24"/>
+        </w:rPr>
+        <w:t xml:space="preserve">O azimute ficou praticamente imóvel: desvio padrão de 0,005° e pico a pico de 0,022°, com a mesma componente de 17,63 Hz em apenas 0,001°. Isso confirma que a vibração do motor não é uma rotação em torno da vertical e dá a medida do piso de ruído do canal de azimute nesta captura, já com o motor ligado. Os demais picos do espectro do azimute (0,3 a 0,5 Hz e 8,8 Hz) estão abaixo de 0,004° e correspondem ao resíduo da integração da velocidade angular depois da remoção de tendência; o pico de 8,8 Hz coincide com a metade de 17,63 Hz, o que sugere uma componente mecânica da mesma fonte.</w:t>
+      </w:r>
+    </w:p>
+    <w:p>
+      <w:pPr>
+        <w:pStyle w:val="Heading1"/>
+        <w:pageBreakBefore/>
+        <w:spacing w:after="240" w:before="240" w:line="360"/>
+      </w:pPr>
+      <w:r>
+        <w:rPr>
+          <w:rFonts w:ascii="Times New Roman" w:cs="Times New Roman" w:eastAsia="Times New Roman" w:hAnsi="Times New Roman"/>
+          <w:b/>
+          <w:bCs/>
+          <w:caps/>
+          <w:sz w:val="24"/>
+          <w:szCs w:val="24"/>
+        </w:rPr>
+        <w:t xml:space="preserve">4 Relação entre os dois relatórios</w:t>
+      </w:r>
+    </w:p>
+    <w:p>
+      <w:pPr>
+        <w:spacing w:after="120" w:line="360"/>
+        <w:ind w:firstLine="709"/>
+        <w:jc w:val="both"/>
+      </w:pPr>
+      <w:r>
+        <w:rPr>
+          <w:rFonts w:ascii="Times New Roman" w:cs="Times New Roman" w:eastAsia="Times New Roman" w:hAnsi="Times New Roman"/>
+          <w:sz w:val="24"/>
+          <w:szCs w:val="24"/>
+        </w:rPr>
+        <w:t xml:space="preserve">A captura de vibração começou 3 min 13 s depois do início da leitura contínua (16:22:11, contra 16:18:58), em outro momento, com o motor ainda ligado. Os dois relatórios medem a mesma inclinação, mas por caminhos que reagem de modo oposto à vibração de alta frequência (Tabela 9).</w:t>
+      </w:r>
+    </w:p>
+    <w:p>
+      <w:pPr>
+        <w:keepNext/>
+        <w:keepLines/>
+        <w:spacing w:after="60" w:before="200" w:line="240"/>
+        <w:jc w:val="center"/>
+      </w:pPr>
+      <w:r>
+        <w:rPr>
+          <w:rFonts w:ascii="Times New Roman" w:cs="Times New Roman" w:eastAsia="Times New Roman" w:hAnsi="Times New Roman"/>
+          <w:sz w:val="20"/>
+          <w:szCs w:val="20"/>
+        </w:rPr>
+        <w:t xml:space="preserve">Tabela 9 — A mesma vibração de 2,01° a 17,63 Hz vista por cada caminho</w:t>
       </w:r>
     </w:p>
     <w:tbl>
@@ -5877,7 +8479,7 @@
                 <w:sz w:val="20"/>
                 <w:szCs w:val="20"/>
               </w:rPr>
-              <w:t xml:space="preserve">Leitura estável, sem tremular</w:t>
+              <w:t xml:space="preserve">Leitura estável, sem tremular, mesmo com o motor ligado</w:t>
             </w:r>
           </w:p>
         </w:tc>
@@ -5950,7 +8552,7 @@
                 <w:sz w:val="20"/>
                 <w:szCs w:val="20"/>
               </w:rPr>
-              <w:t xml:space="preserve">≈±0,34° (17% da amplitude, filtro de 3 Hz)</w:t>
+              <w:t xml:space="preserve">≈±0,34° (17% da amplitude, filtro de 3 Hz); ≈±0,14° se a frequência real for 42,37 Hz</w:t>
             </w:r>
           </w:p>
         </w:tc>
@@ -5984,7 +8586,7 @@
                 <w:sz w:val="20"/>
                 <w:szCs w:val="20"/>
               </w:rPr>
-              <w:t xml:space="preserve">Não explica os ±2,5° da fase B, que foram movimento lento</w:t>
+              <w:t xml:space="preserve">Explica boa parte dos ±0,5° da fase A; não explica os ±2,5° da fase B, que foram o embarque e desembarque</w:t>
             </w:r>
           </w:p>
         </w:tc>
@@ -6091,7 +8693,7 @@
                 <w:sz w:val="20"/>
                 <w:szCs w:val="20"/>
               </w:rPr>
-              <w:t xml:space="preserve">É o único caminho para caracterizar vibração</w:t>
+              <w:t xml:space="preserve">É o único caminho para caracterizar a vibração do motor</w:t>
             </w:r>
           </w:p>
         </w:tc>
@@ -6108,7 +8710,7 @@
           <w:sz w:val="20"/>
           <w:szCs w:val="20"/>
         </w:rPr>
-        <w:t xml:space="preserve">Fonte: elaborado pelo autor. Atenuação de 1/√(1+(17,63/3)²) ≈ 0,17 para o filtro de 3 Hz.</w:t>
+        <w:t xml:space="preserve">Fonte: elaborado pelo autor. Atenuação de 1/√(1+(f/3)²) para o filtro de 3 Hz: ≈0,17 a 17,63 Hz e ≈0,07 a 42,37 Hz.</w:t>
       </w:r>
     </w:p>
     <w:p>
@@ -6123,7 +8725,7 @@
           <w:sz w:val="24"/>
           <w:szCs w:val="24"/>
         </w:rPr>
-        <w:t xml:space="preserve">Isso explica por que a leitura contínua pode parecer "calma" enquanto há vibração no apoio, e por que os seus extremos devem ser lidos como deslocamentos de baixa frequência. Quem quiser saber se existe vibração deve usar o Modo Vibração.</w:t>
+        <w:t xml:space="preserve">Isso explica por que a leitura contínua pode parecer "calma" enquanto o motor faz a antena vibrar, e por que os seus extremos devem ser lidos como movimentos de baixa frequência somados a uma pequena parcela fixa do motor. Quem quiser saber se existe vibração deve usar o Modo Vibração.</w:t>
       </w:r>
     </w:p>
     <w:p>
@@ -6156,7 +8758,7 @@
           <w:sz w:val="24"/>
           <w:szCs w:val="24"/>
         </w:rPr>
-        <w:t xml:space="preserve">Os dados mostram um sistema funcionando conforme projetado: inclinação estável em repouso, extremos coerentes com os movimentos aplicados, azimute sem deriva e captura de vibração com espectro limpo e alta relação sinal-ruído. Os pontos que pedem atenção são de interpretação e de método de ensaio, não de defeito:</w:t>
+        <w:t xml:space="preserve">Os dados mostram um sistema funcionando conforme projetado numa condição real exigente — sensor a 7 m de altura, numa viatura com o motor ligado e com pessoas embarcando: inclinação estável em repouso, extremos coerentes com os movimentos ocorridos, azimute sem deriva e captura de vibração com espectro limpo e alta relação sinal-ruído. Os pontos que pedem atenção são de interpretação e de método de ensaio, não de defeito:</w:t>
       </w:r>
     </w:p>
     <w:p>
@@ -6177,15 +8779,15 @@
           <w:sz w:val="24"/>
           <w:szCs w:val="24"/>
         </w:rPr>
-        <w:t xml:space="preserve">A oscilação de 2,01° na captura de vibração não deve ser lida como inclinação real. </w:t>
-      </w:r>
-      <w:r>
-        <w:rPr>
-          <w:rFonts w:ascii="Times New Roman" w:cs="Times New Roman" w:eastAsia="Times New Roman" w:hAnsi="Times New Roman"/>
-          <w:sz w:val="24"/>
-          <w:szCs w:val="24"/>
-        </w:rPr>
-        <w:t xml:space="preserve">Com grande probabilidade é uma vibração linear do apoio, de dezenas de micrômetros (Seção 3.2).</w:t>
+        <w:t xml:space="preserve">A oscilação de 2,01° na captura de vibração não é inclinação real da antena. </w:t>
+      </w:r>
+      <w:r>
+        <w:rPr>
+          <w:rFonts w:ascii="Times New Roman" w:cs="Times New Roman" w:eastAsia="Times New Roman" w:hAnsi="Times New Roman"/>
+          <w:sz w:val="24"/>
+          <w:szCs w:val="24"/>
+        </w:rPr>
+        <w:t xml:space="preserve">É a vibração do motor transmitida ao topo, um movimento linear de dezenas de micrômetros lido pelo acelerômetro como ângulo (Seções 3.2 e 3.4).</w:t>
       </w:r>
     </w:p>
     <w:p>
@@ -6214,7 +8816,7 @@
           <w:sz w:val="24"/>
           <w:szCs w:val="24"/>
         </w:rPr>
-        <w:t xml:space="preserve">A amostragem de 60 Hz não permite separar as duas (Seção 3.3).</w:t>
+        <w:t xml:space="preserve">A amostragem de 60 Hz não permite separar as duas (Seção 3.3); a de 42,37 Hz é a mais compatível com a marcha lenta de um motor diesel (Seção 3.4).</w:t>
       </w:r>
     </w:p>
     <w:p>
@@ -6235,29 +8837,15 @@
           <w:sz w:val="24"/>
           <w:szCs w:val="24"/>
         </w:rPr>
-        <w:t xml:space="preserve">O evento de −2,17° a +2,67° da leitura contínua foi movimento lento (manuseio), </w:t>
-      </w:r>
-      <w:r>
-        <w:rPr>
-          <w:rFonts w:ascii="Times New Roman" w:cs="Times New Roman" w:eastAsia="Times New Roman" w:hAnsi="Times New Roman"/>
-          <w:sz w:val="24"/>
-          <w:szCs w:val="24"/>
-        </w:rPr>
-        <w:t xml:space="preserve">não a vibração (Seção 2.2).</w:t>
-      </w:r>
-    </w:p>
-    <w:p>
-      <w:pPr>
-        <w:spacing w:after="120" w:line="360"/>
-        <w:jc w:val="both"/>
-      </w:pPr>
-      <w:r>
-        <w:rPr>
-          <w:rFonts w:ascii="Times New Roman" w:cs="Times New Roman" w:eastAsia="Times New Roman" w:hAnsi="Times New Roman"/>
-          <w:sz w:val="24"/>
-          <w:szCs w:val="24"/>
-        </w:rPr>
-        <w:t xml:space="preserve">Recomendações para o próximo ensaio:</w:t>
+        <w:t xml:space="preserve">Os maiores valores de inclinação (−2,17° a +2,67°) foram causados pelo embarque e desembarque de pessoas, </w:t>
+      </w:r>
+      <w:r>
+        <w:rPr>
+          <w:rFonts w:ascii="Times New Roman" w:cs="Times New Roman" w:eastAsia="Times New Roman" w:hAnsi="Times New Roman"/>
+          <w:sz w:val="24"/>
+          <w:szCs w:val="24"/>
+        </w:rPr>
+        <w:t xml:space="preserve">que balançam a carroceria na suspensão e excitam a antena — não pela vibração do motor (Seção 2.2).</w:t>
       </w:r>
     </w:p>
     <w:p>
@@ -6278,15 +8866,29 @@
           <w:sz w:val="24"/>
           <w:szCs w:val="24"/>
         </w:rPr>
-        <w:t xml:space="preserve">Repetir a captura de vibração a 200 Hz e a 500 Hz. </w:t>
-      </w:r>
-      <w:r>
-        <w:rPr>
-          <w:rFonts w:ascii="Times New Roman" w:cs="Times New Roman" w:eastAsia="Times New Roman" w:hAnsi="Times New Roman"/>
-          <w:sz w:val="24"/>
-          <w:szCs w:val="24"/>
-        </w:rPr>
-        <w:t xml:space="preserve">Nessas taxas o firmware usa filtros internos de 44 Hz e 94 Hz e a frequência de Nyquist sobe para 100 Hz e 250 Hz. Se o pico continuar em 17,63 Hz, a vibração é real nessa frequência; se passar a 42,37 Hz, a captura de 60 Hz estava rebatida.</w:t>
+        <w:t xml:space="preserve">A 7 m de altura, a leitura em graus durante um balanço superestima a inclinação real. </w:t>
+      </w:r>
+      <w:r>
+        <w:rPr>
+          <w:rFonts w:ascii="Times New Roman" w:cs="Times New Roman" w:eastAsia="Times New Roman" w:hAnsi="Times New Roman"/>
+          <w:sz w:val="24"/>
+          <w:szCs w:val="24"/>
+        </w:rPr>
+        <w:t xml:space="preserve">O deslocamento do topo depende da frequência do movimento: ±2,5° correspondem a cerca de 33 cm se estáticos, mas a cerca de 1 cm num balanço de 1 Hz (Seção 2.4).</w:t>
+      </w:r>
+    </w:p>
+    <w:p>
+      <w:pPr>
+        <w:spacing w:after="120" w:line="360"/>
+        <w:jc w:val="both"/>
+      </w:pPr>
+      <w:r>
+        <w:rPr>
+          <w:rFonts w:ascii="Times New Roman" w:cs="Times New Roman" w:eastAsia="Times New Roman" w:hAnsi="Times New Roman"/>
+          <w:sz w:val="24"/>
+          <w:szCs w:val="24"/>
+        </w:rPr>
+        <w:t xml:space="preserve">Recomendações para o próximo ensaio:</w:t>
       </w:r>
     </w:p>
     <w:p>
@@ -6307,15 +8909,15 @@
           <w:sz w:val="24"/>
           <w:szCs w:val="24"/>
         </w:rPr>
-        <w:t xml:space="preserve">Identificar a fonte da vibração na bancada </w:t>
-      </w:r>
-      <w:r>
-        <w:rPr>
-          <w:rFonts w:ascii="Times New Roman" w:cs="Times New Roman" w:eastAsia="Times New Roman" w:hAnsi="Times New Roman"/>
-          <w:sz w:val="24"/>
-          <w:szCs w:val="24"/>
-        </w:rPr>
-        <w:t xml:space="preserve">(ventiladores, bombas, motores, computador, compressor) e repetir a captura com ela desligada ou com o conjunto sobre um apoio amortecido. Uma vibração que desaparece assim confirma a origem mecânica.</w:t>
+        <w:t xml:space="preserve">Repetir a captura de vibração a 200 Hz e a 500 Hz, com o motor ligado e a rotação anotada no tacômetro. </w:t>
+      </w:r>
+      <w:r>
+        <w:rPr>
+          <w:rFonts w:ascii="Times New Roman" w:cs="Times New Roman" w:eastAsia="Times New Roman" w:hAnsi="Times New Roman"/>
+          <w:sz w:val="24"/>
+          <w:szCs w:val="24"/>
+        </w:rPr>
+        <w:t xml:space="preserve">Nessas taxas o firmware usa filtros internos de 44 Hz e 94 Hz e a frequência de Nyquist sobe para 100 Hz e 250 Hz. Se o pico continuar em 17,63 Hz, a vibração é real nessa frequência; se passar a 42,37 Hz, a captura de 60 Hz estava rebatida. Comparar a frequência com a rotação identifica a ordem do motor.</w:t>
       </w:r>
     </w:p>
     <w:p>
@@ -6336,15 +8938,15 @@
           <w:sz w:val="24"/>
           <w:szCs w:val="24"/>
         </w:rPr>
-        <w:t xml:space="preserve">Para o ensaio no mastro, </w:t>
-      </w:r>
-      <w:r>
-        <w:rPr>
-          <w:rFonts w:ascii="Times New Roman" w:cs="Times New Roman" w:eastAsia="Times New Roman" w:hAnsi="Times New Roman"/>
-          <w:sz w:val="24"/>
-          <w:szCs w:val="24"/>
-        </w:rPr>
-        <w:t xml:space="preserve">concentrar a análise na faixa de 0 a 10 Hz, onde está a flexão angular por vento, e tratar picos acima disso como prováveis acelerações de máquinas ou da estrutura.</w:t>
+        <w:t xml:space="preserve">Fazer uma captura com o motor desligado, </w:t>
+      </w:r>
+      <w:r>
+        <w:rPr>
+          <w:rFonts w:ascii="Times New Roman" w:cs="Times New Roman" w:eastAsia="Times New Roman" w:hAnsi="Times New Roman"/>
+          <w:sz w:val="24"/>
+          <w:szCs w:val="24"/>
+        </w:rPr>
+        <w:t xml:space="preserve">na mesma posição da antena: o desaparecimento do pico confirma a origem no motor, e a captura dá o piso de ruído da instalação. Se possível, repetir também com outra rotação, para verificar se o pico se desloca proporcionalmente.</w:t>
       </w:r>
     </w:p>
     <w:p>
@@ -6365,15 +8967,73 @@
           <w:sz w:val="24"/>
           <w:szCs w:val="24"/>
         </w:rPr>
-        <w:t xml:space="preserve">Registrar nos relatórios a versão do firmware e a montagem do sensor </w:t>
-      </w:r>
-      <w:r>
-        <w:rPr>
-          <w:rFonts w:ascii="Times New Roman" w:cs="Times New Roman" w:eastAsia="Times New Roman" w:hAnsi="Times New Roman"/>
-          <w:sz w:val="24"/>
-          <w:szCs w:val="24"/>
-        </w:rPr>
-        <w:t xml:space="preserve">(ângulo do eixo X fora da horizontal, indicado pela ferramenta python-app/tools/diagnostico_pan.py desde o firmware 1.6.17), para que cada conjunto de dados seja interpretável sozinho.</w:t>
+        <w:t xml:space="preserve">Não permitir embarque, desembarque ou movimentação sobre a viatura durante medições de referência, </w:t>
+      </w:r>
+      <w:r>
+        <w:rPr>
+          <w:rFonts w:ascii="Times New Roman" w:cs="Times New Roman" w:eastAsia="Times New Roman" w:hAnsi="Times New Roman"/>
+          <w:sz w:val="24"/>
+          <w:szCs w:val="24"/>
+        </w:rPr>
+        <w:t xml:space="preserve">e, quando for inevitável, aguardar ao menos 30 s após o último movimento (o balanço levou cerca de 20 s para se amortecer, Seção 2.3) antes de ler a inclinação.</w:t>
+      </w:r>
+    </w:p>
+    <w:p>
+      <w:pPr>
+        <w:pStyle w:val="ListParagraph"/>
+        <w:numPr>
+          <w:ilvl w:val="0"/>
+          <w:numId w:val="2"/>
+        </w:numPr>
+        <w:spacing w:after="60" w:line="360"/>
+        <w:jc w:val="both"/>
+      </w:pPr>
+      <w:r>
+        <w:rPr>
+          <w:rFonts w:ascii="Times New Roman" w:cs="Times New Roman" w:eastAsia="Times New Roman" w:hAnsi="Times New Roman"/>
+          <w:b/>
+          <w:bCs/>
+          <w:sz w:val="24"/>
+          <w:szCs w:val="24"/>
+        </w:rPr>
+        <w:t xml:space="preserve">Para o monitoramento da antena, </w:t>
+      </w:r>
+      <w:r>
+        <w:rPr>
+          <w:rFonts w:ascii="Times New Roman" w:cs="Times New Roman" w:eastAsia="Times New Roman" w:hAnsi="Times New Roman"/>
+          <w:sz w:val="24"/>
+          <w:szCs w:val="24"/>
+        </w:rPr>
+        <w:t xml:space="preserve">concentrar a análise na faixa de 0 a 10 Hz, onde estão o balanço da carroceria e a flexão da antena, e tratar picos acima disso como vibração do motor ou de equipamentos; para a inclinação real, usar médias de alguns segundos com o conjunto em repouso, não os extremos.</w:t>
+      </w:r>
+    </w:p>
+    <w:p>
+      <w:pPr>
+        <w:pStyle w:val="ListParagraph"/>
+        <w:numPr>
+          <w:ilvl w:val="0"/>
+          <w:numId w:val="2"/>
+        </w:numPr>
+        <w:spacing w:after="60" w:line="360"/>
+        <w:jc w:val="both"/>
+      </w:pPr>
+      <w:r>
+        <w:rPr>
+          <w:rFonts w:ascii="Times New Roman" w:cs="Times New Roman" w:eastAsia="Times New Roman" w:hAnsi="Times New Roman"/>
+          <w:b/>
+          <w:bCs/>
+          <w:sz w:val="24"/>
+          <w:szCs w:val="24"/>
+        </w:rPr>
+        <w:t xml:space="preserve">Registrar as condições do ensaio junto com os relatórios </w:t>
+      </w:r>
+      <w:r>
+        <w:rPr>
+          <w:rFonts w:ascii="Times New Roman" w:cs="Times New Roman" w:eastAsia="Times New Roman" w:hAnsi="Times New Roman"/>
+          <w:sz w:val="24"/>
+          <w:szCs w:val="24"/>
+        </w:rPr>
+        <w:t xml:space="preserve">(motor ligado ou desligado e rotação, altura da antena, presença de pessoas, vento, versão do firmware e montagem do sensor — ângulo do eixo X fora da horizontal, indicado pela ferramenta python-app/tools/diagnostico_pan.py desde o firmware 1.6.17), para que cada conjunto de dados seja interpretável sozinho. Vale avaliar um campo de observações no próprio relatório exportado pelo app.</w:t>
       </w:r>
     </w:p>
     <w:p>

</xml_diff>

<commit_message>
Docs: relatório de análise dos dados reais, revisão 02
Corrige a descrição da instalação: a antena estava fixada no topo de um
mastro elevado a 7 m de altura sobre a viatura. O balanço e a flexão
passam a ser atribuídos ao mastro, e o deslocamento da Seção 2.4 ao
topo do mastro.

Co-Authored-By: Claude Opus 5.5 <noreply@anthropic.com>
Claude-Session: https://claude.ai/code/session_01VvvtJDPvh4mDoSVpkHza1d
</commit_message>
<xml_diff>
--- a/docs/relatorio-analise-dados-reais-20261026.docx
+++ b/docs/relatorio-analise-dados-reais-20261026.docx
@@ -167,7 +167,7 @@
           <w:sz w:val="24"/>
           <w:szCs w:val="24"/>
         </w:rPr>
-        <w:t xml:space="preserve">ANÁLISE TÉCNICA DOS DADOS REAIS DO INCLINÔMETRO E AZIMUTÍMETRO ESP32: LEITURA CONTÍNUA E CAPTURA DE VIBRAÇÃO NA ANTENA DA VIATURA, A 7 M DE ALTURA (26/10/2026)</w:t>
+        <w:t xml:space="preserve">ANÁLISE TÉCNICA DOS DADOS REAIS DO INCLINÔMETRO E AZIMUTÍMETRO ESP32: LEITURA CONTÍNUA E CAPTURA DE VIBRAÇÃO NA ANTENA DE MASTRO ELEVADO A 7 M EM VIATURA (26/10/2026)</w:t>
       </w:r>
     </w:p>
     <w:p>
@@ -474,7 +474,7 @@
           <w:sz w:val="24"/>
           <w:szCs w:val="24"/>
         </w:rPr>
-        <w:t xml:space="preserve">ANÁLISE TÉCNICA DOS DADOS REAIS DO INCLINÔMETRO E AZIMUTÍMETRO ESP32: LEITURA CONTÍNUA E CAPTURA DE VIBRAÇÃO NA ANTENA DA VIATURA, A 7 M DE ALTURA (26/10/2026)</w:t>
+        <w:t xml:space="preserve">ANÁLISE TÉCNICA DOS DADOS REAIS DO INCLINÔMETRO E AZIMUTÍMETRO ESP32: LEITURA CONTÍNUA E CAPTURA DE VIBRAÇÃO NA ANTENA DE MASTRO ELEVADO A 7 M EM VIATURA (26/10/2026)</w:t>
       </w:r>
     </w:p>
     <w:p>
@@ -528,7 +528,7 @@
           <w:sz w:val="20"/>
           <w:szCs w:val="20"/>
         </w:rPr>
-        <w:t xml:space="preserve">Relatório técnico de análise dos dados gerados pelo inclinômetro/azimutímetro eletrônico baseado em ESP32 em ensaio real via Bluetooth BLE, com o sensor instalado na antena de uma viatura, elaborado para a Avibras Aeroco, como complemento ao relatório técnico do projeto (docs/relatorio-tecnico-inclinometro.docx).</w:t>
+        <w:t xml:space="preserve">Relatório técnico de análise dos dados gerados pelo inclinômetro/azimutímetro eletrônico baseado em ESP32 em ensaio real via Bluetooth BLE, com o sensor instalado na antena fixada no topo de um mastro elevado a 7 m sobre uma viatura, elaborado para a Avibras Aeroco, como complemento ao relatório técnico do projeto (docs/relatorio-tecnico-inclinometro.docx).</w:t>
       </w:r>
     </w:p>
     <w:p>
@@ -1105,7 +1105,148 @@
                 <w:sz w:val="20"/>
                 <w:szCs w:val="20"/>
               </w:rPr>
-              <w:t xml:space="preserve">Inclusão das condições do ensaio: viatura com motor ligado, sensor na antena a 7 m de altura e embarque/desembarque de pessoas no período dos maiores valores de inclinação. Revisão das interpretações das Seções 2 a 5, nova Seção 1.2 (condições do ensaio), nova Seção 2.4 (leitura x deslocamento no topo da antena) e nova Seção 3.4 (origem provável da vibração: motor).</w:t>
+              <w:t xml:space="preserve">Inclusão das condições do ensaio: viatura com motor ligado, sensor na antena a 7 m de altura e embarque/desembarque de pessoas no período dos maiores valores de inclinação. Revisão das interpretações das Seções 2 a 5, nova Seção 1.2 (condições do ensaio), nova Seção 2.4 (leitura x deslocamento no topo do mastro) e nova Seção 3.4 (origem provável da vibração: motor).</w:t>
+            </w:r>
+          </w:p>
+        </w:tc>
+        <w:tc>
+          <w:tcPr>
+            <w:tcW w:type="dxa" w:w="1701"/>
+            <w:tcBorders>
+              <w:top w:val="single" w:color="000000" w:sz="4"/>
+              <w:left w:val="single" w:color="000000" w:sz="4"/>
+              <w:bottom w:val="single" w:color="000000" w:sz="4"/>
+              <w:right w:val="single" w:color="000000" w:sz="4"/>
+            </w:tcBorders>
+            <w:tcMar>
+              <w:top w:type="dxa" w:w="60"/>
+              <w:left w:type="dxa" w:w="100"/>
+              <w:bottom w:type="dxa" w:w="60"/>
+              <w:right w:type="dxa" w:w="100"/>
+            </w:tcMar>
+            <w:vAlign w:val="center"/>
+          </w:tcPr>
+          <w:p>
+            <w:pPr>
+              <w:spacing w:line="240"/>
+              <w:jc w:val="center"/>
+            </w:pPr>
+            <w:r>
+              <w:rPr>
+                <w:rFonts w:ascii="Times New Roman" w:cs="Times New Roman" w:eastAsia="Times New Roman" w:hAnsi="Times New Roman"/>
+                <w:b w:val="false"/>
+                <w:bCs w:val="false"/>
+                <w:sz w:val="20"/>
+                <w:szCs w:val="20"/>
+              </w:rPr>
+              <w:t xml:space="preserve">[NOME DO AUTOR]</w:t>
+            </w:r>
+          </w:p>
+        </w:tc>
+      </w:tr>
+      <w:tr>
+        <w:trPr>
+          <w:tblHeader w:val="false"/>
+        </w:trPr>
+        <w:tc>
+          <w:tcPr>
+            <w:tcW w:type="dxa" w:w="1134"/>
+            <w:tcBorders>
+              <w:top w:val="single" w:color="000000" w:sz="4"/>
+              <w:left w:val="single" w:color="000000" w:sz="4"/>
+              <w:bottom w:val="single" w:color="000000" w:sz="4"/>
+              <w:right w:val="single" w:color="000000" w:sz="4"/>
+            </w:tcBorders>
+            <w:tcMar>
+              <w:top w:type="dxa" w:w="60"/>
+              <w:left w:type="dxa" w:w="100"/>
+              <w:bottom w:type="dxa" w:w="60"/>
+              <w:right w:type="dxa" w:w="100"/>
+            </w:tcMar>
+            <w:vAlign w:val="center"/>
+          </w:tcPr>
+          <w:p>
+            <w:pPr>
+              <w:spacing w:line="240"/>
+              <w:jc w:val="left"/>
+            </w:pPr>
+            <w:r>
+              <w:rPr>
+                <w:rFonts w:ascii="Times New Roman" w:cs="Times New Roman" w:eastAsia="Times New Roman" w:hAnsi="Times New Roman"/>
+                <w:b w:val="false"/>
+                <w:bCs w:val="false"/>
+                <w:sz w:val="20"/>
+                <w:szCs w:val="20"/>
+              </w:rPr>
+              <w:t xml:space="preserve">02</w:t>
+            </w:r>
+          </w:p>
+        </w:tc>
+        <w:tc>
+          <w:tcPr>
+            <w:tcW w:type="dxa" w:w="1701"/>
+            <w:tcBorders>
+              <w:top w:val="single" w:color="000000" w:sz="4"/>
+              <w:left w:val="single" w:color="000000" w:sz="4"/>
+              <w:bottom w:val="single" w:color="000000" w:sz="4"/>
+              <w:right w:val="single" w:color="000000" w:sz="4"/>
+            </w:tcBorders>
+            <w:tcMar>
+              <w:top w:type="dxa" w:w="60"/>
+              <w:left w:type="dxa" w:w="100"/>
+              <w:bottom w:type="dxa" w:w="60"/>
+              <w:right w:type="dxa" w:w="100"/>
+            </w:tcMar>
+            <w:vAlign w:val="center"/>
+          </w:tcPr>
+          <w:p>
+            <w:pPr>
+              <w:spacing w:line="240"/>
+              <w:jc w:val="center"/>
+            </w:pPr>
+            <w:r>
+              <w:rPr>
+                <w:rFonts w:ascii="Times New Roman" w:cs="Times New Roman" w:eastAsia="Times New Roman" w:hAnsi="Times New Roman"/>
+                <w:b w:val="false"/>
+                <w:bCs w:val="false"/>
+                <w:sz w:val="20"/>
+                <w:szCs w:val="20"/>
+              </w:rPr>
+              <w:t xml:space="preserve">28/10/2026</w:t>
+            </w:r>
+          </w:p>
+        </w:tc>
+        <w:tc>
+          <w:tcPr>
+            <w:tcW w:type="dxa" w:w="4536"/>
+            <w:tcBorders>
+              <w:top w:val="single" w:color="000000" w:sz="4"/>
+              <w:left w:val="single" w:color="000000" w:sz="4"/>
+              <w:bottom w:val="single" w:color="000000" w:sz="4"/>
+              <w:right w:val="single" w:color="000000" w:sz="4"/>
+            </w:tcBorders>
+            <w:tcMar>
+              <w:top w:type="dxa" w:w="60"/>
+              <w:left w:type="dxa" w:w="100"/>
+              <w:bottom w:type="dxa" w:w="60"/>
+              <w:right w:type="dxa" w:w="100"/>
+            </w:tcMar>
+            <w:vAlign w:val="center"/>
+          </w:tcPr>
+          <w:p>
+            <w:pPr>
+              <w:spacing w:line="240"/>
+              <w:jc w:val="center"/>
+            </w:pPr>
+            <w:r>
+              <w:rPr>
+                <w:rFonts w:ascii="Times New Roman" w:cs="Times New Roman" w:eastAsia="Times New Roman" w:hAnsi="Times New Roman"/>
+                <w:b w:val="false"/>
+                <w:bCs w:val="false"/>
+                <w:sz w:val="20"/>
+                <w:szCs w:val="20"/>
+              </w:rPr>
+              <w:t xml:space="preserve">Correção da descrição da instalação: a antena estava fixada no topo de um mastro elevado a 7 m de altura sobre a viatura. O balanço e a flexão passam a ser atribuídos ao mastro, e o deslocamento da Seção 2.4 ao topo do mastro.</w:t>
             </w:r>
           </w:p>
         </w:tc>
@@ -1173,7 +1314,7 @@
           <w:sz w:val="24"/>
           <w:szCs w:val="24"/>
         </w:rPr>
-        <w:t xml:space="preserve">Este relatório interpreta tecnicamente os dois relatórios gerados pelo software desktop em 26/10/2026, com o inclinômetro conectado via Bluetooth BLE e instalado na antena de uma viatura, a 7 m de altura, com o motor ligado: uma sessão de leitura contínua de cerca de 147 s (734 leituras) e uma captura do Modo Vibração de 8 s a 60 Hz (480 amostras). Na leitura contínua, a inclinação ficou dentro de ±0,5° por cerca de 108 s; entre 108 s e 116 s, período em que pessoas subiam e desciam da viatura, registrou os maiores valores (−2,17° a +2,67°, com azimute até +0,41°) e depois voltou ao repouso com uma oscilação amortecida da suspensão e da antena. Na captura de vibração, a inclinação apresentou uma oscilação dominante de 17,63 Hz com amplitude de 2,01° e relação sinal-ruído de 46 dB, enquanto o azimute permaneceu praticamente imóvel (0,005° de desvio padrão). A análise mostra que essa oscilação é a vibração do motor transmitida ao topo da antena — um movimento linear de dezenas de micrômetros, lido pelo acelerômetro como inclinação —, e não uma rotação real; e que, por ter sido amostrada a 60 Hz, ela pode ser tanto um sinal real de 17,63 Hz quanto o rebatimento (aliasing) de um sinal de 42,37 Hz, frequência compatível com a ordem de combustão de um motor diesel em marcha lenta. Mostra também que, a 7 m de altura, a mesma leitura em graus corresponde a deslocamentos muito diferentes do topo da antena conforme a frequência do movimento. Recomenda-se repetir a captura a 200 Hz e 500 Hz, com e sem o motor ligado e registrando a rotação do motor.</w:t>
+        <w:t xml:space="preserve">Este relatório interpreta tecnicamente os dois relatórios gerados pelo software desktop em 26/10/2026, com o inclinômetro conectado via Bluetooth BLE e instalado na antena fixada no topo de um mastro elevado a 7 m de altura sobre uma viatura, com o motor ligado: uma sessão de leitura contínua de cerca de 147 s (734 leituras) e uma captura do Modo Vibração de 8 s a 60 Hz (480 amostras). Na leitura contínua, a inclinação ficou dentro de ±0,5° por cerca de 108 s; entre 108 s e 116 s, período em que pessoas subiam e desciam da viatura, registrou os maiores valores (−2,17° a +2,67°, com azimute até +0,41°) e depois voltou ao repouso com uma oscilação amortecida da suspensão e do mastro. Na captura de vibração, a inclinação apresentou uma oscilação dominante de 17,63 Hz com amplitude de 2,01° e relação sinal-ruído de 46 dB, enquanto o azimute permaneceu praticamente imóvel (0,005° de desvio padrão). A análise mostra que essa oscilação é a vibração do motor transmitida ao topo do mastro — um movimento linear de dezenas de micrômetros, lido pelo acelerômetro como inclinação —, e não uma rotação real; e que, por ter sido amostrada a 60 Hz, ela pode ser tanto um sinal real de 17,63 Hz quanto o rebatimento (aliasing) de um sinal de 42,37 Hz, frequência compatível com a ordem de combustão de um motor diesel em marcha lenta. Mostra também que, a 7 m de altura, a mesma leitura em graus corresponde a deslocamentos muito diferentes do topo do mastro conforme a frequência do movimento. Recomenda-se repetir a captura a 200 Hz e 500 Hz, com e sem o motor ligado e registrando a rotação do motor.</w:t>
       </w:r>
     </w:p>
     <w:p>
@@ -1197,7 +1338,7 @@
           <w:sz w:val="24"/>
           <w:szCs w:val="24"/>
         </w:rPr>
-        <w:t xml:space="preserve">Inclinômetro. Acelerômetro. Giroscópio. Vibração. FFT. Aliasing. Viatura. Antena. ESP32.</w:t>
+        <w:t xml:space="preserve">Inclinômetro. Acelerômetro. Giroscópio. Vibração. FFT. Aliasing. Viatura. Mastro. Antena. ESP32.</w:t>
       </w:r>
     </w:p>
     <w:p>
@@ -1437,7 +1578,7 @@
           <w:sz w:val="24"/>
           <w:szCs w:val="24"/>
         </w:rPr>
-        <w:t xml:space="preserve">2.4 Leitura em graus e deslocamento no topo da antena</w:t>
+        <w:t xml:space="preserve">2.4 Leitura em graus e deslocamento no topo do mastro</w:t>
       </w:r>
       <w:r>
         <w:rPr>
@@ -1765,7 +1906,7 @@
           <w:sz w:val="24"/>
           <w:szCs w:val="24"/>
         </w:rPr>
-        <w:t xml:space="preserve">Os dois relatórios foram gerados com o conjunto conectado via Bluetooth BLE (modo "Real"), com o sensor instalado na antena de uma viatura (Seção 1.2). A versão do firmware em uso não consta dos relatórios; pela data, trata-se de uma versão 1.6.x (a 1.6.17 foi publicada em 20/10/2026). As conclusões deste documento não dependem dessa versão, exceto onde indicado.</w:t>
+        <w:t xml:space="preserve">Os dois relatórios foram gerados com o conjunto conectado via Bluetooth BLE (modo "Real"), com o sensor instalado na antena fixada no topo de um mastro elevado a 7 m sobre uma viatura (Seção 1.2). A versão do firmware em uso não consta dos relatórios; pela data, trata-se de uma versão 1.6.x (a 1.6.17 foi publicada em 20/10/2026). As conclusões deste documento não dependem dessa versão, exceto onde indicado.</w:t>
       </w:r>
     </w:p>
     <w:p>
@@ -2499,7 +2640,7 @@
                 <w:sz w:val="20"/>
                 <w:szCs w:val="20"/>
               </w:rPr>
-              <w:t xml:space="preserve">O motor é uma fonte contínua de vibração periódica, transmitida pelo chassi à antena; explica a oscilação de 17,63 Hz (Seção 3) e boa parte das pequenas excursões em repouso (Seção 2.1).</w:t>
+              <w:t xml:space="preserve">O motor é uma fonte contínua de vibração periódica, transmitida pelo chassi ao mastro e à antena; explica a oscilação de 17,63 Hz (Seção 3) e boa parte das pequenas excursões em repouso (Seção 2.1).</w:t>
             </w:r>
           </w:p>
         </w:tc>
@@ -2538,7 +2679,7 @@
                 <w:sz w:val="20"/>
                 <w:szCs w:val="20"/>
               </w:rPr>
-              <w:t xml:space="preserve">Sensor na antena, a 7 m de altura</w:t>
+              <w:t xml:space="preserve">Sensor na antena fixada no topo de um mastro elevado a 7 m</w:t>
             </w:r>
           </w:p>
         </w:tc>
@@ -2572,7 +2713,7 @@
                 <w:sz w:val="20"/>
                 <w:szCs w:val="20"/>
               </w:rPr>
-              <w:t xml:space="preserve">A inclinação medida no topo soma a inclinação da carroceria e a flexão da antena. A altura amplia o deslocamento do topo para um mesmo ângulo e faz o acelerômetro ler as acelerações do balanço como inclinação adicional (Seção 2.4).</w:t>
+              <w:t xml:space="preserve">A inclinação medida no topo soma a inclinação da carroceria e a flexão do mastro. A altura amplia o deslocamento do topo para um mesmo ângulo e faz o acelerômetro ler as acelerações do balanço como inclinação adicional (Seção 2.4).</w:t>
             </w:r>
           </w:p>
         </w:tc>
@@ -2645,7 +2786,7 @@
                 <w:sz w:val="20"/>
                 <w:szCs w:val="20"/>
               </w:rPr>
-              <w:t xml:space="preserve">A mudança de carga balança a carroceria sobre a suspensão e excita a antena; é a origem dos extremos de −2,17° e +2,67° da leitura contínua (Seção 2.2).</w:t>
+              <w:t xml:space="preserve">A mudança de carga balança a carroceria sobre a suspensão e excita o mastro; é a origem dos extremos de −2,17° e +2,67° da leitura contínua (Seção 2.2).</w:t>
             </w:r>
           </w:p>
         </w:tc>
@@ -2931,7 +3072,7 @@
                 <w:sz w:val="20"/>
                 <w:szCs w:val="20"/>
               </w:rPr>
-              <w:t xml:space="preserve">Antena da viatura a 7 m; motor ligado</w:t>
+              <w:t xml:space="preserve">Antena no topo de mastro elevado a 7 m; motor ligado</w:t>
             </w:r>
           </w:p>
         </w:tc>
@@ -3798,7 +3939,7 @@
                 <w:sz w:val="20"/>
                 <w:szCs w:val="20"/>
               </w:rPr>
-              <w:t xml:space="preserve">Vibração do motor e pequenos balanços da antena</w:t>
+              <w:t xml:space="preserve">Vibração do motor e pequenos balanços do mastro</w:t>
             </w:r>
           </w:p>
         </w:tc>
@@ -3939,7 +4080,7 @@
                 <w:sz w:val="20"/>
                 <w:szCs w:val="20"/>
               </w:rPr>
-              <w:t xml:space="preserve">Pessoas subindo e descendo: carroceria balança na suspensão e excita a antena</w:t>
+              <w:t xml:space="preserve">Pessoas subindo e descendo: carroceria balança na suspensão e excita o mastro</w:t>
             </w:r>
           </w:p>
         </w:tc>
@@ -4178,15 +4319,15 @@
           <w:sz w:val="24"/>
           <w:szCs w:val="24"/>
         </w:rPr>
-        <w:t xml:space="preserve">Balanço lento da antena e da carroceria. </w:t>
-      </w:r>
-      <w:r>
-        <w:rPr>
-          <w:rFonts w:ascii="Times New Roman" w:cs="Times New Roman" w:eastAsia="Times New Roman" w:hAnsi="Times New Roman"/>
-          <w:sz w:val="24"/>
-          <w:szCs w:val="24"/>
-        </w:rPr>
-        <w:t xml:space="preserve">A antena de 7 m sobre a suspensão da viatura nunca está totalmente imóvel com o motor ligado; vento e pequenas acomodações somam alguns décimos de grau de baixa frequência.</w:t>
+        <w:t xml:space="preserve">Balanço lento do mastro e da carroceria. </w:t>
+      </w:r>
+      <w:r>
+        <w:rPr>
+          <w:rFonts w:ascii="Times New Roman" w:cs="Times New Roman" w:eastAsia="Times New Roman" w:hAnsi="Times New Roman"/>
+          <w:sz w:val="24"/>
+          <w:szCs w:val="24"/>
+        </w:rPr>
+        <w:t xml:space="preserve">O mastro elevado a 7 m sobre a suspensão da viatura nunca está totalmente imóvel com o motor ligado; vento e pequenas acomodações somam alguns décimos de grau de baixa frequência.</w:t>
       </w:r>
     </w:p>
     <w:p>
@@ -4232,7 +4373,7 @@
           <w:sz w:val="24"/>
           <w:szCs w:val="24"/>
         </w:rPr>
-        <w:t xml:space="preserve">Em cerca de 6 s (16:20:47 a 16:20:53), período em que pessoas subiam e desciam da viatura, os extremos de inclinação passam a −2,17° e +2,67° e o azimute sobe até +0,41°. São os maiores valores da sessão, e a causa é mecânica: o peso de cada pessoa que sobe ou desce de um lado da viatura inclina a carroceria sobre a suspensão e a solta em seguida, o que a faz balançar; a antena, presa à carroceria, acompanha esse balanço e flexiona. A inclinação lida no topo é a soma das duas parcelas.</w:t>
+        <w:t xml:space="preserve">Em cerca de 6 s (16:20:47 a 16:20:53), período em que pessoas subiam e desciam da viatura, os extremos de inclinação passam a −2,17° e +2,67° e o azimute sobe até +0,41°. São os maiores valores da sessão, e a causa é mecânica: o peso de cada pessoa que sobe ou desce de um lado da viatura inclina a carroceria sobre a suspensão e a solta em seguida, o que a faz balançar; o mastro, fixado na viatura, acompanha esse balanço e flexiona, levando consigo a antena e o sensor no topo. A inclinação lida no topo é a soma das duas parcelas.</w:t>
       </w:r>
     </w:p>
     <w:p>
@@ -4262,7 +4403,7 @@
           <w:sz w:val="24"/>
           <w:szCs w:val="24"/>
         </w:rPr>
-        <w:t xml:space="preserve">O azimute de +0,41° no mesmo intervalo é coerente com uma pequena torção real da carroceria e da antena em torno da vertical causada pela carga assimétrica nos degraus. Depois do evento ele não registrou novos extremos, ou seja, voltou e permaneceu estável.</w:t>
+        <w:t xml:space="preserve">O azimute de +0,41° no mesmo intervalo é coerente com uma pequena torção real da carroceria e do mastro em torno da vertical causada pela carga assimétrica nos degraus. Depois do evento ele não registrou novos extremos, ou seja, voltou e permaneceu estável.</w:t>
       </w:r>
     </w:p>
     <w:p>
@@ -4293,7 +4434,7 @@
           <w:sz w:val="24"/>
           <w:szCs w:val="24"/>
         </w:rPr>
-        <w:t xml:space="preserve">Após o embarque e o desembarque, a curva de inclinação mostra uma oscilação de cerca de ±0,5°, com período da ordem de 1 a 2 s (0,5 a 1 Hz), que se amortece até ≈135 s. É a resposta livre do conjunto suspensão-carroceria-antena depois de excitado: a faixa de 0,5 a 1,5 Hz é a típica do balanço de carroceria de veículos sobre suspensão. Não houve novos extremos, porque a oscilação ficou dentro da faixa já registrada.</w:t>
+        <w:t xml:space="preserve">Após o embarque e o desembarque, a curva de inclinação mostra uma oscilação de cerca de ±0,5°, com período da ordem de 1 a 2 s (0,5 a 1 Hz), que se amortece até ≈135 s. É a resposta livre do conjunto suspensão-carroceria-mastro depois de excitado: a faixa de 0,5 a 1,5 Hz é a típica do balanço de carroceria de veículos sobre suspensão. Não houve novos extremos, porque a oscilação ficou dentro da faixa já registrada.</w:t>
       </w:r>
     </w:p>
     <w:p>
@@ -4309,7 +4450,7 @@
           <w:sz w:val="24"/>
           <w:szCs w:val="24"/>
         </w:rPr>
-        <w:t xml:space="preserve">2.4 Leitura em graus e deslocamento no topo da antena</w:t>
+        <w:t xml:space="preserve">2.4 Leitura em graus e deslocamento no topo do mastro</w:t>
       </w:r>
     </w:p>
     <w:p>
@@ -4324,7 +4465,7 @@
           <w:sz w:val="24"/>
           <w:szCs w:val="24"/>
         </w:rPr>
-        <w:t xml:space="preserve">Com o sensor a L = 7 m de altura, um mesmo valor em graus pode corresponder a deslocamentos muito diferentes do topo da antena, conforme a frequência do movimento. Isso acontece porque o acelerômetro mede inclinação somada à aceleração lateral: num balanço de frequência f e deslocamento x no topo, a leitura é aproximadamente θ_lido ≈ x/L + x·(2πf)²/g. A primeira parcela é a inclinação real; a segunda é a aceleração do balanço lida como inclinação, e cresce com o quadrado da frequência. O deslocamento correspondente a uma leitura é, portanto, x ≈ θ_lido / (1/L + (2πf)²/g) (Tabela 5).</w:t>
+        <w:t xml:space="preserve">Com o sensor a L = 7 m de altura, um mesmo valor em graus pode corresponder a deslocamentos muito diferentes do topo do mastro, conforme a frequência do movimento. Isso acontece porque o acelerômetro mede inclinação somada à aceleração lateral: num balanço de frequência f e deslocamento x no topo, a leitura é aproximadamente θ_lido ≈ x/L + x·(2πf)²/g. A primeira parcela é a inclinação real; a segunda é a aceleração do balanço lida como inclinação, e cresce com o quadrado da frequência. O deslocamento correspondente a uma leitura é, portanto, x ≈ θ_lido / (1/L + (2πf)²/g) (Tabela 5).</w:t>
       </w:r>
     </w:p>
     <w:p>
@@ -4340,7 +4481,7 @@
           <w:sz w:val="20"/>
           <w:szCs w:val="20"/>
         </w:rPr>
-        <w:t xml:space="preserve">Tabela 5 — Deslocamento do topo da antena (L = 7 m) correspondente a cada leitura</w:t>
+        <w:t xml:space="preserve">Tabela 5 — Deslocamento do topo do mastro (L = 7 m) correspondente a cada leitura</w:t>
       </w:r>
     </w:p>
     <w:tbl>
@@ -4926,7 +5067,7 @@
                 <w:sz w:val="20"/>
                 <w:szCs w:val="20"/>
               </w:rPr>
-              <w:t xml:space="preserve">Balanço da carroceria/antena</w:t>
+              <w:t xml:space="preserve">Balanço da carroceria/mastro</w:t>
             </w:r>
           </w:p>
         </w:tc>
@@ -5101,7 +5242,7 @@
                 <w:sz w:val="20"/>
                 <w:szCs w:val="20"/>
               </w:rPr>
-              <w:t xml:space="preserve">Flexão rápida da antena</w:t>
+              <w:t xml:space="preserve">Flexão rápida do mastro</w:t>
             </w:r>
           </w:p>
         </w:tc>
@@ -5429,7 +5570,7 @@
           <w:sz w:val="20"/>
           <w:szCs w:val="20"/>
         </w:rPr>
-        <w:t xml:space="preserve">Fonte: elaborado pelo autor. Modelo de rotação rígida em torno da base: x ≈ θ/(1/L + (2πf)²/g), com g = 9,81 m/s². Na fase C, a leitura de ±0,5° a 0,5–1 Hz corresponde a 2 a 8 mm no topo.</w:t>
+        <w:t xml:space="preserve">Fonte: elaborado pelo autor. Modelo de rotação rígida em torno da base, com L igual à altura do sensor (o mastro parte da viatura, de modo que o braço efetivo pode ser um pouco menor): x ≈ θ/(1/L + (2πf)²/g), com g = 9,81 m/s². Na fase C, a leitura de ±0,5° a 0,5–1 Hz corresponde a 2 a 8 mm no topo.</w:t>
       </w:r>
     </w:p>
     <w:p>
@@ -5444,7 +5585,7 @@
           <w:sz w:val="24"/>
           <w:szCs w:val="24"/>
         </w:rPr>
-        <w:t xml:space="preserve">Duas consequências práticas: (a) os ±2,5° da fase B não significam necessariamente que o topo da antena se deslocou 30 cm — se foram balanço de cerca de 1 Hz, o deslocamento real foi da ordem de 1 cm, e só a parcela estática (a viatura que fica inclinada com o peso de alguém sobre ela) corresponde à inclinação lida; (b) para medir a inclinação real da antena, devem-se usar leituras com o conjunto em repouso, ou médias de alguns segundos, nunca os extremos registrados durante o balanço.</w:t>
+        <w:t xml:space="preserve">Duas consequências práticas: (a) os ±2,5° da fase B não significam necessariamente que o topo do mastro se deslocou 30 cm — se foram balanço de cerca de 1 Hz, o deslocamento real foi da ordem de 1 cm, e só a parcela estática (a viatura que fica inclinada com o peso de alguém sobre ela) corresponde à inclinação lida; (b) para medir a inclinação real do mastro, devem-se usar leituras com o conjunto em repouso, ou médias de alguns segundos, nunca os extremos registrados durante o balanço.</w:t>
       </w:r>
     </w:p>
     <w:p>
@@ -6476,7 +6617,7 @@
           <w:sz w:val="20"/>
           <w:szCs w:val="20"/>
         </w:rPr>
-        <w:t xml:space="preserve">Fonte: relatorio_vibracao_20261026_162213.pdf (início 16:22:11; 8 s configurados, 7,98 s efetivos; 60 Hz; 480 amostras; viatura com motor ligado, sensor na antena a 7 m).</w:t>
+        <w:t xml:space="preserve">Fonte: relatorio_vibracao_20261026_162213.pdf (início 16:22:11; 8 s configurados, 7,98 s efetivos; 60 Hz; 480 amostras; viatura com motor ligado, sensor na antena do mastro elevado a 7 m).</w:t>
       </w:r>
     </w:p>
     <w:p>
@@ -6826,7 +6967,7 @@
           <w:sz w:val="24"/>
           <w:szCs w:val="24"/>
         </w:rPr>
-        <w:t xml:space="preserve">A média de −0,196° indica que o centro da oscilação estava levemente deslocado do zero calibrado — por exemplo, pela inclinação estática da viatura ou da antena no momento da captura, diferente da do momento da calibração, ou pela própria assimetria da vibração (mínimo de −2,96° contra máximo de +1,92°).</w:t>
+        <w:t xml:space="preserve">A média de −0,196° indica que o centro da oscilação estava levemente deslocado do zero calibrado — por exemplo, pela inclinação estática da viatura ou do mastro no momento da captura, diferente da do momento da calibração, ou pela própria assimetria da vibração (mínimo de −2,96° contra máximo de +1,92°).</w:t>
       </w:r>
     </w:p>
     <w:p>
@@ -7358,7 +7499,7 @@
                 <w:sz w:val="20"/>
                 <w:szCs w:val="20"/>
               </w:rPr>
-              <w:t xml:space="preserve">Plausibilidade na antena</w:t>
+              <w:t xml:space="preserve">Plausibilidade no mastro</w:t>
             </w:r>
           </w:p>
         </w:tc>
@@ -7392,7 +7533,7 @@
                 <w:sz w:val="20"/>
                 <w:szCs w:val="20"/>
               </w:rPr>
-              <w:t xml:space="preserve">Nula: uma antena de 7 m não gira ±2° dezessete vezes por segundo</w:t>
+              <w:t xml:space="preserve">Nula: um mastro de 7 m não gira ±2° dezessete vezes por segundo</w:t>
             </w:r>
           </w:p>
         </w:tc>
@@ -7458,7 +7599,7 @@
           <w:sz w:val="24"/>
           <w:szCs w:val="24"/>
         </w:rPr>
-        <w:t xml:space="preserve">A conclusão é que a oscilação registrada na inclinação é a vibração do motor chegando ao topo da antena como um movimento linear de dezenas de micrômetros, e não uma inclinação de 2° da antena. A confirmação independente vem do azimute (Seção 3.5): o giroscópio, que mede rotação de fato, não viu a vibração. Para o monitoramento da antena isso é relevante: a flexão angular que se quer medir ocorre em frequências baixas, tipicamente abaixo de 5 Hz, enquanto vibrações acima de ~10 Hz são acelerações do motor ou da estrutura, que o acelerômetro também lê como "inclinação".</w:t>
+        <w:t xml:space="preserve">A conclusão é que a oscilação registrada na inclinação é a vibração do motor chegando ao topo do mastro como um movimento linear de dezenas de micrômetros, e não uma inclinação de 2° do mastro. A confirmação independente vem do azimute (Seção 3.5): o giroscópio, que mede rotação de fato, não viu a vibração. Para o monitoramento do mastro isso é relevante: a flexão angular que se quer medir ocorre em frequências baixas, tipicamente abaixo de 5 Hz, enquanto vibrações acima de ~10 Hz são acelerações do motor ou da estrutura, que o acelerômetro também lê como "inclinação".</w:t>
       </w:r>
     </w:p>
     <w:p>
@@ -8167,7 +8308,7 @@
           <w:sz w:val="24"/>
           <w:szCs w:val="24"/>
         </w:rPr>
-        <w:t xml:space="preserve">Com a viatura parada em marcha lenta (tipicamente 600 a 900 rpm em motores diesel, mais alta quando há marcha lenta acelerada para alimentar equipamentos), a hipótese mais coerente é a de 42,37 Hz: a ordem de combustão de um motor de 6 cilindros a ≈850 rpm, ou de 4 cilindros em marcha lenta acelerada a ≈1270 rpm. A leitura de 17,63 Hz como frequência real só se explicaria pela 1ª ordem a ≈1060 rpm ou por uma ressonância da própria antena excitada pelo motor. Esse argumento reforça a suspeita de rebatimento da Seção 3.3, mas não a prova: a confirmação exige uma nova captura a 200 Hz ou mais com a rotação do motor anotada no tacômetro.</w:t>
+        <w:t xml:space="preserve">Com a viatura parada em marcha lenta (tipicamente 600 a 900 rpm em motores diesel, mais alta quando há marcha lenta acelerada para alimentar equipamentos), a hipótese mais coerente é a de 42,37 Hz: a ordem de combustão de um motor de 6 cilindros a ≈850 rpm, ou de 4 cilindros em marcha lenta acelerada a ≈1270 rpm. A leitura de 17,63 Hz como frequência real só se explicaria pela 1ª ordem a ≈1060 rpm ou por uma ressonância do mastro ou da própria antena excitada pelo motor. Esse argumento reforça a suspeita de rebatimento da Seção 3.3, mas não a prova: a confirmação exige uma nova captura a 200 Hz ou mais com a rotação do motor anotada no tacômetro.</w:t>
       </w:r>
     </w:p>
     <w:p>
@@ -8725,7 +8866,7 @@
           <w:sz w:val="24"/>
           <w:szCs w:val="24"/>
         </w:rPr>
-        <w:t xml:space="preserve">Isso explica por que a leitura contínua pode parecer "calma" enquanto o motor faz a antena vibrar, e por que os seus extremos devem ser lidos como movimentos de baixa frequência somados a uma pequena parcela fixa do motor. Quem quiser saber se existe vibração deve usar o Modo Vibração.</w:t>
+        <w:t xml:space="preserve">Isso explica por que a leitura contínua pode parecer "calma" enquanto o motor faz o mastro vibrar, e por que os seus extremos devem ser lidos como movimentos de baixa frequência somados a uma pequena parcela fixa do motor. Quem quiser saber se existe vibração deve usar o Modo Vibração.</w:t>
       </w:r>
     </w:p>
     <w:p>
@@ -8758,7 +8899,7 @@
           <w:sz w:val="24"/>
           <w:szCs w:val="24"/>
         </w:rPr>
-        <w:t xml:space="preserve">Os dados mostram um sistema funcionando conforme projetado numa condição real exigente — sensor a 7 m de altura, numa viatura com o motor ligado e com pessoas embarcando: inclinação estável em repouso, extremos coerentes com os movimentos ocorridos, azimute sem deriva e captura de vibração com espectro limpo e alta relação sinal-ruído. Os pontos que pedem atenção são de interpretação e de método de ensaio, não de defeito:</w:t>
+        <w:t xml:space="preserve">Os dados mostram um sistema funcionando conforme projetado numa condição real exigente — sensor na antena do topo de um mastro de 7 m, numa viatura com o motor ligado e com pessoas embarcando: inclinação estável em repouso, extremos coerentes com os movimentos ocorridos, azimute sem deriva e captura de vibração com espectro limpo e alta relação sinal-ruído. Os pontos que pedem atenção são de interpretação e de método de ensaio, não de defeito:</w:t>
       </w:r>
     </w:p>
     <w:p>
@@ -8779,7 +8920,7 @@
           <w:sz w:val="24"/>
           <w:szCs w:val="24"/>
         </w:rPr>
-        <w:t xml:space="preserve">A oscilação de 2,01° na captura de vibração não é inclinação real da antena. </w:t>
+        <w:t xml:space="preserve">A oscilação de 2,01° na captura de vibração não é inclinação real do mastro. </w:t>
       </w:r>
       <w:r>
         <w:rPr>
@@ -8845,7 +8986,7 @@
           <w:sz w:val="24"/>
           <w:szCs w:val="24"/>
         </w:rPr>
-        <w:t xml:space="preserve">que balançam a carroceria na suspensão e excitam a antena — não pela vibração do motor (Seção 2.2).</w:t>
+        <w:t xml:space="preserve">que balançam a carroceria na suspensão e excitam o mastro — não pela vibração do motor (Seção 2.2).</w:t>
       </w:r>
     </w:p>
     <w:p>
@@ -8946,7 +9087,7 @@
           <w:sz w:val="24"/>
           <w:szCs w:val="24"/>
         </w:rPr>
-        <w:t xml:space="preserve">na mesma posição da antena: o desaparecimento do pico confirma a origem no motor, e a captura dá o piso de ruído da instalação. Se possível, repetir também com outra rotação, para verificar se o pico se desloca proporcionalmente.</w:t>
+        <w:t xml:space="preserve">com o mastro na mesma altura: o desaparecimento do pico confirma a origem no motor, e a captura dá o piso de ruído da instalação. Se possível, repetir também com outra rotação, para verificar se o pico se desloca proporcionalmente.</w:t>
       </w:r>
     </w:p>
     <w:p>
@@ -8996,15 +9137,15 @@
           <w:sz w:val="24"/>
           <w:szCs w:val="24"/>
         </w:rPr>
-        <w:t xml:space="preserve">Para o monitoramento da antena, </w:t>
-      </w:r>
-      <w:r>
-        <w:rPr>
-          <w:rFonts w:ascii="Times New Roman" w:cs="Times New Roman" w:eastAsia="Times New Roman" w:hAnsi="Times New Roman"/>
-          <w:sz w:val="24"/>
-          <w:szCs w:val="24"/>
-        </w:rPr>
-        <w:t xml:space="preserve">concentrar a análise na faixa de 0 a 10 Hz, onde estão o balanço da carroceria e a flexão da antena, e tratar picos acima disso como vibração do motor ou de equipamentos; para a inclinação real, usar médias de alguns segundos com o conjunto em repouso, não os extremos.</w:t>
+        <w:t xml:space="preserve">Para o monitoramento do mastro, </w:t>
+      </w:r>
+      <w:r>
+        <w:rPr>
+          <w:rFonts w:ascii="Times New Roman" w:cs="Times New Roman" w:eastAsia="Times New Roman" w:hAnsi="Times New Roman"/>
+          <w:sz w:val="24"/>
+          <w:szCs w:val="24"/>
+        </w:rPr>
+        <w:t xml:space="preserve">concentrar a análise na faixa de 0 a 10 Hz, onde estão o balanço da carroceria e a flexão do mastro, e tratar picos acima disso como vibração do motor ou de equipamentos; para a inclinação real, usar médias de alguns segundos com o conjunto em repouso, não os extremos.</w:t>
       </w:r>
     </w:p>
     <w:p>
@@ -9033,7 +9174,7 @@
           <w:sz w:val="24"/>
           <w:szCs w:val="24"/>
         </w:rPr>
-        <w:t xml:space="preserve">(motor ligado ou desligado e rotação, altura da antena, presença de pessoas, vento, versão do firmware e montagem do sensor — ângulo do eixo X fora da horizontal, indicado pela ferramenta python-app/tools/diagnostico_pan.py desde o firmware 1.6.17), para que cada conjunto de dados seja interpretável sozinho. Vale avaliar um campo de observações no próprio relatório exportado pelo app.</w:t>
+        <w:t xml:space="preserve">(motor ligado ou desligado e rotação, altura do mastro, presença de pessoas, vento, versão do firmware e montagem do sensor — ângulo do eixo X fora da horizontal, indicado pela ferramenta python-app/tools/diagnostico_pan.py desde o firmware 1.6.17), para que cada conjunto de dados seja interpretável sozinho. Vale avaliar um campo de observações no próprio relatório exportado pelo app.</w:t>
       </w:r>
     </w:p>
     <w:p>

</xml_diff>